<commit_message>
Add answers for exam questions 21-40
</commit_message>
<xml_diff>
--- a/answers_first_20.docx
+++ b/answers_first_20.docx
@@ -1554,6 +1554,2134 @@
     </w:p>
     <w:p>
       <w:pPr>
+        <w:jc w:val="center"/>
+      </w:pPr>
+      <w:r>
+        <w:rPr>
+          <w:rFonts w:ascii="Times New Roman" w:hAnsi="Times New Roman"/>
+          <w:b/>
+          <w:sz w:val="32"/>
+        </w:rPr>
+        <w:t>Продолжение: вопросы 21–40</w:t>
+      </w:r>
+    </w:p>
+    <w:p/>
+    <w:p>
+      <w:pPr>
+        <w:pStyle w:val="Heading1"/>
+      </w:pPr>
+      <w:r>
+        <w:rPr>
+          <w:rFonts w:ascii="Times New Roman" w:hAnsi="Times New Roman"/>
+          <w:b/>
+          <w:sz w:val="28"/>
+        </w:rPr>
+        <w:t>21. Считывающие устройства RFID</w:t>
+      </w:r>
+    </w:p>
+    <w:p>
+      <w:pPr>
+        <w:spacing w:after="120" w:line="276" w:lineRule="auto"/>
+        <w:ind w:firstLine="425"/>
+      </w:pPr>
+      <w:r>
+        <w:rPr>
+          <w:rFonts w:ascii="Times New Roman" w:hAnsi="Times New Roman"/>
+          <w:sz w:val="24"/>
+        </w:rPr>
+        <w:t>Считывающее устройство RFID, или ридер, предназначено для извлечения данных, хранящихся на RFID-метке, и передачи результата в информационную систему. Типичный ридер имеет одну или несколько антенн: они излучают радиоволны, активируют метку или принимают ее ответный сигнал. После считывания ридер передает в компьютерную систему идентификатор метки, идентификатор самого считывателя и время чтения.</w:t>
+      </w:r>
+    </w:p>
+    <w:p>
+      <w:pPr>
+        <w:spacing w:after="120" w:line="276" w:lineRule="auto"/>
+        <w:ind w:firstLine="425"/>
+      </w:pPr>
+      <w:r>
+        <w:rPr>
+          <w:rFonts w:ascii="Times New Roman" w:hAnsi="Times New Roman"/>
+          <w:sz w:val="24"/>
+        </w:rPr>
+        <w:t>RFID-считыватель должен работать на той же частоте, что и используемые метки. Если метки рассчитаны на HF-диапазон, ридер UHF-диапазона их не прочитает. Поэтому при проектировании RFID-системы заранее выбирают частотный диапазон, тип меток, требуемую дальность, скорость чтения и условия эксплуатации.</w:t>
+      </w:r>
+    </w:p>
+    <w:p>
+      <w:pPr>
+        <w:spacing w:after="120" w:line="276" w:lineRule="auto"/>
+        <w:ind w:firstLine="425"/>
+      </w:pPr>
+      <w:r>
+        <w:rPr>
+          <w:rFonts w:ascii="Times New Roman" w:hAnsi="Times New Roman"/>
+          <w:sz w:val="24"/>
+        </w:rPr>
+        <w:t>Основные функции ридера: энергоснабжение пассивных меток за счет электромагнитного поля; чтение данных из памяти метки; запись данных на метки типа RW; обмен с внешней системой через USB, Ethernet, Wi‑Fi, Bluetooth, последовательный порт или другие интерфейсы; управление антиколлизионными процедурами, если в зоне действия одновременно находится много меток.</w:t>
+      </w:r>
+    </w:p>
+    <w:p>
+      <w:pPr>
+        <w:spacing w:after="120" w:line="276" w:lineRule="auto"/>
+        <w:ind w:firstLine="425"/>
+      </w:pPr>
+      <w:r>
+        <w:rPr>
+          <w:rFonts w:ascii="Times New Roman" w:hAnsi="Times New Roman"/>
+          <w:sz w:val="24"/>
+        </w:rPr>
+        <w:t>Ридеры бывают стационарными и мобильными. Стационарные устанавливают на складах, производственных линиях, проходных, в RFID-воротах. Мобильные выполняются в виде ручных терминалов и удобны для инвентаризации, поиска объектов и работы в торговом зале. Антенна может быть встроена в корпус ридера или вынесена отдельно; иногда используют несколько антенн, чтобы увеличить зону покрытия и надежность считывания. В IoT ридер часто играет роль промежуточного узла: он превращает физическое присутствие объекта с меткой в цифровое событие, доступное учетной или управляющей системе.</w:t>
+      </w:r>
+    </w:p>
+    <w:p>
+      <w:r>
+        <w:br w:type="page"/>
+      </w:r>
+    </w:p>
+    <w:p>
+      <w:pPr>
+        <w:pStyle w:val="Heading1"/>
+      </w:pPr>
+      <w:r>
+        <w:rPr>
+          <w:rFonts w:ascii="Times New Roman" w:hAnsi="Times New Roman"/>
+          <w:b/>
+          <w:sz w:val="28"/>
+        </w:rPr>
+        <w:t>22. Стандартизация технологии RFID</w:t>
+      </w:r>
+    </w:p>
+    <w:p>
+      <w:pPr>
+        <w:spacing w:after="120" w:line="276" w:lineRule="auto"/>
+        <w:ind w:firstLine="425"/>
+      </w:pPr>
+      <w:r>
+        <w:rPr>
+          <w:rFonts w:ascii="Times New Roman" w:hAnsi="Times New Roman"/>
+          <w:sz w:val="24"/>
+        </w:rPr>
+        <w:t>Единого универсального международного стандарта для всей RFID-технологии нет, потому что RFID применяется в разных частотных диапазонах, в разных отраслях и с различными требованиями к дальности, скорости, памяти и безопасности. Поэтому стандартизация RFID представляет собой набор стандартов, определяющих радиоинтерфейс, структуру данных, области применения, испытания и совместимость устройств.</w:t>
+      </w:r>
+    </w:p>
+    <w:p>
+      <w:pPr>
+        <w:spacing w:after="120" w:line="276" w:lineRule="auto"/>
+        <w:ind w:firstLine="425"/>
+      </w:pPr>
+      <w:r>
+        <w:rPr>
+          <w:rFonts w:ascii="Times New Roman" w:hAnsi="Times New Roman"/>
+          <w:sz w:val="24"/>
+        </w:rPr>
+        <w:t>Ключевую роль играют ISO и IEC. Серия ISO/IEC 18000 описывает радиоинтерфейс для систем автоматической идентификации и контроля предметов снабжения и охватывает основные частотные диапазоны RFID. Для идентификации животных используются ISO/IEC 11784 и ISO/IEC 11785: первый определяет структуру записываемых данных, второй — протокол радиоинтерфейса. Для бесконтактных карт и платежных решений важны ISO/IEC 14443 и ISO/IEC 15693. Испытания устройств описываются стандартами ISO/IEC 18046 и ISO/IEC 18047.</w:t>
+      </w:r>
+    </w:p>
+    <w:p>
+      <w:pPr>
+        <w:spacing w:after="120" w:line="276" w:lineRule="auto"/>
+        <w:ind w:firstLine="425"/>
+      </w:pPr>
+      <w:r>
+        <w:rPr>
+          <w:rFonts w:ascii="Times New Roman" w:hAnsi="Times New Roman"/>
+          <w:sz w:val="24"/>
+        </w:rPr>
+        <w:t>Отдельное направление связано с EPC — электронным кодом продукта. Центр Auto-ID и организация EPCglobal развивали стандарты, ориентированные на глобальные цепочки поставок и логистику. Здесь важны классы меток, отличающиеся возможностями памяти, перезаписи, источника питания и дальности работы.</w:t>
+      </w:r>
+    </w:p>
+    <w:p>
+      <w:pPr>
+        <w:spacing w:after="120" w:line="276" w:lineRule="auto"/>
+        <w:ind w:firstLine="425"/>
+      </w:pPr>
+      <w:r>
+        <w:rPr>
+          <w:rFonts w:ascii="Times New Roman" w:hAnsi="Times New Roman"/>
+          <w:sz w:val="24"/>
+        </w:rPr>
+        <w:t>Главная цель стандартизации — обеспечить совместимость меток, считывателей и информационных систем, чтобы оборудование разных производителей могло работать в одной цепочке поставок или инфраструктуре.</w:t>
+      </w:r>
+    </w:p>
+    <w:tbl>
+      <w:tblPr>
+        <w:tblStyle w:val="TableGrid"/>
+        <w:tblW w:type="auto" w:w="0"/>
+        <w:tblLook w:firstColumn="1" w:firstRow="1" w:lastColumn="0" w:lastRow="0" w:noHBand="0" w:noVBand="1" w:val="04A0"/>
+      </w:tblPr>
+      <w:tblGrid>
+        <w:gridCol w:w="4986"/>
+        <w:gridCol w:w="4986"/>
+      </w:tblGrid>
+      <w:tr>
+        <w:tc>
+          <w:tcPr>
+            <w:tcW w:type="dxa" w:w="4986"/>
+          </w:tcPr>
+          <w:p>
+            <w:r>
+              <w:rPr>
+                <w:rFonts w:ascii="Times New Roman" w:hAnsi="Times New Roman"/>
+                <w:b/>
+                <w:sz w:val="22"/>
+              </w:rPr>
+              <w:t>Стандарт / организация</w:t>
+            </w:r>
+          </w:p>
+        </w:tc>
+        <w:tc>
+          <w:tcPr>
+            <w:tcW w:type="dxa" w:w="4986"/>
+          </w:tcPr>
+          <w:p>
+            <w:r>
+              <w:rPr>
+                <w:rFonts w:ascii="Times New Roman" w:hAnsi="Times New Roman"/>
+                <w:b/>
+                <w:sz w:val="22"/>
+              </w:rPr>
+              <w:t>Что регулирует</w:t>
+            </w:r>
+          </w:p>
+        </w:tc>
+      </w:tr>
+      <w:tr>
+        <w:tc>
+          <w:tcPr>
+            <w:tcW w:type="dxa" w:w="4986"/>
+          </w:tcPr>
+          <w:p>
+            <w:r>
+              <w:rPr>
+                <w:rFonts w:ascii="Times New Roman" w:hAnsi="Times New Roman"/>
+                <w:sz w:val="22"/>
+              </w:rPr>
+              <w:t>ISO/IEC 18000</w:t>
+            </w:r>
+          </w:p>
+        </w:tc>
+        <w:tc>
+          <w:tcPr>
+            <w:tcW w:type="dxa" w:w="4986"/>
+          </w:tcPr>
+          <w:p>
+            <w:r>
+              <w:rPr>
+                <w:rFonts w:ascii="Times New Roman" w:hAnsi="Times New Roman"/>
+                <w:sz w:val="22"/>
+              </w:rPr>
+              <w:t>Радиоинтерфейс RFID для автоматической идентификации и цепочек поставок</w:t>
+            </w:r>
+          </w:p>
+        </w:tc>
+      </w:tr>
+      <w:tr>
+        <w:tc>
+          <w:tcPr>
+            <w:tcW w:type="dxa" w:w="4986"/>
+          </w:tcPr>
+          <w:p>
+            <w:r>
+              <w:rPr>
+                <w:rFonts w:ascii="Times New Roman" w:hAnsi="Times New Roman"/>
+                <w:sz w:val="22"/>
+              </w:rPr>
+              <w:t>ISO/IEC 11784, 11785</w:t>
+            </w:r>
+          </w:p>
+        </w:tc>
+        <w:tc>
+          <w:tcPr>
+            <w:tcW w:type="dxa" w:w="4986"/>
+          </w:tcPr>
+          <w:p>
+            <w:r>
+              <w:rPr>
+                <w:rFonts w:ascii="Times New Roman" w:hAnsi="Times New Roman"/>
+                <w:sz w:val="22"/>
+              </w:rPr>
+              <w:t>Идентификация животных: структура данных и протокол радиоинтерфейса</w:t>
+            </w:r>
+          </w:p>
+        </w:tc>
+      </w:tr>
+      <w:tr>
+        <w:tc>
+          <w:tcPr>
+            <w:tcW w:type="dxa" w:w="4986"/>
+          </w:tcPr>
+          <w:p>
+            <w:r>
+              <w:rPr>
+                <w:rFonts w:ascii="Times New Roman" w:hAnsi="Times New Roman"/>
+                <w:sz w:val="22"/>
+              </w:rPr>
+              <w:t>ISO/IEC 14443</w:t>
+            </w:r>
+          </w:p>
+        </w:tc>
+        <w:tc>
+          <w:tcPr>
+            <w:tcW w:type="dxa" w:w="4986"/>
+          </w:tcPr>
+          <w:p>
+            <w:r>
+              <w:rPr>
+                <w:rFonts w:ascii="Times New Roman" w:hAnsi="Times New Roman"/>
+                <w:sz w:val="22"/>
+              </w:rPr>
+              <w:t>Бесконтактные смарт-карты и платежные решения ближнего действия</w:t>
+            </w:r>
+          </w:p>
+        </w:tc>
+      </w:tr>
+      <w:tr>
+        <w:tc>
+          <w:tcPr>
+            <w:tcW w:type="dxa" w:w="4986"/>
+          </w:tcPr>
+          <w:p>
+            <w:r>
+              <w:rPr>
+                <w:rFonts w:ascii="Times New Roman" w:hAnsi="Times New Roman"/>
+                <w:sz w:val="22"/>
+              </w:rPr>
+              <w:t>ISO/IEC 15693</w:t>
+            </w:r>
+          </w:p>
+        </w:tc>
+        <w:tc>
+          <w:tcPr>
+            <w:tcW w:type="dxa" w:w="4986"/>
+          </w:tcPr>
+          <w:p>
+            <w:r>
+              <w:rPr>
+                <w:rFonts w:ascii="Times New Roman" w:hAnsi="Times New Roman"/>
+                <w:sz w:val="22"/>
+              </w:rPr>
+              <w:t>Карты и метки дальнего действия</w:t>
+            </w:r>
+          </w:p>
+        </w:tc>
+      </w:tr>
+      <w:tr>
+        <w:tc>
+          <w:tcPr>
+            <w:tcW w:type="dxa" w:w="4986"/>
+          </w:tcPr>
+          <w:p>
+            <w:r>
+              <w:rPr>
+                <w:rFonts w:ascii="Times New Roman" w:hAnsi="Times New Roman"/>
+                <w:sz w:val="22"/>
+              </w:rPr>
+              <w:t>ISO/IEC 18046, 18047</w:t>
+            </w:r>
+          </w:p>
+        </w:tc>
+        <w:tc>
+          <w:tcPr>
+            <w:tcW w:type="dxa" w:w="4986"/>
+          </w:tcPr>
+          <w:p>
+            <w:r>
+              <w:rPr>
+                <w:rFonts w:ascii="Times New Roman" w:hAnsi="Times New Roman"/>
+                <w:sz w:val="22"/>
+              </w:rPr>
+              <w:t>Испытания характеристик и соответствия RFID-меток и считывателей</w:t>
+            </w:r>
+          </w:p>
+        </w:tc>
+      </w:tr>
+      <w:tr>
+        <w:tc>
+          <w:tcPr>
+            <w:tcW w:type="dxa" w:w="4986"/>
+          </w:tcPr>
+          <w:p>
+            <w:r>
+              <w:rPr>
+                <w:rFonts w:ascii="Times New Roman" w:hAnsi="Times New Roman"/>
+                <w:sz w:val="22"/>
+              </w:rPr>
+              <w:t>EPC / EPCglobal</w:t>
+            </w:r>
+          </w:p>
+        </w:tc>
+        <w:tc>
+          <w:tcPr>
+            <w:tcW w:type="dxa" w:w="4986"/>
+          </w:tcPr>
+          <w:p>
+            <w:r>
+              <w:rPr>
+                <w:rFonts w:ascii="Times New Roman" w:hAnsi="Times New Roman"/>
+                <w:sz w:val="22"/>
+              </w:rPr>
+              <w:t>Электронный код продукта и стандарты для логистических цепочек</w:t>
+            </w:r>
+          </w:p>
+        </w:tc>
+      </w:tr>
+    </w:tbl>
+    <w:p/>
+    <w:p>
+      <w:r>
+        <w:br w:type="page"/>
+      </w:r>
+    </w:p>
+    <w:p>
+      <w:pPr>
+        <w:pStyle w:val="Heading1"/>
+      </w:pPr>
+      <w:r>
+        <w:rPr>
+          <w:rFonts w:ascii="Times New Roman" w:hAnsi="Times New Roman"/>
+          <w:b/>
+          <w:sz w:val="28"/>
+        </w:rPr>
+        <w:t>23. Современное состояние и перспективы развития технологии RFID</w:t>
+      </w:r>
+    </w:p>
+    <w:p>
+      <w:pPr>
+        <w:spacing w:after="120" w:line="276" w:lineRule="auto"/>
+        <w:ind w:firstLine="425"/>
+      </w:pPr>
+      <w:r>
+        <w:rPr>
+          <w:rFonts w:ascii="Times New Roman" w:hAnsi="Times New Roman"/>
+          <w:sz w:val="24"/>
+        </w:rPr>
+        <w:t>RFID начала активно применяться еще в середине XX века, в том числе в военной сфере, но широкое гражданское внедрение стало заметным в 1990-е годы после появления базовых стандартов ISO. В начале XXI века технология получила сильный импульс: крупные организации, включая Walmart и Министерство обороны США, требовали от поставщиков маркировать продукцию RFID-метками. Это создало ожидание массового перехода от штрихкодов к радиочастотной идентификации.</w:t>
+      </w:r>
+    </w:p>
+    <w:p>
+      <w:pPr>
+        <w:spacing w:after="120" w:line="276" w:lineRule="auto"/>
+        <w:ind w:firstLine="425"/>
+      </w:pPr>
+      <w:r>
+        <w:rPr>
+          <w:rFonts w:ascii="Times New Roman" w:hAnsi="Times New Roman"/>
+          <w:sz w:val="24"/>
+        </w:rPr>
+        <w:t>Позже развитие оказалось менее быстрым, чем ожидалось. Причины — стоимость меток и инфраструктуры, опасения по безопасности и приватности, технические ограничения при работе рядом с металлом и жидкостями, проблемы совместимости стандартов и необходимость менять бизнес-процессы. Кроме того, не во всех сферах применение RFID экономически оправдано: если объект дешевый, одноразовый и не требует точного учета, штрихкод может быть выгоднее.</w:t>
+      </w:r>
+    </w:p>
+    <w:p>
+      <w:pPr>
+        <w:spacing w:after="120" w:line="276" w:lineRule="auto"/>
+        <w:ind w:firstLine="425"/>
+      </w:pPr>
+      <w:r>
+        <w:rPr>
+          <w:rFonts w:ascii="Times New Roman" w:hAnsi="Times New Roman"/>
+          <w:sz w:val="24"/>
+        </w:rPr>
+        <w:t>Тем не менее сегодня RFID является зрелой и практически востребованной технологией. Она применяется в логистике, складском учете, торговле, транспорте, медицине, контроле доступа, маркировке животных, библиотечных системах и промышленности. Удешевление меток, улучшение считывателей, развитие EPC/RFID-стандартов и интеграция с IoT повышают ее роль.</w:t>
+      </w:r>
+    </w:p>
+    <w:p>
+      <w:pPr>
+        <w:spacing w:after="120" w:line="276" w:lineRule="auto"/>
+        <w:ind w:firstLine="425"/>
+      </w:pPr>
+      <w:r>
+        <w:rPr>
+          <w:rFonts w:ascii="Times New Roman" w:hAnsi="Times New Roman"/>
+          <w:sz w:val="24"/>
+        </w:rPr>
+        <w:t>Перспективы RFID связаны с массовой автоматической идентификацией объектов в Интернете вещей. RFID позволяет связать физический объект с цифровой записью, быстро проводить инвентаризацию, отслеживать перемещение товаров, бороться с потерями и подделками. Поэтому массовое внедрение RFID реально, но оно будет происходить не во всех сферах одинаково, а прежде всего там, где автоматическая бесконтактная идентификация дает измеримый экономический эффект.</w:t>
+      </w:r>
+    </w:p>
+    <w:p>
+      <w:r>
+        <w:br w:type="page"/>
+      </w:r>
+    </w:p>
+    <w:p>
+      <w:pPr>
+        <w:pStyle w:val="Heading1"/>
+      </w:pPr>
+      <w:r>
+        <w:rPr>
+          <w:rFonts w:ascii="Times New Roman" w:hAnsi="Times New Roman"/>
+          <w:b/>
+          <w:sz w:val="28"/>
+        </w:rPr>
+        <w:t>24. Области применения RFID-технологий</w:t>
+      </w:r>
+    </w:p>
+    <w:p>
+      <w:pPr>
+        <w:spacing w:after="120" w:line="276" w:lineRule="auto"/>
+        <w:ind w:firstLine="425"/>
+      </w:pPr>
+      <w:r>
+        <w:rPr>
+          <w:rFonts w:ascii="Times New Roman" w:hAnsi="Times New Roman"/>
+          <w:sz w:val="24"/>
+        </w:rPr>
+        <w:t>RFID применяется там, где нужно быстро, бесконтактно и автоматически идентифицировать объекты, людей, животных или транспорт. В промышленности и сельском хозяйстве RFID помогает управлять складскими запасами, отслеживать комплектующие между цехами, контролировать движение деталей по производственной линии и снижать количество ошибок ручного учета. Например, каждая деталь или контейнер получает метку, а система автоматически фиксирует перемещение через контрольные точки.</w:t>
+      </w:r>
+    </w:p>
+    <w:p>
+      <w:pPr>
+        <w:spacing w:after="120" w:line="276" w:lineRule="auto"/>
+        <w:ind w:firstLine="425"/>
+      </w:pPr>
+      <w:r>
+        <w:rPr>
+          <w:rFonts w:ascii="Times New Roman" w:hAnsi="Times New Roman"/>
+          <w:sz w:val="24"/>
+        </w:rPr>
+        <w:t>В логистике RFID используется для маркировки паллет, контейнеров, грузов и транспортных средств. Это ускоряет приемку и отгрузку, облегчает инвентаризацию, позволяет видеть местоположение товара и повышает прозрачность цепочки поставок. В торговле RFID помогает контролировать наличие товара на полках, уменьшать кражи, ускорять пересчет остатков и автоматизировать кассовые операции.</w:t>
+      </w:r>
+    </w:p>
+    <w:p>
+      <w:pPr>
+        <w:spacing w:after="120" w:line="276" w:lineRule="auto"/>
+        <w:ind w:firstLine="425"/>
+      </w:pPr>
+      <w:r>
+        <w:rPr>
+          <w:rFonts w:ascii="Times New Roman" w:hAnsi="Times New Roman"/>
+          <w:sz w:val="24"/>
+        </w:rPr>
+        <w:t>В транспорте RFID применяется для проезда через платные дороги, идентификации автомобилей, контроля топлива, учета парковок и доступа на территорию. В образовании и библиотеках RFID-метки упрощают выдачу и возврат книг, инвентаризацию фондов и защиту от несанкционированного выноса. В медицине RFID используют для идентификации пациентов, лекарств, медицинского оборудования и расходных материалов.</w:t>
+      </w:r>
+    </w:p>
+    <w:p>
+      <w:pPr>
+        <w:spacing w:after="120" w:line="276" w:lineRule="auto"/>
+        <w:ind w:firstLine="425"/>
+      </w:pPr>
+      <w:r>
+        <w:rPr>
+          <w:rFonts w:ascii="Times New Roman" w:hAnsi="Times New Roman"/>
+          <w:sz w:val="24"/>
+        </w:rPr>
+        <w:t>В системах безопасности RFID лежит в основе электронных пропусков, карт доступа и идентификации персонала. Также технология широко применяется для маркировки животных, бесконтактных платежей, учета багажа, спортивного хронометража и контроля подлинности продукции. Для IoT RFID важна как базовая технология связывания физического объекта с цифровым миром: метка сообщает системе, что конкретная вещь существует, где она находится и к какому процессу относится.</w:t>
+      </w:r>
+    </w:p>
+    <w:p>
+      <w:r>
+        <w:br w:type="page"/>
+      </w:r>
+    </w:p>
+    <w:p>
+      <w:pPr>
+        <w:pStyle w:val="Heading1"/>
+      </w:pPr>
+      <w:r>
+        <w:rPr>
+          <w:rFonts w:ascii="Times New Roman" w:hAnsi="Times New Roman"/>
+          <w:b/>
+          <w:sz w:val="28"/>
+        </w:rPr>
+        <w:t>25. Основные понятия и принципы сенсорных сетей</w:t>
+      </w:r>
+    </w:p>
+    <w:p>
+      <w:pPr>
+        <w:spacing w:after="120" w:line="276" w:lineRule="auto"/>
+        <w:ind w:firstLine="425"/>
+      </w:pPr>
+      <w:r>
+        <w:rPr>
+          <w:rFonts w:ascii="Times New Roman" w:hAnsi="Times New Roman"/>
+          <w:sz w:val="24"/>
+        </w:rPr>
+        <w:t>Сенсорная сеть — это распределенная система, состоящая из множества сенсорных узлов, которые измеряют параметры окружающей среды или объекта, обрабатывают данные и передают их другим узлам, шлюзу или базовой станции. Основная задача такой сети — автоматический сбор информации для мониторинга и управления.</w:t>
+      </w:r>
+    </w:p>
+    <w:p>
+      <w:pPr>
+        <w:spacing w:after="120" w:line="276" w:lineRule="auto"/>
+        <w:ind w:firstLine="425"/>
+      </w:pPr>
+      <w:r>
+        <w:rPr>
+          <w:rFonts w:ascii="Times New Roman" w:hAnsi="Times New Roman"/>
+          <w:sz w:val="24"/>
+        </w:rPr>
+        <w:t>Сенсор — устройство, которое воспринимает контролируемое воздействие: температуру, давление, свет, влажность, движение, вибрацию, химический состав и т.п. Он преобразует измеряемую физическую величину в сигнал, пригодный для обработки. Датчик в широком смысле — устройство преобразования одного вида энергии или информации в другой; сенсор можно рассматривать как разновидность датчика. Актуатор — исполнительное устройство, которое по команде изменяет состояние объекта: открывает клапан, включает двигатель, меняет положение заслонки, подает сигнал.</w:t>
+      </w:r>
+    </w:p>
+    <w:p>
+      <w:pPr>
+        <w:spacing w:after="120" w:line="276" w:lineRule="auto"/>
+        <w:ind w:firstLine="425"/>
+      </w:pPr>
+      <w:r>
+        <w:rPr>
+          <w:rFonts w:ascii="Times New Roman" w:hAnsi="Times New Roman"/>
+          <w:sz w:val="24"/>
+        </w:rPr>
+        <w:t>Сенсорный узел обычно включает один или несколько сенсоров, вычислительный модуль, память, источник питания и коммуникационный интерфейс. В беспроводных сенсорных сетях узлы обмениваются данными по радиоканалу и часто работают от батарей, поэтому ключевыми принципами являются энергосбережение, самоорганизация и минимизация передаваемых данных.</w:t>
+      </w:r>
+    </w:p>
+    <w:p>
+      <w:pPr>
+        <w:spacing w:after="120" w:line="276" w:lineRule="auto"/>
+        <w:ind w:firstLine="425"/>
+      </w:pPr>
+      <w:r>
+        <w:rPr>
+          <w:rFonts w:ascii="Times New Roman" w:hAnsi="Times New Roman"/>
+          <w:sz w:val="24"/>
+        </w:rPr>
+        <w:t>Сенсорные сети могут быть проводными и беспроводными. На практике особенно распространены БСС/WSN — беспроводные сенсорные сети, потому что они проще разворачиваются в труднодоступных местах, на подвижных объектах и на больших территориях. Сенсорная сеть может выполнять мониторинг, обнаружение событий, передачу тревог, локальную обработку, агрегацию данных и взаимодействие с внешними системами через шлюзы.</w:t>
+      </w:r>
+    </w:p>
+    <w:p>
+      <w:r>
+        <w:br w:type="page"/>
+      </w:r>
+    </w:p>
+    <w:p>
+      <w:pPr>
+        <w:pStyle w:val="Heading1"/>
+      </w:pPr>
+      <w:r>
+        <w:rPr>
+          <w:rFonts w:ascii="Times New Roman" w:hAnsi="Times New Roman"/>
+          <w:b/>
+          <w:sz w:val="28"/>
+        </w:rPr>
+        <w:t>26. Базовая архитектура сенсорной сети</w:t>
+      </w:r>
+    </w:p>
+    <w:p>
+      <w:pPr>
+        <w:spacing w:after="120" w:line="276" w:lineRule="auto"/>
+        <w:ind w:firstLine="425"/>
+      </w:pPr>
+      <w:r>
+        <w:rPr>
+          <w:rFonts w:ascii="Times New Roman" w:hAnsi="Times New Roman"/>
+          <w:sz w:val="24"/>
+        </w:rPr>
+        <w:t>Базовая архитектура сенсорной сети описывает состав сенсорного узла, интерфейсы между компонентами и связь сети с внешней средой. В материалах указано, что стандартизацией сенсорных сетей занимаются ISO, IEC, ITU-T, IEEE и другие организации. Исследовательская группа SGSN комитета ISO/IEC JTC 1 определила базовую архитектуру сенсорной сети и ее основные интерфейсы.</w:t>
+      </w:r>
+    </w:p>
+    <w:p>
+      <w:pPr>
+        <w:spacing w:after="120" w:line="276" w:lineRule="auto"/>
+        <w:ind w:firstLine="425"/>
+      </w:pPr>
+      <w:r>
+        <w:rPr>
+          <w:rFonts w:ascii="Times New Roman" w:hAnsi="Times New Roman"/>
+          <w:sz w:val="24"/>
+        </w:rPr>
+        <w:t>Сенсорный узел состоит из аппаратного обеспечения, базового программного обеспечения и прикладного программного обеспечения. Аппаратная часть включает сенсоры, актуаторы, коммуникационный модуль, процессор, память и питание. Базовое ПО отвечает за работу оборудования, обмен, энергосбережение, сетевые функции и выполнение системных задач. Прикладное ПО реализует конкретную функцию: мониторинг температуры, контроль состояния конструкции, медицинское наблюдение, промышленную диагностику и т.д.</w:t>
+      </w:r>
+    </w:p>
+    <w:p>
+      <w:pPr>
+        <w:spacing w:after="120" w:line="276" w:lineRule="auto"/>
+        <w:ind w:firstLine="425"/>
+      </w:pPr>
+      <w:r>
+        <w:rPr>
+          <w:rFonts w:ascii="Times New Roman" w:hAnsi="Times New Roman"/>
+          <w:sz w:val="24"/>
+        </w:rPr>
+        <w:t>В архитектуре выделяются четыре основных интерфейса. Первый — между прикладным и базовым программным обеспечением. Второй — между базовым ПО и аппаратной частью узла. Третий — беспроводные или проводные интерфейсы между узлами внутри сети. Четвертый — интерфейс между сенсорной сетью и внешней средой: пользователями, провайдерами услуг, информационными системами и приложениями.</w:t>
+      </w:r>
+    </w:p>
+    <w:p>
+      <w:pPr>
+        <w:spacing w:after="120" w:line="276" w:lineRule="auto"/>
+        <w:ind w:firstLine="425"/>
+      </w:pPr>
+      <w:r>
+        <w:rPr>
+          <w:rFonts w:ascii="Times New Roman" w:hAnsi="Times New Roman"/>
+          <w:sz w:val="24"/>
+        </w:rPr>
+        <w:t>Такая архитектура важна тем, что отделяет измерение и управление физическими объектами от сетевого обмена и прикладной логики. Сенсорная сеть может быть самостоятельной локальной системой или частью более крупной IoT-инфраструктуры. Через шлюз она передает данные в облако, туманную платформу, SCADA-систему, городской сервис или мобильное приложение пользователя.</w:t>
+      </w:r>
+    </w:p>
+    <w:p>
+      <w:r>
+        <w:br w:type="page"/>
+      </w:r>
+    </w:p>
+    <w:p>
+      <w:pPr>
+        <w:pStyle w:val="Heading1"/>
+      </w:pPr>
+      <w:r>
+        <w:rPr>
+          <w:rFonts w:ascii="Times New Roman" w:hAnsi="Times New Roman"/>
+          <w:b/>
+          <w:sz w:val="28"/>
+        </w:rPr>
+        <w:t>27. Узлы беспроводной сенсорной сети</w:t>
+      </w:r>
+    </w:p>
+    <w:p>
+      <w:pPr>
+        <w:spacing w:after="120" w:line="276" w:lineRule="auto"/>
+        <w:ind w:firstLine="425"/>
+      </w:pPr>
+      <w:r>
+        <w:rPr>
+          <w:rFonts w:ascii="Times New Roman" w:hAnsi="Times New Roman"/>
+          <w:sz w:val="24"/>
+        </w:rPr>
+        <w:t>Узел беспроводной сенсорной сети — это миниатюрное вычислительное устройство, оснащенное датчиками, иногда актуаторами, приемопередатчиком и источником питания. В материалах отмечается, что типичный сенсорный узел может иметь размер порядка одного кубического дюйма, но при этом включает процессор, память, аналого-цифровые и цифро-аналоговые преобразователи, радиочастотный модуль, батарею и набор сенсоров.</w:t>
+      </w:r>
+    </w:p>
+    <w:p>
+      <w:pPr>
+        <w:spacing w:after="120" w:line="276" w:lineRule="auto"/>
+        <w:ind w:firstLine="425"/>
+      </w:pPr>
+      <w:r>
+        <w:rPr>
+          <w:rFonts w:ascii="Times New Roman" w:hAnsi="Times New Roman"/>
+          <w:sz w:val="24"/>
+        </w:rPr>
+        <w:t>Аппаратную часть узла БСС обычно делят на четыре подсистемы. Коммуникационная подсистема обеспечивает беспроводную связь с другими узлами и содержит радиоприемопередатчик. Вычислительная подсистема выполняет обработку данных и управление узлом; в нее входит микроконтроллер, оперативная и энергонезависимая память, таймеры, порты ввода-вывода и АЦП. Сенсорная подсистема связывает узел с внешним миром: включает аналоговые и цифровые датчики, а при необходимости актуаторы. Подсистема питания обеспечивает автономную работу, чаще всего от батареи или от источников энергии окружающей среды.</w:t>
+      </w:r>
+    </w:p>
+    <w:p>
+      <w:pPr>
+        <w:spacing w:after="120" w:line="276" w:lineRule="auto"/>
+        <w:ind w:firstLine="425"/>
+      </w:pPr>
+      <w:r>
+        <w:rPr>
+          <w:rFonts w:ascii="Times New Roman" w:hAnsi="Times New Roman"/>
+          <w:sz w:val="24"/>
+        </w:rPr>
+        <w:t>Особенность узлов БСС — ограниченные ресурсы. У них мало энергии, памяти, вычислительной мощности и пропускной способности. Поэтому программное обеспечение должно быть простым и энергоэффективным: узел большую часть времени может находиться в спящем режиме, периодически просыпаться для измерения, передавать только нужные данные и снова отключать радиомодуль.</w:t>
+      </w:r>
+    </w:p>
+    <w:p>
+      <w:pPr>
+        <w:spacing w:after="120" w:line="276" w:lineRule="auto"/>
+        <w:ind w:firstLine="425"/>
+      </w:pPr>
+      <w:r>
+        <w:rPr>
+          <w:rFonts w:ascii="Times New Roman" w:hAnsi="Times New Roman"/>
+          <w:sz w:val="24"/>
+        </w:rPr>
+        <w:t>Сенсорные узлы могут работать как оконечные устройства, маршрутизаторы или координаторы, в зависимости от топологии сети и используемого протокола. Их ценность в IoT заключается в массовом распределенном наблюдении: много дешевых узлов позволяют контролировать большую территорию или сложный объект без прокладки проводов.</w:t>
+      </w:r>
+    </w:p>
+    <w:p>
+      <w:r>
+        <w:br w:type="page"/>
+      </w:r>
+    </w:p>
+    <w:p>
+      <w:pPr>
+        <w:pStyle w:val="Heading1"/>
+      </w:pPr>
+      <w:r>
+        <w:rPr>
+          <w:rFonts w:ascii="Times New Roman" w:hAnsi="Times New Roman"/>
+          <w:b/>
+          <w:sz w:val="28"/>
+        </w:rPr>
+        <w:t>28. Способы передачи данных в БСС</w:t>
+      </w:r>
+    </w:p>
+    <w:p>
+      <w:pPr>
+        <w:spacing w:after="120" w:line="276" w:lineRule="auto"/>
+        <w:ind w:firstLine="425"/>
+      </w:pPr>
+      <w:r>
+        <w:rPr>
+          <w:rFonts w:ascii="Times New Roman" w:hAnsi="Times New Roman"/>
+          <w:sz w:val="24"/>
+        </w:rPr>
+        <w:t>В беспроводных сенсорных сетях данные могут передаваться с помощью радиосвязи, инфракрасного излучения или оптических сигналов. На практике наиболее распространена радиосвязь, потому что она не требует прямой видимости, позволяет строить сети на больших территориях и поддерживает различные топологии.</w:t>
+      </w:r>
+    </w:p>
+    <w:p>
+      <w:pPr>
+        <w:spacing w:after="120" w:line="276" w:lineRule="auto"/>
+        <w:ind w:firstLine="425"/>
+      </w:pPr>
+      <w:r>
+        <w:rPr>
+          <w:rFonts w:ascii="Times New Roman" w:hAnsi="Times New Roman"/>
+          <w:sz w:val="24"/>
+        </w:rPr>
+        <w:t>Часто используются ISM-диапазоны — полосы частот для промышленных, научных и медицинских целей, которые во многих странах доступны без индивидуального лицензирования. Примеры — 433 МГц в Европе, 915 МГц в Северной Америке, а также 2,4 ГГц, используемый многими беспроводными технологиями. Преимущество ISM-диапазонов — доступность и распространенность оборудования; недостаток — возможные помехи, потому что эти частоты используют разные системы.</w:t>
+      </w:r>
+    </w:p>
+    <w:p>
+      <w:pPr>
+        <w:spacing w:after="120" w:line="276" w:lineRule="auto"/>
+        <w:ind w:firstLine="425"/>
+      </w:pPr>
+      <w:r>
+        <w:rPr>
+          <w:rFonts w:ascii="Times New Roman" w:hAnsi="Times New Roman"/>
+          <w:sz w:val="24"/>
+        </w:rPr>
+        <w:t>Инфракрасная и оптическая передача теоретически могут использоваться в сенсорных сетях, но требуют прямой видимости и меньше подходят для случайно размещенных или подвижных узлов. Поэтому их применяют в специальных условиях, где радиосвязь нежелательна или невозможна.</w:t>
+      </w:r>
+    </w:p>
+    <w:p>
+      <w:pPr>
+        <w:spacing w:after="120" w:line="276" w:lineRule="auto"/>
+        <w:ind w:firstLine="425"/>
+      </w:pPr>
+      <w:r>
+        <w:rPr>
+          <w:rFonts w:ascii="Times New Roman" w:hAnsi="Times New Roman"/>
+          <w:sz w:val="24"/>
+        </w:rPr>
+        <w:t>Передача в БСС может быть односкачковой и многоскачковой. При односкачковой схеме каждый узел напрямую передает данные базовой станции. Это просто, но требует большей мощности и ограничивает размер сети. При многоскачковой передаче данные идут через промежуточные узлы, что позволяет расширить зону покрытия и экономить энергию, но требует маршрутизации и повышает сложность сети.</w:t>
+      </w:r>
+    </w:p>
+    <w:p>
+      <w:pPr>
+        <w:spacing w:after="120" w:line="276" w:lineRule="auto"/>
+        <w:ind w:firstLine="425"/>
+      </w:pPr>
+      <w:r>
+        <w:rPr>
+          <w:rFonts w:ascii="Times New Roman" w:hAnsi="Times New Roman"/>
+          <w:sz w:val="24"/>
+        </w:rPr>
+        <w:t>Также важна агрегация данных: промежуточные узлы могут объединять измерения от нескольких сенсоров, чтобы уменьшить объем трафика. Поскольку передача данных — самая энергозатратная операция, БСС стремятся минимизировать число включений радиомодуля и объем сообщений.</w:t>
+      </w:r>
+    </w:p>
+    <w:p>
+      <w:r>
+        <w:br w:type="page"/>
+      </w:r>
+    </w:p>
+    <w:p>
+      <w:pPr>
+        <w:pStyle w:val="Heading1"/>
+      </w:pPr>
+      <w:r>
+        <w:rPr>
+          <w:rFonts w:ascii="Times New Roman" w:hAnsi="Times New Roman"/>
+          <w:b/>
+          <w:sz w:val="28"/>
+        </w:rPr>
+        <w:t>29. Протоколы и технологии передачи данных в БСС</w:t>
+      </w:r>
+    </w:p>
+    <w:p>
+      <w:pPr>
+        <w:spacing w:after="120" w:line="276" w:lineRule="auto"/>
+        <w:ind w:firstLine="425"/>
+      </w:pPr>
+      <w:r>
+        <w:rPr>
+          <w:rFonts w:ascii="Times New Roman" w:hAnsi="Times New Roman"/>
+          <w:sz w:val="24"/>
+        </w:rPr>
+        <w:t>Беспроводные сенсорные сети относятся к классу WPAN — беспроводных персональных сетей. Их ключевая особенность — работа узлов от ограниченных источников питания, часто без возможности замены батареи. Поэтому протоколы БСС должны обеспечивать малое энергопотребление, надежную передачу на небольшие расстояния и поддержку самоорганизации.</w:t>
+      </w:r>
+    </w:p>
+    <w:p>
+      <w:pPr>
+        <w:spacing w:after="120" w:line="276" w:lineRule="auto"/>
+        <w:ind w:firstLine="425"/>
+      </w:pPr>
+      <w:r>
+        <w:rPr>
+          <w:rFonts w:ascii="Times New Roman" w:hAnsi="Times New Roman"/>
+          <w:sz w:val="24"/>
+        </w:rPr>
+        <w:t>Одной из важнейших технологий является IEEE 802.15.4. Этот стандарт описывает физический уровень и уровень доступа к среде для беспроводных сетей малой дальности, обычно до десятков метров, с низким энергопотреблением и высокой надежностью. На базе IEEE 802.15.4 строятся более высокоуровневые протоколы, включая ZigBee.</w:t>
+      </w:r>
+    </w:p>
+    <w:p>
+      <w:pPr>
+        <w:spacing w:after="120" w:line="276" w:lineRule="auto"/>
+        <w:ind w:firstLine="425"/>
+      </w:pPr>
+      <w:r>
+        <w:rPr>
+          <w:rFonts w:ascii="Times New Roman" w:hAnsi="Times New Roman"/>
+          <w:sz w:val="24"/>
+        </w:rPr>
+        <w:t>ZigBee — один из наиболее известных стеков для БСС. Он предназначен для низкоскоростной передачи данных, автоматизации зданий, промышленного мониторинга, умного дома, датчиков и исполнительных устройств. ZigBee поддерживает различные топологии, включая звезду, дерево и mesh, что позволяет узлам пересылать данные друг через друга.</w:t>
+      </w:r>
+    </w:p>
+    <w:p>
+      <w:pPr>
+        <w:spacing w:after="120" w:line="276" w:lineRule="auto"/>
+        <w:ind w:firstLine="425"/>
+      </w:pPr>
+      <w:r>
+        <w:rPr>
+          <w:rFonts w:ascii="Times New Roman" w:hAnsi="Times New Roman"/>
+          <w:sz w:val="24"/>
+        </w:rPr>
+        <w:t>Также для БСС важны 6LoWPAN, Bluetooth Low Energy, UWB и промышленные протоколы типа WirelessHART или ISA100.11a. 6LoWPAN позволяет передавать IPv6-пакеты поверх маломощных сетей IEEE 802.15.4, что упрощает сопряжение БСС с Интернетом. BLE подходит для носимых устройств и коротких соединений с низким энергопотреблением. UWB обеспечивает высокую скорость и точное позиционирование на малых расстояниях.</w:t>
+      </w:r>
+    </w:p>
+    <w:p>
+      <w:pPr>
+        <w:spacing w:after="120" w:line="276" w:lineRule="auto"/>
+        <w:ind w:firstLine="425"/>
+      </w:pPr>
+      <w:r>
+        <w:rPr>
+          <w:rFonts w:ascii="Times New Roman" w:hAnsi="Times New Roman"/>
+          <w:sz w:val="24"/>
+        </w:rPr>
+        <w:t>Выбор технологии зависит от дальности, скорости, энергопотребления, топологии, требований надежности и стоимости. Для IoT чаще всего важнее не максимальная скорость, а длительная автономная работа, простота масштабирования и надежная доставка небольших сообщений.</w:t>
+      </w:r>
+    </w:p>
+    <w:p>
+      <w:r>
+        <w:br w:type="page"/>
+      </w:r>
+    </w:p>
+    <w:p>
+      <w:pPr>
+        <w:pStyle w:val="Heading1"/>
+      </w:pPr>
+      <w:r>
+        <w:rPr>
+          <w:rFonts w:ascii="Times New Roman" w:hAnsi="Times New Roman"/>
+          <w:b/>
+          <w:sz w:val="28"/>
+        </w:rPr>
+        <w:t>30. Типы узлов БСС</w:t>
+      </w:r>
+    </w:p>
+    <w:p>
+      <w:pPr>
+        <w:spacing w:after="120" w:line="276" w:lineRule="auto"/>
+        <w:ind w:firstLine="425"/>
+      </w:pPr>
+      <w:r>
+        <w:rPr>
+          <w:rFonts w:ascii="Times New Roman" w:hAnsi="Times New Roman"/>
+          <w:sz w:val="24"/>
+        </w:rPr>
+        <w:t>Типовая архитектура беспроводной сенсорной сети включает три основных типа узлов: координатор, маршрутизатор и оконечное устройство. Их роли различаются по сложности, энергопотреблению и функциям в сети.</w:t>
+      </w:r>
+    </w:p>
+    <w:tbl>
+      <w:tblPr>
+        <w:tblStyle w:val="TableGrid"/>
+        <w:tblW w:type="auto" w:w="0"/>
+        <w:tblLook w:firstColumn="1" w:firstRow="1" w:lastColumn="0" w:lastRow="0" w:noHBand="0" w:noVBand="1" w:val="04A0"/>
+      </w:tblPr>
+      <w:tblGrid>
+        <w:gridCol w:w="3324"/>
+        <w:gridCol w:w="3324"/>
+        <w:gridCol w:w="3324"/>
+      </w:tblGrid>
+      <w:tr>
+        <w:tc>
+          <w:tcPr>
+            <w:tcW w:type="dxa" w:w="3324"/>
+          </w:tcPr>
+          <w:p>
+            <w:r>
+              <w:rPr>
+                <w:rFonts w:ascii="Times New Roman" w:hAnsi="Times New Roman"/>
+                <w:b/>
+                <w:sz w:val="22"/>
+              </w:rPr>
+              <w:t>Тип узла</w:t>
+            </w:r>
+          </w:p>
+        </w:tc>
+        <w:tc>
+          <w:tcPr>
+            <w:tcW w:type="dxa" w:w="3324"/>
+          </w:tcPr>
+          <w:p>
+            <w:r>
+              <w:rPr>
+                <w:rFonts w:ascii="Times New Roman" w:hAnsi="Times New Roman"/>
+                <w:b/>
+                <w:sz w:val="22"/>
+              </w:rPr>
+              <w:t>Роль в БСС</w:t>
+            </w:r>
+          </w:p>
+        </w:tc>
+        <w:tc>
+          <w:tcPr>
+            <w:tcW w:type="dxa" w:w="3324"/>
+          </w:tcPr>
+          <w:p>
+            <w:r>
+              <w:rPr>
+                <w:rFonts w:ascii="Times New Roman" w:hAnsi="Times New Roman"/>
+                <w:b/>
+                <w:sz w:val="22"/>
+              </w:rPr>
+              <w:t>Особенности</w:t>
+            </w:r>
+          </w:p>
+        </w:tc>
+      </w:tr>
+      <w:tr>
+        <w:tc>
+          <w:tcPr>
+            <w:tcW w:type="dxa" w:w="3324"/>
+          </w:tcPr>
+          <w:p>
+            <w:r>
+              <w:rPr>
+                <w:rFonts w:ascii="Times New Roman" w:hAnsi="Times New Roman"/>
+                <w:sz w:val="22"/>
+              </w:rPr>
+              <w:t>Координатор</w:t>
+            </w:r>
+          </w:p>
+        </w:tc>
+        <w:tc>
+          <w:tcPr>
+            <w:tcW w:type="dxa" w:w="3324"/>
+          </w:tcPr>
+          <w:p>
+            <w:r>
+              <w:rPr>
+                <w:rFonts w:ascii="Times New Roman" w:hAnsi="Times New Roman"/>
+                <w:sz w:val="22"/>
+              </w:rPr>
+              <w:t>Организует сеть, задает параметры, обеспечивает выход во внешнюю сеть</w:t>
+            </w:r>
+          </w:p>
+        </w:tc>
+        <w:tc>
+          <w:tcPr>
+            <w:tcW w:type="dxa" w:w="3324"/>
+          </w:tcPr>
+          <w:p>
+            <w:r>
+              <w:rPr>
+                <w:rFonts w:ascii="Times New Roman" w:hAnsi="Times New Roman"/>
+                <w:sz w:val="22"/>
+              </w:rPr>
+              <w:t>Один в сети; наиболее сложный и энергоемкий узел</w:t>
+            </w:r>
+          </w:p>
+        </w:tc>
+      </w:tr>
+      <w:tr>
+        <w:tc>
+          <w:tcPr>
+            <w:tcW w:type="dxa" w:w="3324"/>
+          </w:tcPr>
+          <w:p>
+            <w:r>
+              <w:rPr>
+                <w:rFonts w:ascii="Times New Roman" w:hAnsi="Times New Roman"/>
+                <w:sz w:val="22"/>
+              </w:rPr>
+              <w:t>Маршрутизатор</w:t>
+            </w:r>
+          </w:p>
+        </w:tc>
+        <w:tc>
+          <w:tcPr>
+            <w:tcW w:type="dxa" w:w="3324"/>
+          </w:tcPr>
+          <w:p>
+            <w:r>
+              <w:rPr>
+                <w:rFonts w:ascii="Times New Roman" w:hAnsi="Times New Roman"/>
+                <w:sz w:val="22"/>
+              </w:rPr>
+              <w:t>Передает данные между узлами, расширяет зону покрытия</w:t>
+            </w:r>
+          </w:p>
+        </w:tc>
+        <w:tc>
+          <w:tcPr>
+            <w:tcW w:type="dxa" w:w="3324"/>
+          </w:tcPr>
+          <w:p>
+            <w:r>
+              <w:rPr>
+                <w:rFonts w:ascii="Times New Roman" w:hAnsi="Times New Roman"/>
+                <w:sz w:val="22"/>
+              </w:rPr>
+              <w:t>Всегда активнее оконечных устройств; поддерживает многоскачковую передачу</w:t>
+            </w:r>
+          </w:p>
+        </w:tc>
+      </w:tr>
+      <w:tr>
+        <w:tc>
+          <w:tcPr>
+            <w:tcW w:type="dxa" w:w="3324"/>
+          </w:tcPr>
+          <w:p>
+            <w:r>
+              <w:rPr>
+                <w:rFonts w:ascii="Times New Roman" w:hAnsi="Times New Roman"/>
+                <w:sz w:val="22"/>
+              </w:rPr>
+              <w:t>Оконечное устройство</w:t>
+            </w:r>
+          </w:p>
+        </w:tc>
+        <w:tc>
+          <w:tcPr>
+            <w:tcW w:type="dxa" w:w="3324"/>
+          </w:tcPr>
+          <w:p>
+            <w:r>
+              <w:rPr>
+                <w:rFonts w:ascii="Times New Roman" w:hAnsi="Times New Roman"/>
+                <w:sz w:val="22"/>
+              </w:rPr>
+              <w:t>Собирает данные сенсоров или выполняет команды актуаторов</w:t>
+            </w:r>
+          </w:p>
+        </w:tc>
+        <w:tc>
+          <w:tcPr>
+            <w:tcW w:type="dxa" w:w="3324"/>
+          </w:tcPr>
+          <w:p>
+            <w:r>
+              <w:rPr>
+                <w:rFonts w:ascii="Times New Roman" w:hAnsi="Times New Roman"/>
+                <w:sz w:val="22"/>
+              </w:rPr>
+              <w:t>Самое простое; может долго находиться в спящем режиме</w:t>
+            </w:r>
+          </w:p>
+        </w:tc>
+      </w:tr>
+    </w:tbl>
+    <w:p/>
+    <w:p>
+      <w:r>
+        <w:br w:type="page"/>
+      </w:r>
+    </w:p>
+    <w:p>
+      <w:pPr>
+        <w:pStyle w:val="Heading1"/>
+      </w:pPr>
+      <w:r>
+        <w:rPr>
+          <w:rFonts w:ascii="Times New Roman" w:hAnsi="Times New Roman"/>
+          <w:b/>
+          <w:sz w:val="28"/>
+        </w:rPr>
+        <w:t>31. Типовые архитектуры и топологии БСС</w:t>
+      </w:r>
+    </w:p>
+    <w:p>
+      <w:pPr>
+        <w:spacing w:after="120" w:line="276" w:lineRule="auto"/>
+        <w:ind w:firstLine="425"/>
+      </w:pPr>
+      <w:r>
+        <w:rPr>
+          <w:rFonts w:ascii="Times New Roman" w:hAnsi="Times New Roman"/>
+          <w:sz w:val="24"/>
+        </w:rPr>
+        <w:t>В беспроводных сенсорных сетях выделяют два основных типа архитектуры: однородную, или одноранговую, и иерархическую, или кластерную. В однородной сети все узлы выполняют примерно одинаковые функции по сбору, обработке и передаче данных. Такой подход позволяет строить гибкие маршруты и выбирать путь передачи по разным критериям: минимальная длина, максимальный запас энергии, надежность, задержка. Недостаток — возможные столкновения пакетов, задержки из-за спящих узлов и сложность поддержания связей в большой сети.</w:t>
+      </w:r>
+    </w:p>
+    <w:p>
+      <w:pPr>
+        <w:spacing w:after="120" w:line="276" w:lineRule="auto"/>
+        <w:ind w:firstLine="425"/>
+      </w:pPr>
+      <w:r>
+        <w:rPr>
+          <w:rFonts w:ascii="Times New Roman" w:hAnsi="Times New Roman"/>
+          <w:sz w:val="24"/>
+        </w:rPr>
+        <w:t>В иерархической архитектуре узлы делятся на группы — кластеры. В каждом кластере есть головной узел или кластерная голова, которая собирает данные от подчиненных узлов, агрегирует их и передает дальше координатору или базовой станции. Такой подход снижает объем трафика, упрощает управление и повышает энергоэффективность, но требует выбора и поддержания головных узлов.</w:t>
+      </w:r>
+    </w:p>
+    <w:p>
+      <w:pPr>
+        <w:spacing w:after="120" w:line="276" w:lineRule="auto"/>
+        <w:ind w:firstLine="425"/>
+      </w:pPr>
+      <w:r>
+        <w:rPr>
+          <w:rFonts w:ascii="Times New Roman" w:hAnsi="Times New Roman"/>
+          <w:sz w:val="24"/>
+        </w:rPr>
+        <w:t>По топологии БСС могут строиться как звезда, дерево, mesh-сеть или их комбинация. В топологии «звезда» все оконечные устройства общаются напрямую с координатором. Это просто, но ограничивает радиус сети и создает зависимость от центрального узла. В дереве данные передаются по иерархическим связям от узлов к родительским устройствам и далее к координатору. В mesh-топологии узлы могут иметь несколько маршрутов и пересылать сообщения друг через друга, что повышает устойчивость и зону покрытия.</w:t>
+      </w:r>
+    </w:p>
+    <w:p>
+      <w:pPr>
+        <w:spacing w:after="120" w:line="276" w:lineRule="auto"/>
+        <w:ind w:firstLine="425"/>
+      </w:pPr>
+      <w:r>
+        <w:rPr>
+          <w:rFonts w:ascii="Times New Roman" w:hAnsi="Times New Roman"/>
+          <w:sz w:val="24"/>
+        </w:rPr>
+        <w:t>Выбор архитектуры зависит от задачи. Для маленькой сети мониторинга помещения достаточно звезды. Для промышленной площадки, трубопровода или умного города больше подходят дерево или mesh, потому что они поддерживают расширение, обход отказавших узлов и многоскачковую передачу.</w:t>
+      </w:r>
+    </w:p>
+    <w:p>
+      <w:r>
+        <w:br w:type="page"/>
+      </w:r>
+    </w:p>
+    <w:p>
+      <w:pPr>
+        <w:pStyle w:val="Heading1"/>
+      </w:pPr>
+      <w:r>
+        <w:rPr>
+          <w:rFonts w:ascii="Times New Roman" w:hAnsi="Times New Roman"/>
+          <w:b/>
+          <w:sz w:val="28"/>
+        </w:rPr>
+        <w:t>32. Режимы работы БСС</w:t>
+      </w:r>
+    </w:p>
+    <w:p>
+      <w:pPr>
+        <w:spacing w:after="120" w:line="276" w:lineRule="auto"/>
+        <w:ind w:firstLine="425"/>
+      </w:pPr>
+      <w:r>
+        <w:rPr>
+          <w:rFonts w:ascii="Times New Roman" w:hAnsi="Times New Roman"/>
+          <w:sz w:val="24"/>
+        </w:rPr>
+        <w:t>Режим работы БСС определяет, когда узлы измеряют параметры, передают данные и переходят в энергосберегающий режим. Поскольку передача по радиоканалу является одной из самых энергозатратных операций, правильный режим работы напрямую влияет на срок службы сети.</w:t>
+      </w:r>
+    </w:p>
+    <w:p>
+      <w:pPr>
+        <w:spacing w:after="120" w:line="276" w:lineRule="auto"/>
+        <w:ind w:firstLine="425"/>
+      </w:pPr>
+      <w:r>
+        <w:rPr>
+          <w:rFonts w:ascii="Times New Roman" w:hAnsi="Times New Roman"/>
+          <w:sz w:val="24"/>
+        </w:rPr>
+        <w:t>Проактивные сети периодически включают сенсоры и передатчики, снимают показания и отправляют их на базовую станцию. Такой режим подходит для регулярного мониторинга температуры, влажности, давления, состояния оборудования или окружающей среды. Его плюс — предсказуемость и наличие полной временной картины; минус — расход энергии даже тогда, когда ничего важного не происходит.</w:t>
+      </w:r>
+    </w:p>
+    <w:p>
+      <w:pPr>
+        <w:spacing w:after="120" w:line="276" w:lineRule="auto"/>
+        <w:ind w:firstLine="425"/>
+      </w:pPr>
+      <w:r>
+        <w:rPr>
+          <w:rFonts w:ascii="Times New Roman" w:hAnsi="Times New Roman"/>
+          <w:sz w:val="24"/>
+        </w:rPr>
+        <w:t>Реактивные сети также могут периодически измерять параметры, но передают данные только при наступлении события или превышении порога. Например, датчик отправляет сообщение только при резком росте температуры, появлении вибрации или обнаружении движения. Такой режим экономит энергию и хорошо подходит для тревожных систем, но может давать меньше информации о нормальном состоянии среды.</w:t>
+      </w:r>
+    </w:p>
+    <w:p>
+      <w:pPr>
+        <w:spacing w:after="120" w:line="276" w:lineRule="auto"/>
+        <w:ind w:firstLine="425"/>
+      </w:pPr>
+      <w:r>
+        <w:rPr>
+          <w:rFonts w:ascii="Times New Roman" w:hAnsi="Times New Roman"/>
+          <w:sz w:val="24"/>
+        </w:rPr>
+        <w:t>Гибридные сети совмещают оба подхода: узлы периодически передают базовые данные и дополнительно реагируют на резкие изменения. Это компромисс между полнотой мониторинга и энергосбережением.</w:t>
+      </w:r>
+    </w:p>
+    <w:p>
+      <w:pPr>
+        <w:spacing w:after="120" w:line="276" w:lineRule="auto"/>
+        <w:ind w:firstLine="425"/>
+      </w:pPr>
+      <w:r>
+        <w:rPr>
+          <w:rFonts w:ascii="Times New Roman" w:hAnsi="Times New Roman"/>
+          <w:sz w:val="24"/>
+        </w:rPr>
+        <w:t>Кроме этого, узлы БСС часто используют циклы сна и активности. Радиомодуль и часть электроники отключаются, когда передача не нужна, затем узел просыпается по расписанию или событию. Такие режимы позволяют продлить работу от батареи на месяцы и годы, что особенно важно для труднодоступных объектов.</w:t>
+      </w:r>
+    </w:p>
+    <w:p>
+      <w:r>
+        <w:br w:type="page"/>
+      </w:r>
+    </w:p>
+    <w:p>
+      <w:pPr>
+        <w:pStyle w:val="Heading1"/>
+      </w:pPr>
+      <w:r>
+        <w:rPr>
+          <w:rFonts w:ascii="Times New Roman" w:hAnsi="Times New Roman"/>
+          <w:b/>
+          <w:sz w:val="28"/>
+        </w:rPr>
+        <w:t>33. Протоколы маршрутизации в БСС</w:t>
+      </w:r>
+    </w:p>
+    <w:p>
+      <w:pPr>
+        <w:spacing w:after="120" w:line="276" w:lineRule="auto"/>
+        <w:ind w:firstLine="425"/>
+      </w:pPr>
+      <w:r>
+        <w:rPr>
+          <w:rFonts w:ascii="Times New Roman" w:hAnsi="Times New Roman"/>
+          <w:sz w:val="24"/>
+        </w:rPr>
+        <w:t>Протоколы маршрутизации в беспроводных сенсорных сетях определяют, каким путем данные передаются от конечных узлов к координатору, базовой станции или другим узлам. В отличие от обычных сетей, маршрутизация в БСС должна учитывать ограниченную энергию, нестабильность радиоканала, спящие режимы и возможность отказа узлов.</w:t>
+      </w:r>
+    </w:p>
+    <w:p>
+      <w:pPr>
+        <w:spacing w:after="120" w:line="276" w:lineRule="auto"/>
+        <w:ind w:firstLine="425"/>
+      </w:pPr>
+      <w:r>
+        <w:rPr>
+          <w:rFonts w:ascii="Times New Roman" w:hAnsi="Times New Roman"/>
+          <w:sz w:val="24"/>
+        </w:rPr>
+        <w:t>Основные задачи маршрутизации: самоорганизация сети, самоконфигурирование и самовосстановление; адресация узлов и доставка пакетов; минимизация энергопотребления и увеличение времени жизни сети; сбор и агрегация данных; регулирование скорости передачи; расширение зоны покрытия; обеспечение качества обслуживания и защита от несанкционированного доступа.</w:t>
+      </w:r>
+    </w:p>
+    <w:p>
+      <w:pPr>
+        <w:spacing w:after="120" w:line="276" w:lineRule="auto"/>
+        <w:ind w:firstLine="425"/>
+      </w:pPr>
+      <w:r>
+        <w:rPr>
+          <w:rFonts w:ascii="Times New Roman" w:hAnsi="Times New Roman"/>
+          <w:sz w:val="24"/>
+        </w:rPr>
+        <w:t>При выборе маршрута могут использоваться разные метрики: число промежуточных переходов, надежность, задержка, пропускная способность, загрузка узлов, стоимость передачи, остаток энергии батареи. Например, самый короткий путь не всегда лучший: если один промежуточный узел почти разряжен, сеть может выбрать более длинный маршрут, чтобы не вывести его из строя.</w:t>
+      </w:r>
+    </w:p>
+    <w:p>
+      <w:pPr>
+        <w:spacing w:after="120" w:line="276" w:lineRule="auto"/>
+        <w:ind w:firstLine="425"/>
+      </w:pPr>
+      <w:r>
+        <w:rPr>
+          <w:rFonts w:ascii="Times New Roman" w:hAnsi="Times New Roman"/>
+          <w:sz w:val="24"/>
+        </w:rPr>
+        <w:t>Протоколы маршрутизации БСС часто классифицируют по структуре сети: плоские, иерархические и основанные на местоположении. Плоские протоколы предполагают равноправие узлов. Иерархические используют кластеры и головные узлы. Географические применяют координаты или относительное положение устройств.</w:t>
+      </w:r>
+    </w:p>
+    <w:p>
+      <w:pPr>
+        <w:spacing w:after="120" w:line="276" w:lineRule="auto"/>
+        <w:ind w:firstLine="425"/>
+      </w:pPr>
+      <w:r>
+        <w:rPr>
+          <w:rFonts w:ascii="Times New Roman" w:hAnsi="Times New Roman"/>
+          <w:sz w:val="24"/>
+        </w:rPr>
+        <w:t>Хороший протокол маршрутизации должен поддерживать работу в жестких условиях: помехи, потеря узлов, изменение топологии, ограниченная память и энергия. Поэтому в БСС маршрутизация тесно связана с энергосбережением и агрегацией данных.</w:t>
+      </w:r>
+    </w:p>
+    <w:tbl>
+      <w:tblPr>
+        <w:tblStyle w:val="TableGrid"/>
+        <w:tblW w:type="auto" w:w="0"/>
+        <w:tblLook w:firstColumn="1" w:firstRow="1" w:lastColumn="0" w:lastRow="0" w:noHBand="0" w:noVBand="1" w:val="04A0"/>
+      </w:tblPr>
+      <w:tblGrid>
+        <w:gridCol w:w="4986"/>
+        <w:gridCol w:w="4986"/>
+      </w:tblGrid>
+      <w:tr>
+        <w:tc>
+          <w:tcPr>
+            <w:tcW w:type="dxa" w:w="4986"/>
+          </w:tcPr>
+          <w:p>
+            <w:r>
+              <w:rPr>
+                <w:rFonts w:ascii="Times New Roman" w:hAnsi="Times New Roman"/>
+                <w:b/>
+                <w:sz w:val="22"/>
+              </w:rPr>
+              <w:t>Метрика маршрута</w:t>
+            </w:r>
+          </w:p>
+        </w:tc>
+        <w:tc>
+          <w:tcPr>
+            <w:tcW w:type="dxa" w:w="4986"/>
+          </w:tcPr>
+          <w:p>
+            <w:r>
+              <w:rPr>
+                <w:rFonts w:ascii="Times New Roman" w:hAnsi="Times New Roman"/>
+                <w:b/>
+                <w:sz w:val="22"/>
+              </w:rPr>
+              <w:t>Смысл</w:t>
+            </w:r>
+          </w:p>
+        </w:tc>
+      </w:tr>
+      <w:tr>
+        <w:tc>
+          <w:tcPr>
+            <w:tcW w:type="dxa" w:w="4986"/>
+          </w:tcPr>
+          <w:p>
+            <w:r>
+              <w:rPr>
+                <w:rFonts w:ascii="Times New Roman" w:hAnsi="Times New Roman"/>
+                <w:sz w:val="22"/>
+              </w:rPr>
+              <w:t>Длина пути</w:t>
+            </w:r>
+          </w:p>
+        </w:tc>
+        <w:tc>
+          <w:tcPr>
+            <w:tcW w:type="dxa" w:w="4986"/>
+          </w:tcPr>
+          <w:p>
+            <w:r>
+              <w:rPr>
+                <w:rFonts w:ascii="Times New Roman" w:hAnsi="Times New Roman"/>
+                <w:sz w:val="22"/>
+              </w:rPr>
+              <w:t>Количество промежуточных пересылок</w:t>
+            </w:r>
+          </w:p>
+        </w:tc>
+      </w:tr>
+      <w:tr>
+        <w:tc>
+          <w:tcPr>
+            <w:tcW w:type="dxa" w:w="4986"/>
+          </w:tcPr>
+          <w:p>
+            <w:r>
+              <w:rPr>
+                <w:rFonts w:ascii="Times New Roman" w:hAnsi="Times New Roman"/>
+                <w:sz w:val="22"/>
+              </w:rPr>
+              <w:t>Надежность</w:t>
+            </w:r>
+          </w:p>
+        </w:tc>
+        <w:tc>
+          <w:tcPr>
+            <w:tcW w:type="dxa" w:w="4986"/>
+          </w:tcPr>
+          <w:p>
+            <w:r>
+              <w:rPr>
+                <w:rFonts w:ascii="Times New Roman" w:hAnsi="Times New Roman"/>
+                <w:sz w:val="22"/>
+              </w:rPr>
+              <w:t>Вероятность успешной доставки данных</w:t>
+            </w:r>
+          </w:p>
+        </w:tc>
+      </w:tr>
+      <w:tr>
+        <w:tc>
+          <w:tcPr>
+            <w:tcW w:type="dxa" w:w="4986"/>
+          </w:tcPr>
+          <w:p>
+            <w:r>
+              <w:rPr>
+                <w:rFonts w:ascii="Times New Roman" w:hAnsi="Times New Roman"/>
+                <w:sz w:val="22"/>
+              </w:rPr>
+              <w:t>Задержка</w:t>
+            </w:r>
+          </w:p>
+        </w:tc>
+        <w:tc>
+          <w:tcPr>
+            <w:tcW w:type="dxa" w:w="4986"/>
+          </w:tcPr>
+          <w:p>
+            <w:r>
+              <w:rPr>
+                <w:rFonts w:ascii="Times New Roman" w:hAnsi="Times New Roman"/>
+                <w:sz w:val="22"/>
+              </w:rPr>
+              <w:t>Время доставки сообщения</w:t>
+            </w:r>
+          </w:p>
+        </w:tc>
+      </w:tr>
+      <w:tr>
+        <w:tc>
+          <w:tcPr>
+            <w:tcW w:type="dxa" w:w="4986"/>
+          </w:tcPr>
+          <w:p>
+            <w:r>
+              <w:rPr>
+                <w:rFonts w:ascii="Times New Roman" w:hAnsi="Times New Roman"/>
+                <w:sz w:val="22"/>
+              </w:rPr>
+              <w:t>Остаток энергии</w:t>
+            </w:r>
+          </w:p>
+        </w:tc>
+        <w:tc>
+          <w:tcPr>
+            <w:tcW w:type="dxa" w:w="4986"/>
+          </w:tcPr>
+          <w:p>
+            <w:r>
+              <w:rPr>
+                <w:rFonts w:ascii="Times New Roman" w:hAnsi="Times New Roman"/>
+                <w:sz w:val="22"/>
+              </w:rPr>
+              <w:t>Выбор маршрута с учетом заряда узлов</w:t>
+            </w:r>
+          </w:p>
+        </w:tc>
+      </w:tr>
+      <w:tr>
+        <w:tc>
+          <w:tcPr>
+            <w:tcW w:type="dxa" w:w="4986"/>
+          </w:tcPr>
+          <w:p>
+            <w:r>
+              <w:rPr>
+                <w:rFonts w:ascii="Times New Roman" w:hAnsi="Times New Roman"/>
+                <w:sz w:val="22"/>
+              </w:rPr>
+              <w:t>Загрузка</w:t>
+            </w:r>
+          </w:p>
+        </w:tc>
+        <w:tc>
+          <w:tcPr>
+            <w:tcW w:type="dxa" w:w="4986"/>
+          </w:tcPr>
+          <w:p>
+            <w:r>
+              <w:rPr>
+                <w:rFonts w:ascii="Times New Roman" w:hAnsi="Times New Roman"/>
+                <w:sz w:val="22"/>
+              </w:rPr>
+              <w:t>Избежание перегруженных промежуточных узлов</w:t>
+            </w:r>
+          </w:p>
+        </w:tc>
+      </w:tr>
+    </w:tbl>
+    <w:p/>
+    <w:p>
+      <w:r>
+        <w:br w:type="page"/>
+      </w:r>
+    </w:p>
+    <w:p>
+      <w:pPr>
+        <w:pStyle w:val="Heading1"/>
+      </w:pPr>
+      <w:r>
+        <w:rPr>
+          <w:rFonts w:ascii="Times New Roman" w:hAnsi="Times New Roman"/>
+          <w:b/>
+          <w:sz w:val="28"/>
+        </w:rPr>
+        <w:t>34. Мобильные БСС</w:t>
+      </w:r>
+    </w:p>
+    <w:p>
+      <w:pPr>
+        <w:spacing w:after="120" w:line="276" w:lineRule="auto"/>
+        <w:ind w:firstLine="425"/>
+      </w:pPr>
+      <w:r>
+        <w:rPr>
+          <w:rFonts w:ascii="Times New Roman" w:hAnsi="Times New Roman"/>
+          <w:sz w:val="24"/>
+        </w:rPr>
+        <w:t>Мобильные беспроводные сенсорные сети — это сети, в которых часть или все узлы могут перемещаться. Их развитие связано с MANET — мобильными самоорганизующимися сетями, где устройства независимо двигаются, устанавливают и разрывают соединения с соседями, а сеть не имеет жесткой фиксированной инфраструктуры.</w:t>
+      </w:r>
+    </w:p>
+    <w:p>
+      <w:pPr>
+        <w:spacing w:after="120" w:line="276" w:lineRule="auto"/>
+        <w:ind w:firstLine="425"/>
+      </w:pPr>
+      <w:r>
+        <w:rPr>
+          <w:rFonts w:ascii="Times New Roman" w:hAnsi="Times New Roman"/>
+          <w:sz w:val="24"/>
+        </w:rPr>
+        <w:t>Преимущество мобильных БСС — гибкость. Они позволяют быстро развернуть сеть в зоне аварии, на строительной площадке, в военной операции, на транспорте, в робототехнике или при мониторинге подвижных объектов. Передача данных на большие расстояния может выполняться без увеличения мощности передатчика за счет многоскачковой маршрутизации. Сеть способна реконфигурироваться при изменении условий и работать там, где нет готовой инфраструктуры.</w:t>
+      </w:r>
+    </w:p>
+    <w:p>
+      <w:pPr>
+        <w:spacing w:after="120" w:line="276" w:lineRule="auto"/>
+        <w:ind w:firstLine="425"/>
+      </w:pPr>
+      <w:r>
+        <w:rPr>
+          <w:rFonts w:ascii="Times New Roman" w:hAnsi="Times New Roman"/>
+          <w:sz w:val="24"/>
+        </w:rPr>
+        <w:t>Однако мобильность резко усложняет работу. Топология постоянно меняется, маршруты обрываются не только из-за помех или выключения узла, но и из-за перемещения устройств. Поэтому протоколы маршрутизации должны быстро обнаруживать новые пути, восстанавливать связь и учитывать скорость движения узлов.</w:t>
+      </w:r>
+    </w:p>
+    <w:p>
+      <w:pPr>
+        <w:spacing w:after="120" w:line="276" w:lineRule="auto"/>
+        <w:ind w:firstLine="425"/>
+      </w:pPr>
+      <w:r>
+        <w:rPr>
+          <w:rFonts w:ascii="Times New Roman" w:hAnsi="Times New Roman"/>
+          <w:sz w:val="24"/>
+        </w:rPr>
+        <w:t>Отдельный пример — VANET, сети транспортных средств. Автомобили могут обмениваться данными между собой и с придорожной инфраструктурой: предупреждать об авариях, пробках, опасных участках, получать информацию о сервисах, парковках и маршрутах. В таких сетях важны малые задержки и высокая надежность, потому что сообщения могут быть связаны с безопасностью движения.</w:t>
+      </w:r>
+    </w:p>
+    <w:p>
+      <w:pPr>
+        <w:spacing w:after="120" w:line="276" w:lineRule="auto"/>
+        <w:ind w:firstLine="425"/>
+      </w:pPr>
+      <w:r>
+        <w:rPr>
+          <w:rFonts w:ascii="Times New Roman" w:hAnsi="Times New Roman"/>
+          <w:sz w:val="24"/>
+        </w:rPr>
+        <w:t>Мобильные БСС особенно перспективны для IoT, где контролируемые объекты не всегда неподвижны: люди, транспорт, роботы, контейнеры, медицинские устройства и беспилотные системы.</w:t>
+      </w:r>
+    </w:p>
+    <w:p>
+      <w:r>
+        <w:br w:type="page"/>
+      </w:r>
+    </w:p>
+    <w:p>
+      <w:pPr>
+        <w:pStyle w:val="Heading1"/>
+      </w:pPr>
+      <w:r>
+        <w:rPr>
+          <w:rFonts w:ascii="Times New Roman" w:hAnsi="Times New Roman"/>
+          <w:b/>
+          <w:sz w:val="28"/>
+        </w:rPr>
+        <w:t>35. Сопряжение БСС с сетями общего пользования</w:t>
+      </w:r>
+    </w:p>
+    <w:p>
+      <w:pPr>
+        <w:spacing w:after="120" w:line="276" w:lineRule="auto"/>
+        <w:ind w:firstLine="425"/>
+      </w:pPr>
+      <w:r>
+        <w:rPr>
+          <w:rFonts w:ascii="Times New Roman" w:hAnsi="Times New Roman"/>
+          <w:sz w:val="24"/>
+        </w:rPr>
+        <w:t>Сопряжение БСС с сетями общего пользования нужно для того, чтобы данные сенсорной сети могли использоваться внешними приложениями, пользователями, облачными платформами и другими IP-сетями. Локальная БСС сама по себе часто работает на маломощных протоколах и не всегда напрямую совместима с Интернетом, поэтому требуется шлюз или специальный адаптационный протокол.</w:t>
+      </w:r>
+    </w:p>
+    <w:p>
+      <w:pPr>
+        <w:spacing w:after="120" w:line="276" w:lineRule="auto"/>
+        <w:ind w:firstLine="425"/>
+      </w:pPr>
+      <w:r>
+        <w:rPr>
+          <w:rFonts w:ascii="Times New Roman" w:hAnsi="Times New Roman"/>
+          <w:sz w:val="24"/>
+        </w:rPr>
+        <w:t>В материалах основным решением назван 6LoWPAN — IPv6 over Low power Wireless Personal Area Networks. Это технология передачи IPv6-пакетов поверх маломощных беспроводных персональных сетей, в частности IEEE 802.15.4. Она позволяет интегрировать сенсорные сети в семейство TCP/IP и взаимодействовать с другими IP-каналами и устройствами.</w:t>
+      </w:r>
+    </w:p>
+    <w:p>
+      <w:pPr>
+        <w:spacing w:after="120" w:line="276" w:lineRule="auto"/>
+        <w:ind w:firstLine="425"/>
+      </w:pPr>
+      <w:r>
+        <w:rPr>
+          <w:rFonts w:ascii="Times New Roman" w:hAnsi="Times New Roman"/>
+          <w:sz w:val="24"/>
+        </w:rPr>
+        <w:t>6LoWPAN важен потому, что обычный IPv6-пакет слишком велик для маломощных сетей IEEE 802.15.4. Поэтому протокол вводит адаптационный уровень: сжатие заголовков, фрагментацию, сборку пакетов и механизмы передачи, подходящие для ограниченных устройств. Благодаря этому сенсорные узлы могут получать адреса IPv6 и быть частью общей сетевой архитектуры.</w:t>
+      </w:r>
+    </w:p>
+    <w:p>
+      <w:pPr>
+        <w:spacing w:after="120" w:line="276" w:lineRule="auto"/>
+        <w:ind w:firstLine="425"/>
+      </w:pPr>
+      <w:r>
+        <w:rPr>
+          <w:rFonts w:ascii="Times New Roman" w:hAnsi="Times New Roman"/>
+          <w:sz w:val="24"/>
+        </w:rPr>
+        <w:t>В архитектуре 6LoWPAN выделяют оконечные узлы, маршрутизаторы и шлюзы, а также разные виды сетей: простая LoWPAN, расширенная LoWPAN и ad hoc LoWPAN. Простая сеть подключается к внешней сети через один шлюз, расширенная может иметь более сложную структуру, ad hoc может работать автономно без подключения к сети общего пользования.</w:t>
+      </w:r>
+    </w:p>
+    <w:p>
+      <w:pPr>
+        <w:spacing w:after="120" w:line="276" w:lineRule="auto"/>
+        <w:ind w:firstLine="425"/>
+      </w:pPr>
+      <w:r>
+        <w:rPr>
+          <w:rFonts w:ascii="Times New Roman" w:hAnsi="Times New Roman"/>
+          <w:sz w:val="24"/>
+        </w:rPr>
+        <w:t>Сопряжение БСС с ССОП превращает локальный мониторинг в полноценный IoT-сервис: данные доступны в облаке, на сервере предприятия, в мобильном приложении или городской платформе.</w:t>
+      </w:r>
+    </w:p>
+    <w:p>
+      <w:r>
+        <w:br w:type="page"/>
+      </w:r>
+    </w:p>
+    <w:p>
+      <w:pPr>
+        <w:pStyle w:val="Heading1"/>
+      </w:pPr>
+      <w:r>
+        <w:rPr>
+          <w:rFonts w:ascii="Times New Roman" w:hAnsi="Times New Roman"/>
+          <w:b/>
+          <w:sz w:val="28"/>
+        </w:rPr>
+        <w:t>36. Проблемы реализации БСС</w:t>
+      </w:r>
+    </w:p>
+    <w:p>
+      <w:pPr>
+        <w:spacing w:after="120" w:line="276" w:lineRule="auto"/>
+        <w:ind w:firstLine="425"/>
+      </w:pPr>
+      <w:r>
+        <w:rPr>
+          <w:rFonts w:ascii="Times New Roman" w:hAnsi="Times New Roman"/>
+          <w:sz w:val="24"/>
+        </w:rPr>
+        <w:t>Практическая реализация беспроводных сенсорных сетей связана с рядом ограничений. Первая и главная проблема — энергопотребление. Сенсорные узлы обычно работают от батарей, а заменить или зарядить их часто трудно или невозможно. Поэтому нужно минимизировать работу радиомодуля, использовать спящие режимы, выбирать энергоэффективные маршруты и выполнять только простую локальную обработку.</w:t>
+      </w:r>
+    </w:p>
+    <w:p>
+      <w:pPr>
+        <w:spacing w:after="120" w:line="276" w:lineRule="auto"/>
+        <w:ind w:firstLine="425"/>
+      </w:pPr>
+      <w:r>
+        <w:rPr>
+          <w:rFonts w:ascii="Times New Roman" w:hAnsi="Times New Roman"/>
+          <w:sz w:val="24"/>
+        </w:rPr>
+        <w:t>Вторая проблема — ограниченные вычислительные ресурсы. Узлы имеют малый объем памяти, слабые микроконтроллеры и ограниченную пропускную способность. Это усложняет использование сложных алгоритмов шифрования, обработки данных и маршрутизации.</w:t>
+      </w:r>
+    </w:p>
+    <w:p>
+      <w:pPr>
+        <w:spacing w:after="120" w:line="276" w:lineRule="auto"/>
+        <w:ind w:firstLine="425"/>
+      </w:pPr>
+      <w:r>
+        <w:rPr>
+          <w:rFonts w:ascii="Times New Roman" w:hAnsi="Times New Roman"/>
+          <w:sz w:val="24"/>
+        </w:rPr>
+        <w:t>Третья проблема — надежность радиосвязи. БСС часто работают в условиях помех, препятствий, отражений сигнала, влажности, металлоконструкций, движения объектов. Пакеты могут теряться, узлы — выходить из строя, а топология — меняться. Сеть должна уметь самоорганизовываться и восстанавливать маршруты.</w:t>
+      </w:r>
+    </w:p>
+    <w:p>
+      <w:pPr>
+        <w:spacing w:after="120" w:line="276" w:lineRule="auto"/>
+        <w:ind w:firstLine="425"/>
+      </w:pPr>
+      <w:r>
+        <w:rPr>
+          <w:rFonts w:ascii="Times New Roman" w:hAnsi="Times New Roman"/>
+          <w:sz w:val="24"/>
+        </w:rPr>
+        <w:t>Четвертая проблема — масштабируемость. При увеличении числа узлов растет объем трафика, вероятность коллизий, нагрузка на координатор и сложность управления адресами. Нужны эффективные протоколы доступа к среде, агрегации данных и маршрутизации.</w:t>
+      </w:r>
+    </w:p>
+    <w:p>
+      <w:pPr>
+        <w:spacing w:after="120" w:line="276" w:lineRule="auto"/>
+        <w:ind w:firstLine="425"/>
+      </w:pPr>
+      <w:r>
+        <w:rPr>
+          <w:rFonts w:ascii="Times New Roman" w:hAnsi="Times New Roman"/>
+          <w:sz w:val="24"/>
+        </w:rPr>
+        <w:t>Пятая проблема — безопасность. БСС часто развернуты в открытой среде, где злоумышленник может перехватывать радиосигналы, подменять узлы, отправлять ложные данные или выводить сеть из строя. Но сильная криптография требует ресурсов и энергии, которых у узлов мало.</w:t>
+      </w:r>
+    </w:p>
+    <w:p>
+      <w:pPr>
+        <w:spacing w:after="120" w:line="276" w:lineRule="auto"/>
+        <w:ind w:firstLine="425"/>
+      </w:pPr>
+      <w:r>
+        <w:rPr>
+          <w:rFonts w:ascii="Times New Roman" w:hAnsi="Times New Roman"/>
+          <w:sz w:val="24"/>
+        </w:rPr>
+        <w:t>Также существуют проблемы стоимости, стандартизации, обслуживания, размещения узлов, калибровки датчиков и интеграции с внешними системами. Поэтому проектирование БСС всегда является компромиссом между энергией, надежностью, ценой, дальностью, точностью и безопасностью.</w:t>
+      </w:r>
+    </w:p>
+    <w:p>
+      <w:r>
+        <w:br w:type="page"/>
+      </w:r>
+    </w:p>
+    <w:p>
+      <w:pPr>
+        <w:pStyle w:val="Heading1"/>
+      </w:pPr>
+      <w:r>
+        <w:rPr>
+          <w:rFonts w:ascii="Times New Roman" w:hAnsi="Times New Roman"/>
+          <w:b/>
+          <w:sz w:val="28"/>
+        </w:rPr>
+        <w:t>37. Электропитание узлов БСС от внешней среды</w:t>
+      </w:r>
+    </w:p>
+    <w:p>
+      <w:pPr>
+        <w:spacing w:after="120" w:line="276" w:lineRule="auto"/>
+        <w:ind w:firstLine="425"/>
+      </w:pPr>
+      <w:r>
+        <w:rPr>
+          <w:rFonts w:ascii="Times New Roman" w:hAnsi="Times New Roman"/>
+          <w:sz w:val="24"/>
+        </w:rPr>
+        <w:t>Длительная автономная работа — одно из главных требований к узлам БСС. Обычная батарея ограничивает срок службы сети и усложняет обслуживание, особенно если датчики расположены в труднодоступных местах: внутри конструкций, на трубопроводах, в лесу, на мостах, в медицинских имплантах или промышленном оборудовании. Поэтому важное направление развития — получение энергии из окружающей среды, или energy harvesting.</w:t>
+      </w:r>
+    </w:p>
+    <w:p>
+      <w:pPr>
+        <w:spacing w:after="120" w:line="276" w:lineRule="auto"/>
+        <w:ind w:firstLine="425"/>
+      </w:pPr>
+      <w:r>
+        <w:rPr>
+          <w:rFonts w:ascii="Times New Roman" w:hAnsi="Times New Roman"/>
+          <w:sz w:val="24"/>
+        </w:rPr>
+        <w:t>В материалах выделены четыре основных источника энергии окружающей среды. Первый — механическая энергия: вибрации, деформации, движение. Она может преобразовываться пьезоэлектрическими или электромагнитными генераторами. Второй — тепловая энергия: разность температур или тепловые изменения, которые можно использовать с помощью термоэлектрических преобразователей. Третий — энергия излучения: солнечный свет, инфракрасное излучение, радиочастотные сигналы. Четвертый — химическая и биохимическая энергия.</w:t>
+      </w:r>
+    </w:p>
+    <w:p>
+      <w:pPr>
+        <w:spacing w:after="120" w:line="276" w:lineRule="auto"/>
+        <w:ind w:firstLine="425"/>
+      </w:pPr>
+      <w:r>
+        <w:rPr>
+          <w:rFonts w:ascii="Times New Roman" w:hAnsi="Times New Roman"/>
+          <w:sz w:val="24"/>
+        </w:rPr>
+        <w:t>Использование внешней энергии не отменяет необходимости экономии. Мощность таких источников часто мала и нестабильна, поэтому узел должен работать импульсно: накапливать энергию в аккумуляторе или суперконденсаторе, просыпаться, измерять параметр, передавать данные и снова переходить в сон.</w:t>
+      </w:r>
+    </w:p>
+    <w:p>
+      <w:pPr>
+        <w:spacing w:after="120" w:line="276" w:lineRule="auto"/>
+        <w:ind w:firstLine="425"/>
+      </w:pPr>
+      <w:r>
+        <w:rPr>
+          <w:rFonts w:ascii="Times New Roman" w:hAnsi="Times New Roman"/>
+          <w:sz w:val="24"/>
+        </w:rPr>
+        <w:t>Преимущество energy harvesting — возможность создать автономные беспроводные сенсорные сети с очень большим, теоретически почти неограниченным сроком службы. Это особенно важно для IoT, где количество устройств огромно, а ручное обслуживание каждого датчика экономически невозможно.</w:t>
+      </w:r>
+    </w:p>
+    <w:p>
+      <w:pPr>
+        <w:spacing w:after="120" w:line="276" w:lineRule="auto"/>
+        <w:ind w:firstLine="425"/>
+      </w:pPr>
+      <w:r>
+        <w:rPr>
+          <w:rFonts w:ascii="Times New Roman" w:hAnsi="Times New Roman"/>
+          <w:sz w:val="24"/>
+        </w:rPr>
+        <w:t>На практике выбор источника зависит от среды: на улице удобно использовать солнечную энергию, на машинах — вибрации, на трубопроводах и двигателях — тепловые перепады, в медицинских системах — биохимические процессы. Перспективы этого направления связаны с развитием энергоэффективной электроники, микрогенераторов и интеллектуальных режимов питания.</w:t>
+      </w:r>
+    </w:p>
+    <w:p>
+      <w:r>
+        <w:br w:type="page"/>
+      </w:r>
+    </w:p>
+    <w:p>
+      <w:pPr>
+        <w:pStyle w:val="Heading1"/>
+      </w:pPr>
+      <w:r>
+        <w:rPr>
+          <w:rFonts w:ascii="Times New Roman" w:hAnsi="Times New Roman"/>
+          <w:b/>
+          <w:sz w:val="28"/>
+        </w:rPr>
+        <w:t>38. БСС и Интернет вещей</w:t>
+      </w:r>
+    </w:p>
+    <w:p>
+      <w:pPr>
+        <w:spacing w:after="120" w:line="276" w:lineRule="auto"/>
+        <w:ind w:firstLine="425"/>
+      </w:pPr>
+      <w:r>
+        <w:rPr>
+          <w:rFonts w:ascii="Times New Roman" w:hAnsi="Times New Roman"/>
+          <w:sz w:val="24"/>
+        </w:rPr>
+        <w:t>Беспроводные сенсорные сети являются одной из базовых технологий Интернета вещей. Именно они обеспечивают массовый сбор данных с физических объектов и окружающей среды: температуры, давления, влажности, движения, вибрации, состояния конструкций, параметров здоровья, положения объектов и других характеристик.</w:t>
+      </w:r>
+    </w:p>
+    <w:p>
+      <w:pPr>
+        <w:spacing w:after="120" w:line="276" w:lineRule="auto"/>
+        <w:ind w:firstLine="425"/>
+      </w:pPr>
+      <w:r>
+        <w:rPr>
+          <w:rFonts w:ascii="Times New Roman" w:hAnsi="Times New Roman"/>
+          <w:sz w:val="24"/>
+        </w:rPr>
+        <w:t>БСС хорошо подходят для IoT благодаря нескольким свойствам: миниатюрность узлов, низкое энергопотребление, встроенный радиоинтерфейс, достаточная вычислительная мощность, сравнительно невысокая стоимость и возможность самоорганизации. Благодаря этому их можно разворачивать там, где прокладка проводов невозможна, слишком дорога или неудобна.</w:t>
+      </w:r>
+    </w:p>
+    <w:p>
+      <w:pPr>
+        <w:spacing w:after="120" w:line="276" w:lineRule="auto"/>
+        <w:ind w:firstLine="425"/>
+      </w:pPr>
+      <w:r>
+        <w:rPr>
+          <w:rFonts w:ascii="Times New Roman" w:hAnsi="Times New Roman"/>
+          <w:sz w:val="24"/>
+        </w:rPr>
+        <w:t>В IoT БСС применяются для мониторинга телекоммуникационной инфраструктуры, железных дорог, метрополитена, нефте- и газопроводов, инженерных сетей, транспортных потоков, окружающей среды, биологических и медицинских параметров, систем умного дома и предупреждения чрезвычайных ситуаций. Например, сеть датчиков вдоль трубопровода может обнаружить утечку, а сеть сейсмических датчиков — предупредить о природной опасности.</w:t>
+      </w:r>
+    </w:p>
+    <w:p>
+      <w:pPr>
+        <w:spacing w:after="120" w:line="276" w:lineRule="auto"/>
+        <w:ind w:firstLine="425"/>
+      </w:pPr>
+      <w:r>
+        <w:rPr>
+          <w:rFonts w:ascii="Times New Roman" w:hAnsi="Times New Roman"/>
+          <w:sz w:val="24"/>
+        </w:rPr>
+        <w:t>С точки зрения архитектуры IoT БСС занимают нижний уровень — уровень сенсоров и сенсорных сетей. Они собирают первичные данные и через шлюзы передают их на сетевой, сервисный и прикладной уровни. Там данные хранятся, анализируются, визуализируются и используются для принятия решений.</w:t>
+      </w:r>
+    </w:p>
+    <w:p>
+      <w:pPr>
+        <w:spacing w:after="120" w:line="276" w:lineRule="auto"/>
+        <w:ind w:firstLine="425"/>
+      </w:pPr>
+      <w:r>
+        <w:rPr>
+          <w:rFonts w:ascii="Times New Roman" w:hAnsi="Times New Roman"/>
+          <w:sz w:val="24"/>
+        </w:rPr>
+        <w:t>Связь БСС и IoT двусторонняя. С одной стороны, БСС дают IoT «органы чувств». С другой стороны, IoT предоставляет БСС глобальную интеграцию: облака, большие данные, приложения, пользовательские интерфейсы, управление и безопасность. Поэтому без сенсорных сетей многие сценарии Интернета вещей — умный город, умная энергетика, промышленный мониторинг, медицина — были бы невозможны.</w:t>
+      </w:r>
+    </w:p>
+    <w:p>
+      <w:r>
+        <w:br w:type="page"/>
+      </w:r>
+    </w:p>
+    <w:p>
+      <w:pPr>
+        <w:pStyle w:val="Heading1"/>
+      </w:pPr>
+      <w:r>
+        <w:rPr>
+          <w:rFonts w:ascii="Times New Roman" w:hAnsi="Times New Roman"/>
+          <w:b/>
+          <w:sz w:val="28"/>
+        </w:rPr>
+        <w:t>39. Общие принципы М2М</w:t>
+      </w:r>
+    </w:p>
+    <w:p>
+      <w:pPr>
+        <w:spacing w:after="120" w:line="276" w:lineRule="auto"/>
+        <w:ind w:firstLine="425"/>
+      </w:pPr>
+      <w:r>
+        <w:rPr>
+          <w:rFonts w:ascii="Times New Roman" w:hAnsi="Times New Roman"/>
+          <w:sz w:val="24"/>
+        </w:rPr>
+        <w:t>M2M, или Machine-to-Machine, — это межмашинное взаимодействие, при котором устройства автоматически обмениваются информацией друг с другом или передают ее в одну сторону без непосредственного участия человека. В материалах подчеркивается, что более точным было бы выражение «машина — коммуникационная сеть — машина», потому что между устройствами обычно находится канал связи.</w:t>
+      </w:r>
+    </w:p>
+    <w:p>
+      <w:pPr>
+        <w:spacing w:after="120" w:line="276" w:lineRule="auto"/>
+        <w:ind w:firstLine="425"/>
+      </w:pPr>
+      <w:r>
+        <w:rPr>
+          <w:rFonts w:ascii="Times New Roman" w:hAnsi="Times New Roman"/>
+          <w:sz w:val="24"/>
+        </w:rPr>
+        <w:t>Базовая схема M2M состоит из трех элементов. Устройство A собирает данные: например, счетчик электроэнергии, датчик температуры, промышленный контроллер или транспортный трекер. Канал связи B передает эти данные по проводной или беспроводной сети. Устройство или система C принимает информацию, анализирует ее, хранит результат и при необходимости формирует управляющие команды обратно устройству A.</w:t>
+      </w:r>
+    </w:p>
+    <w:p>
+      <w:pPr>
+        <w:spacing w:after="120" w:line="276" w:lineRule="auto"/>
+        <w:ind w:firstLine="425"/>
+      </w:pPr>
+      <w:r>
+        <w:rPr>
+          <w:rFonts w:ascii="Times New Roman" w:hAnsi="Times New Roman"/>
+          <w:sz w:val="24"/>
+        </w:rPr>
+        <w:t>M2M может использовать разные сети: сотовые, локальные, персональные, промышленные, спутниковые, проводные и беспроводные. Его цель — автоматизировать процессы, где человеку не нужно постоянно участвовать в обмене данными. Примеры: передача показаний счетчиков, удаленная диагностика оборудования, контроль транспорта, мониторинг банкоматов, промышленная телеметрия, охранные системы, медицинские устройства.</w:t>
+      </w:r>
+    </w:p>
+    <w:p>
+      <w:pPr>
+        <w:spacing w:after="120" w:line="276" w:lineRule="auto"/>
+        <w:ind w:firstLine="425"/>
+      </w:pPr>
+      <w:r>
+        <w:rPr>
+          <w:rFonts w:ascii="Times New Roman" w:hAnsi="Times New Roman"/>
+          <w:sz w:val="24"/>
+        </w:rPr>
+        <w:t>Преимущества M2M — снижение затрат на ручной контроль, оперативное получение данных, возможность удаленного управления, подключение подвижных объектов и работа там, где провода невозможны или неудобны. M2M является важнейшей составляющей IoT: если IoT шире и включает сервисы, приложения, идентификацию, аналитику и пользовательские сценарии, то M2M описывает автоматический обмен между техническими устройствами как фундамент этой инфраструктуры.</w:t>
+      </w:r>
+    </w:p>
+    <w:p>
+      <w:r>
+        <w:br w:type="page"/>
+      </w:r>
+    </w:p>
+    <w:p>
+      <w:pPr>
+        <w:pStyle w:val="Heading1"/>
+      </w:pPr>
+      <w:r>
+        <w:rPr>
+          <w:rFonts w:ascii="Times New Roman" w:hAnsi="Times New Roman"/>
+          <w:b/>
+          <w:sz w:val="28"/>
+        </w:rPr>
+        <w:t>40. Стандартизация М2М</w:t>
+      </w:r>
+    </w:p>
+    <w:p>
+      <w:pPr>
+        <w:spacing w:after="120" w:line="276" w:lineRule="auto"/>
+        <w:ind w:firstLine="425"/>
+      </w:pPr>
+      <w:r>
+        <w:rPr>
+          <w:rFonts w:ascii="Times New Roman" w:hAnsi="Times New Roman"/>
+          <w:sz w:val="24"/>
+        </w:rPr>
+        <w:t>Стандартизация M2M нужна для того, чтобы устройства, шлюзы, сети и приложения разных производителей могли работать совместно. Межмашинные коммуникации являются важной частью IoT, поэтому их стандартизацией занимаются многие организации. В материалах указано, что прямо или косвенно в этом процессе участвуют более 140 организаций.</w:t>
+      </w:r>
+    </w:p>
+    <w:p>
+      <w:pPr>
+        <w:spacing w:after="120" w:line="276" w:lineRule="auto"/>
+        <w:ind w:firstLine="425"/>
+      </w:pPr>
+      <w:r>
+        <w:rPr>
+          <w:rFonts w:ascii="Times New Roman" w:hAnsi="Times New Roman"/>
+          <w:sz w:val="24"/>
+        </w:rPr>
+        <w:t>Одну из ключевых ролей играет ETSI. В 2007 году технический комитет ETSI подготовил документы по применению M2M в электронном здравоохранении, интеллектуальных счетчиках, потребительских системах, а также по терминам, требованиям к услугам и функциональной архитектуре сети M2M. По версии ETSI, M2M — это симбиоз телекоммуникационных и информационных технологий для автоматизации бизнес-процессов и создания услуг с добавленной стоимостью, направленных на управление информационными и технологическими процессами.</w:t>
+      </w:r>
+    </w:p>
+    <w:p>
+      <w:pPr>
+        <w:spacing w:after="120" w:line="276" w:lineRule="auto"/>
+        <w:ind w:firstLine="425"/>
+      </w:pPr>
+      <w:r>
+        <w:rPr>
+          <w:rFonts w:ascii="Times New Roman" w:hAnsi="Times New Roman"/>
+          <w:sz w:val="24"/>
+        </w:rPr>
+        <w:t>Функциональная архитектура ETSI TS 102 690 делит M2M на два домена: домен устройств и шлюзов и сетевой домен. В домене устройств находятся M2M-устройства, шлюзы и сети доступа. Устройство M2M поддерживает приложения и может подключаться к сетевому домену напрямую или через шлюз. Шлюз выполняет роль посредника и прокси-сервера, обеспечивая регистрацию, аутентификацию, авторизацию, управление и инициализацию.</w:t>
+      </w:r>
+    </w:p>
+    <w:p>
+      <w:pPr>
+        <w:spacing w:after="120" w:line="276" w:lineRule="auto"/>
+        <w:ind w:firstLine="425"/>
+      </w:pPr>
+      <w:r>
+        <w:rPr>
+          <w:rFonts w:ascii="Times New Roman" w:hAnsi="Times New Roman"/>
+          <w:sz w:val="24"/>
+        </w:rPr>
+        <w:t>Сеть доступа M2M связывает устройства и шлюзы. Примеры таких сетей — PAN, ZigBee, Bluetooth, IEEE 802.15.1, IETF ROLL, ISA100.11a, PLC, MBUS, Wireless M-BUS, KNX и другие. Сетевой домен предоставляет транспорт, сервисные возможности, управление, безопасность и связь с приложениями.</w:t>
+      </w:r>
+    </w:p>
+    <w:p>
+      <w:pPr>
+        <w:spacing w:after="120" w:line="276" w:lineRule="auto"/>
+        <w:ind w:firstLine="425"/>
+      </w:pPr>
+      <w:r>
+        <w:rPr>
+          <w:rFonts w:ascii="Times New Roman" w:hAnsi="Times New Roman"/>
+          <w:sz w:val="24"/>
+        </w:rPr>
+        <w:t>Стандартизация M2M важна для масштабируемости IoT: без единых архитектур и интерфейсов каждая система стала бы закрытым решением. Стандарты позволяют подключать новые устройства, управлять ими, обеспечивать безопасность и интегрировать M2M-сервисы с корпоративными и облачными платформами.</w:t>
+      </w:r>
+    </w:p>
+    <w:p>
+      <w:r>
+        <w:br w:type="page"/>
+      </w:r>
+    </w:p>
+    <w:p>
+      <w:pPr>
         <w:pStyle w:val="Heading1"/>
       </w:pPr>
       <w:r>
@@ -1599,6 +3727,18 @@
           <w:sz w:val="24"/>
         </w:rPr>
         <w:t>source/Лекция №1.pptx</w:t>
+      </w:r>
+    </w:p>
+    <w:p>
+      <w:pPr>
+        <w:pStyle w:val="ListBullet"/>
+      </w:pPr>
+      <w:r>
+        <w:rPr>
+          <w:rFonts w:ascii="Times New Roman" w:hAnsi="Times New Roman"/>
+          <w:sz w:val="24"/>
+        </w:rPr>
+        <w:t>source/Лекция №2.pptx</w:t>
       </w:r>
     </w:p>
     <w:p>

</xml_diff>

<commit_message>
Add answers for exam questions 41-60
</commit_message>
<xml_diff>
--- a/answers_first_20.docx
+++ b/answers_first_20.docx
@@ -3681,6 +3681,25 @@
       </w:r>
     </w:p>
     <w:p>
+      <w:r>
+        <w:br w:type="page"/>
+      </w:r>
+    </w:p>
+    <w:p>
+      <w:pPr>
+        <w:jc w:val="center"/>
+      </w:pPr>
+      <w:r>
+        <w:rPr>
+          <w:rFonts w:ascii="Times New Roman" w:hAnsi="Times New Roman"/>
+          <w:b/>
+          <w:sz w:val="32"/>
+        </w:rPr>
+        <w:t>Продолжение: вопросы 41–60</w:t>
+      </w:r>
+    </w:p>
+    <w:p/>
+    <w:p>
       <w:pPr>
         <w:pStyle w:val="Heading1"/>
       </w:pPr>
@@ -3690,6 +3709,2292 @@
           <w:b/>
           <w:sz w:val="28"/>
         </w:rPr>
+        <w:t>41. Коммуникации малого радиуса действия NFC</w:t>
+      </w:r>
+    </w:p>
+    <w:p>
+      <w:pPr>
+        <w:spacing w:after="120" w:line="276" w:lineRule="auto"/>
+        <w:ind w:firstLine="425"/>
+      </w:pPr>
+      <w:r>
+        <w:rPr>
+          <w:rFonts w:ascii="Times New Roman" w:hAnsi="Times New Roman"/>
+          <w:sz w:val="24"/>
+        </w:rPr>
+        <w:t>NFC (Near Field Communication) — технология беспроводной связи малого радиуса действия, предназначенная для обмена данными между устройствами, расположенными очень близко друг к другу. В лекционных материалах NFC описана как совместная разработка NXP Semiconductor и Sony, объединяющая возможности бесконтактных смарт-карт, RFID-считывателя и устройства связи в одном интерфейсе.</w:t>
+      </w:r>
+    </w:p>
+    <w:p>
+      <w:pPr>
+        <w:spacing w:after="120" w:line="276" w:lineRule="auto"/>
+        <w:ind w:firstLine="425"/>
+      </w:pPr>
+      <w:r>
+        <w:rPr>
+          <w:rFonts w:ascii="Times New Roman" w:hAnsi="Times New Roman"/>
+          <w:sz w:val="24"/>
+        </w:rPr>
+        <w:t>Главная особенность NFC — простота взаимодействия: пользователю достаточно поднести телефон, карту, метку или другое устройство к считывателю. Технология совместима с инфраструктурой бесконтактных карт ISO 14443, уже применяемой в транспорте и платежных системах. Поэтому NFC получила широкое распространение в мобильных телефонах, банковских картах, электронных билетах, пропусках и системах доступа.</w:t>
+      </w:r>
+    </w:p>
+    <w:p>
+      <w:pPr>
+        <w:spacing w:after="120" w:line="276" w:lineRule="auto"/>
+        <w:ind w:firstLine="425"/>
+      </w:pPr>
+      <w:r>
+        <w:rPr>
+          <w:rFonts w:ascii="Times New Roman" w:hAnsi="Times New Roman"/>
+          <w:sz w:val="24"/>
+        </w:rPr>
+        <w:t>NFC может использоваться для передачи небольших объемов данных: номеров телефонов, ссылок, изображений, ключей цифровой авторизации, параметров подключения. В IoT NFC часто применяют как удобный способ начальной настройки устройства: пользователь подносит смартфон к датчику или контроллеру и передает Wi‑Fi-параметры, ключ доступа или идентификатор сервиса.</w:t>
+      </w:r>
+    </w:p>
+    <w:p>
+      <w:pPr>
+        <w:spacing w:after="120" w:line="276" w:lineRule="auto"/>
+        <w:ind w:firstLine="425"/>
+      </w:pPr>
+      <w:r>
+        <w:rPr>
+          <w:rFonts w:ascii="Times New Roman" w:hAnsi="Times New Roman"/>
+          <w:sz w:val="24"/>
+        </w:rPr>
+        <w:t>Технология работает на очень малом расстоянии, что одновременно является ограничением и преимуществом безопасности: случайное подключение менее вероятно, чем у дальнодействующих радиотехнологий. Типовые сценарии — бесконтактная оплата, электронный замок, транспортная карта, идентификация пользователя, считывание сервисной информации с оборудования. В контексте IoT NFC не заменяет ZigBee, Wi‑Fi или сотовую связь, а решает задачи быстрого локального обмена, авторизации и связывания физического объекта с цифровым сервисом.</w:t>
+      </w:r>
+    </w:p>
+    <w:p>
+      <w:r>
+        <w:br w:type="page"/>
+      </w:r>
+    </w:p>
+    <w:p>
+      <w:pPr>
+        <w:pStyle w:val="Heading1"/>
+      </w:pPr>
+      <w:r>
+        <w:rPr>
+          <w:rFonts w:ascii="Times New Roman" w:hAnsi="Times New Roman"/>
+          <w:b/>
+          <w:sz w:val="28"/>
+        </w:rPr>
+        <w:t>42. Промышленные сети для реализации М2М</w:t>
+      </w:r>
+    </w:p>
+    <w:p>
+      <w:pPr>
+        <w:spacing w:after="120" w:line="276" w:lineRule="auto"/>
+        <w:ind w:firstLine="425"/>
+      </w:pPr>
+      <w:r>
+        <w:rPr>
+          <w:rFonts w:ascii="Times New Roman" w:hAnsi="Times New Roman"/>
+          <w:sz w:val="24"/>
+        </w:rPr>
+        <w:t>Промышленная сеть — это комплекс оборудования и программного обеспечения, обеспечивающий обмен информацией между датчиками, исполнительными механизмами, промышленными контроллерами и системами верхнего уровня в автоматизированной системе управления. В зарубежной терминологии часто используется слово Fieldbus — «полевая шина».</w:t>
+      </w:r>
+    </w:p>
+    <w:p>
+      <w:pPr>
+        <w:spacing w:after="120" w:line="276" w:lineRule="auto"/>
+        <w:ind w:firstLine="425"/>
+      </w:pPr>
+      <w:r>
+        <w:rPr>
+          <w:rFonts w:ascii="Times New Roman" w:hAnsi="Times New Roman"/>
+          <w:sz w:val="24"/>
+        </w:rPr>
+        <w:t>Промышленные сети являются основой распределенных систем сбора данных и управления на предприятиях. Они применяются для передачи данных между датчиками, ПЛК и исполнительными механизмами, диагностики и удаленного конфигурирования устройств, калибровки датчиков, питания полевых устройств, связи с SCADA/АСУ ТП и интеграции с корпоративными сетями.</w:t>
+      </w:r>
+    </w:p>
+    <w:p>
+      <w:pPr>
+        <w:spacing w:after="120" w:line="276" w:lineRule="auto"/>
+        <w:ind w:firstLine="425"/>
+      </w:pPr>
+      <w:r>
+        <w:rPr>
+          <w:rFonts w:ascii="Times New Roman" w:hAnsi="Times New Roman"/>
+          <w:sz w:val="24"/>
+        </w:rPr>
+        <w:t>В отличие от обычных офисных сетей, промышленные сети должны работать в жестких условиях: электромагнитные помехи, вибрации, пыль, влажность, высокие и низкие температуры, необходимость гарантированных задержек и высокой надежности. Поэтому для них важны детерминированность обмена, отказоустойчивость, предсказуемое время реакции и поддержка реального времени.</w:t>
+      </w:r>
+    </w:p>
+    <w:p>
+      <w:pPr>
+        <w:spacing w:after="120" w:line="276" w:lineRule="auto"/>
+        <w:ind w:firstLine="425"/>
+      </w:pPr>
+      <w:r>
+        <w:rPr>
+          <w:rFonts w:ascii="Times New Roman" w:hAnsi="Times New Roman"/>
+          <w:sz w:val="24"/>
+        </w:rPr>
+        <w:t>Для M2M промышленные сети особенно важны, потому что они обеспечивают автоматический обмен между «машинами» без участия человека. Например, датчик давления передает данные контроллеру, контроллер управляет клапаном, а система верхнего уровня получает телеметрию и диагностические сообщения. В современных решениях промышленные сети могут взаимодействовать с Ethernet, IP-сетями и Интернетом, что позволяет включать производственное оборудование в IoT/IIoT-платформы. Примеры промышленных сетей и технологий: Modbus, Profibus, Profinet, CAN, HART, WirelessHART, ISA100.11a, Industrial Ethernet.</w:t>
+      </w:r>
+    </w:p>
+    <w:p>
+      <w:r>
+        <w:br w:type="page"/>
+      </w:r>
+    </w:p>
+    <w:p>
+      <w:pPr>
+        <w:pStyle w:val="Heading1"/>
+      </w:pPr>
+      <w:r>
+        <w:rPr>
+          <w:rFonts w:ascii="Times New Roman" w:hAnsi="Times New Roman"/>
+          <w:b/>
+          <w:sz w:val="28"/>
+        </w:rPr>
+        <w:t>43. Современное состояние и перспективы применения М2М</w:t>
+      </w:r>
+    </w:p>
+    <w:p>
+      <w:pPr>
+        <w:spacing w:after="120" w:line="276" w:lineRule="auto"/>
+        <w:ind w:firstLine="425"/>
+      </w:pPr>
+      <w:r>
+        <w:rPr>
+          <w:rFonts w:ascii="Times New Roman" w:hAnsi="Times New Roman"/>
+          <w:sz w:val="24"/>
+        </w:rPr>
+        <w:t>M2M остается одним из ключевых направлений развития IoT, потому что именно межмашинный обмен лежит в основе автоматизации учета, мониторинга, диагностики и управления. В материалах отмечается, что рынок M2M-оборудования имеет большой потенциал, а сами системы становятся более интеллектуальными и применяются все шире.</w:t>
+      </w:r>
+    </w:p>
+    <w:p>
+      <w:pPr>
+        <w:spacing w:after="120" w:line="276" w:lineRule="auto"/>
+        <w:ind w:firstLine="425"/>
+      </w:pPr>
+      <w:r>
+        <w:rPr>
+          <w:rFonts w:ascii="Times New Roman" w:hAnsi="Times New Roman"/>
+          <w:sz w:val="24"/>
+        </w:rPr>
+        <w:t>Рост M2M стал возможен благодаря снижению стоимости беспроводных модулей, повышению их производительности и поддержке разных технологий связи: GSM/GPRS, GPS, Bluetooth, ZigBee и других. Возможность управлять удаленными устройствами по беспроводному каналу уменьшает зависимость от местоположения объекта и позволяет контролировать подвижные или распределенные системы.</w:t>
+      </w:r>
+    </w:p>
+    <w:p>
+      <w:pPr>
+        <w:spacing w:after="120" w:line="276" w:lineRule="auto"/>
+        <w:ind w:firstLine="425"/>
+      </w:pPr>
+      <w:r>
+        <w:rPr>
+          <w:rFonts w:ascii="Times New Roman" w:hAnsi="Times New Roman"/>
+          <w:sz w:val="24"/>
+        </w:rPr>
+        <w:t>Современные области применения M2M — охранные и противоугонные системы, мониторинг транспорта, телеметрия, умные счетчики, банкоматы и платежные терминалы, промышленная автоматика, медицина, сельское хозяйство и энергетика. Например, при попытке угона автомобиля сигнал автоматически передается на диспетчерский пульт и владельцу. В промышленности оборудование может само сообщать о перегреве, вибрации или необходимости обслуживания.</w:t>
+      </w:r>
+    </w:p>
+    <w:p>
+      <w:pPr>
+        <w:spacing w:after="120" w:line="276" w:lineRule="auto"/>
+        <w:ind w:firstLine="425"/>
+      </w:pPr>
+      <w:r>
+        <w:rPr>
+          <w:rFonts w:ascii="Times New Roman" w:hAnsi="Times New Roman"/>
+          <w:sz w:val="24"/>
+        </w:rPr>
+        <w:t>Перспективы M2M связаны с переходом от простого «датчик отправил SMS» к полноценным платформам аналитики и управления. Устройства будут не только передавать события, но и участвовать в сложных сценариях: предиктивное обслуживание, автоматическая логистика, удаленная диагностика, управление энергетикой, интеллектуальный транспорт. В рамках IoT M2M постепенно объединяется с облаками, туманными вычислениями, Big Data и искусственным интеллектом. Главные ограничения — безопасность, стандартизация, совместимость устройств и экономическая целесообразность внедрения.</w:t>
+      </w:r>
+    </w:p>
+    <w:p>
+      <w:r>
+        <w:br w:type="page"/>
+      </w:r>
+    </w:p>
+    <w:p>
+      <w:pPr>
+        <w:pStyle w:val="Heading1"/>
+      </w:pPr>
+      <w:r>
+        <w:rPr>
+          <w:rFonts w:ascii="Times New Roman" w:hAnsi="Times New Roman"/>
+          <w:b/>
+          <w:sz w:val="28"/>
+        </w:rPr>
+        <w:t>44. Классификация технологий передачи данных в IoT</w:t>
+      </w:r>
+    </w:p>
+    <w:p>
+      <w:pPr>
+        <w:spacing w:after="120" w:line="276" w:lineRule="auto"/>
+        <w:ind w:firstLine="425"/>
+      </w:pPr>
+      <w:r>
+        <w:rPr>
+          <w:rFonts w:ascii="Times New Roman" w:hAnsi="Times New Roman"/>
+          <w:sz w:val="24"/>
+        </w:rPr>
+        <w:t>IoT использует множество технологий связи, потому что задачи отличаются по дальности, скорости, энергопотреблению, стоимости, мобильности и требованиям надежности. В материалах выделяется классификация по территории охвата: BAN, PAN, LAN и WAN.</w:t>
+      </w:r>
+    </w:p>
+    <w:p>
+      <w:pPr>
+        <w:spacing w:after="120" w:line="276" w:lineRule="auto"/>
+        <w:ind w:firstLine="425"/>
+      </w:pPr>
+      <w:r>
+        <w:rPr>
+          <w:rFonts w:ascii="Times New Roman" w:hAnsi="Times New Roman"/>
+          <w:sz w:val="24"/>
+        </w:rPr>
+        <w:t>BAN (Body Area Network) — сети на теле человека или рядом с ним. Они применяются для носимых медицинских датчиков, фитнес-браслетов, имплантов, персонального мониторинга здоровья. Здесь важны безопасность, миниатюрность и минимальное энергопотребление.</w:t>
+      </w:r>
+    </w:p>
+    <w:p>
+      <w:pPr>
+        <w:spacing w:after="120" w:line="276" w:lineRule="auto"/>
+        <w:ind w:firstLine="425"/>
+      </w:pPr>
+      <w:r>
+        <w:rPr>
+          <w:rFonts w:ascii="Times New Roman" w:hAnsi="Times New Roman"/>
+          <w:sz w:val="24"/>
+        </w:rPr>
+        <w:t>PAN (Personal Area Network) — персональная сеть вокруг пользователя. Она объединяет смартфон, часы, гарнитуру, датчики, бытовые устройства. Типичные технологии: Bluetooth, BLE, ZigBee, NFC. Дальность обычно мала, зато устройства дешевы и энергоэффективны.</w:t>
+      </w:r>
+    </w:p>
+    <w:p>
+      <w:pPr>
+        <w:spacing w:after="120" w:line="276" w:lineRule="auto"/>
+        <w:ind w:firstLine="425"/>
+      </w:pPr>
+      <w:r>
+        <w:rPr>
+          <w:rFonts w:ascii="Times New Roman" w:hAnsi="Times New Roman"/>
+          <w:sz w:val="24"/>
+        </w:rPr>
+        <w:t>LAN (Local Area Network) — локальная сеть здания, офиса, дома или предприятия. Здесь применяются Ethernet и Wi‑Fi, а также промышленные Ethernet-решения. LAN подходит, когда нужна более высокая скорость и интеграция с существующей IP-инфраструктурой.</w:t>
+      </w:r>
+    </w:p>
+    <w:p>
+      <w:pPr>
+        <w:spacing w:after="120" w:line="276" w:lineRule="auto"/>
+        <w:ind w:firstLine="425"/>
+      </w:pPr>
+      <w:r>
+        <w:rPr>
+          <w:rFonts w:ascii="Times New Roman" w:hAnsi="Times New Roman"/>
+          <w:sz w:val="24"/>
+        </w:rPr>
+        <w:t>WAN (Wide Area Network) — глобальные и территориально распределенные сети: сотовые 2G/3G/4G/5G, LPWAN, спутниковая связь, WiMAX, сети позиционирования GPS/ГЛОНАСС. Они нужны для транспорта, логистики, удаленных объектов, городских и региональных систем.</w:t>
+      </w:r>
+    </w:p>
+    <w:p>
+      <w:pPr>
+        <w:spacing w:after="120" w:line="276" w:lineRule="auto"/>
+        <w:ind w:firstLine="425"/>
+      </w:pPr>
+      <w:r>
+        <w:rPr>
+          <w:rFonts w:ascii="Times New Roman" w:hAnsi="Times New Roman"/>
+          <w:sz w:val="24"/>
+        </w:rPr>
+        <w:t>Также технологии можно классифицировать по дальности: RFID/NFC — сантиметры, BLE/ZigBee/Z-Wave — метры-десятки метров, Wi‑Fi — десятки метров, сотовые и LPWAN — километры. По энергопотреблению IoT часто предпочитает низкоскоростные протоколы, потому что большинству датчиков важнее годы автономной работы, чем высокая скорость передачи.</w:t>
+      </w:r>
+    </w:p>
+    <w:tbl>
+      <w:tblPr>
+        <w:tblStyle w:val="TableGrid"/>
+        <w:tblW w:type="auto" w:w="0"/>
+        <w:tblLook w:firstColumn="1" w:firstRow="1" w:lastColumn="0" w:lastRow="0" w:noHBand="0" w:noVBand="1" w:val="04A0"/>
+      </w:tblPr>
+      <w:tblGrid>
+        <w:gridCol w:w="2493"/>
+        <w:gridCol w:w="2493"/>
+        <w:gridCol w:w="2493"/>
+        <w:gridCol w:w="2493"/>
+      </w:tblGrid>
+      <w:tr>
+        <w:tc>
+          <w:tcPr>
+            <w:tcW w:type="dxa" w:w="2493"/>
+          </w:tcPr>
+          <w:p>
+            <w:r>
+              <w:rPr>
+                <w:rFonts w:ascii="Times New Roman" w:hAnsi="Times New Roman"/>
+                <w:b/>
+                <w:sz w:val="20"/>
+              </w:rPr>
+              <w:t>Класс сети</w:t>
+            </w:r>
+          </w:p>
+        </w:tc>
+        <w:tc>
+          <w:tcPr>
+            <w:tcW w:type="dxa" w:w="2493"/>
+          </w:tcPr>
+          <w:p>
+            <w:r>
+              <w:rPr>
+                <w:rFonts w:ascii="Times New Roman" w:hAnsi="Times New Roman"/>
+                <w:b/>
+                <w:sz w:val="20"/>
+              </w:rPr>
+              <w:t>Дальность / зона</w:t>
+            </w:r>
+          </w:p>
+        </w:tc>
+        <w:tc>
+          <w:tcPr>
+            <w:tcW w:type="dxa" w:w="2493"/>
+          </w:tcPr>
+          <w:p>
+            <w:r>
+              <w:rPr>
+                <w:rFonts w:ascii="Times New Roman" w:hAnsi="Times New Roman"/>
+                <w:b/>
+                <w:sz w:val="20"/>
+              </w:rPr>
+              <w:t>Примеры технологий</w:t>
+            </w:r>
+          </w:p>
+        </w:tc>
+        <w:tc>
+          <w:tcPr>
+            <w:tcW w:type="dxa" w:w="2493"/>
+          </w:tcPr>
+          <w:p>
+            <w:r>
+              <w:rPr>
+                <w:rFonts w:ascii="Times New Roman" w:hAnsi="Times New Roman"/>
+                <w:b/>
+                <w:sz w:val="20"/>
+              </w:rPr>
+              <w:t>Типовые IoT-задачи</w:t>
+            </w:r>
+          </w:p>
+        </w:tc>
+      </w:tr>
+      <w:tr>
+        <w:tc>
+          <w:tcPr>
+            <w:tcW w:type="dxa" w:w="2493"/>
+          </w:tcPr>
+          <w:p>
+            <w:r>
+              <w:rPr>
+                <w:rFonts w:ascii="Times New Roman" w:hAnsi="Times New Roman"/>
+                <w:sz w:val="20"/>
+              </w:rPr>
+              <w:t>BAN</w:t>
+            </w:r>
+          </w:p>
+        </w:tc>
+        <w:tc>
+          <w:tcPr>
+            <w:tcW w:type="dxa" w:w="2493"/>
+          </w:tcPr>
+          <w:p>
+            <w:r>
+              <w:rPr>
+                <w:rFonts w:ascii="Times New Roman" w:hAnsi="Times New Roman"/>
+                <w:sz w:val="20"/>
+              </w:rPr>
+              <w:t>Тело человека, десятки сантиметров</w:t>
+            </w:r>
+          </w:p>
+        </w:tc>
+        <w:tc>
+          <w:tcPr>
+            <w:tcW w:type="dxa" w:w="2493"/>
+          </w:tcPr>
+          <w:p>
+            <w:r>
+              <w:rPr>
+                <w:rFonts w:ascii="Times New Roman" w:hAnsi="Times New Roman"/>
+                <w:sz w:val="20"/>
+              </w:rPr>
+              <w:t>BLE, медицинские сенсоры</w:t>
+            </w:r>
+          </w:p>
+        </w:tc>
+        <w:tc>
+          <w:tcPr>
+            <w:tcW w:type="dxa" w:w="2493"/>
+          </w:tcPr>
+          <w:p>
+            <w:r>
+              <w:rPr>
+                <w:rFonts w:ascii="Times New Roman" w:hAnsi="Times New Roman"/>
+                <w:sz w:val="20"/>
+              </w:rPr>
+              <w:t>Носимый мониторинг здоровья</w:t>
+            </w:r>
+          </w:p>
+        </w:tc>
+      </w:tr>
+      <w:tr>
+        <w:tc>
+          <w:tcPr>
+            <w:tcW w:type="dxa" w:w="2493"/>
+          </w:tcPr>
+          <w:p>
+            <w:r>
+              <w:rPr>
+                <w:rFonts w:ascii="Times New Roman" w:hAnsi="Times New Roman"/>
+                <w:sz w:val="20"/>
+              </w:rPr>
+              <w:t>PAN</w:t>
+            </w:r>
+          </w:p>
+        </w:tc>
+        <w:tc>
+          <w:tcPr>
+            <w:tcW w:type="dxa" w:w="2493"/>
+          </w:tcPr>
+          <w:p>
+            <w:r>
+              <w:rPr>
+                <w:rFonts w:ascii="Times New Roman" w:hAnsi="Times New Roman"/>
+                <w:sz w:val="20"/>
+              </w:rPr>
+              <w:t>Персональная зона, метры-десятки метров</w:t>
+            </w:r>
+          </w:p>
+        </w:tc>
+        <w:tc>
+          <w:tcPr>
+            <w:tcW w:type="dxa" w:w="2493"/>
+          </w:tcPr>
+          <w:p>
+            <w:r>
+              <w:rPr>
+                <w:rFonts w:ascii="Times New Roman" w:hAnsi="Times New Roman"/>
+                <w:sz w:val="20"/>
+              </w:rPr>
+              <w:t>NFC, BLE, ZigBee, Z-Wave</w:t>
+            </w:r>
+          </w:p>
+        </w:tc>
+        <w:tc>
+          <w:tcPr>
+            <w:tcW w:type="dxa" w:w="2493"/>
+          </w:tcPr>
+          <w:p>
+            <w:r>
+              <w:rPr>
+                <w:rFonts w:ascii="Times New Roman" w:hAnsi="Times New Roman"/>
+                <w:sz w:val="20"/>
+              </w:rPr>
+              <w:t>Умный дом, персональные устройства</w:t>
+            </w:r>
+          </w:p>
+        </w:tc>
+      </w:tr>
+      <w:tr>
+        <w:tc>
+          <w:tcPr>
+            <w:tcW w:type="dxa" w:w="2493"/>
+          </w:tcPr>
+          <w:p>
+            <w:r>
+              <w:rPr>
+                <w:rFonts w:ascii="Times New Roman" w:hAnsi="Times New Roman"/>
+                <w:sz w:val="20"/>
+              </w:rPr>
+              <w:t>LAN</w:t>
+            </w:r>
+          </w:p>
+        </w:tc>
+        <w:tc>
+          <w:tcPr>
+            <w:tcW w:type="dxa" w:w="2493"/>
+          </w:tcPr>
+          <w:p>
+            <w:r>
+              <w:rPr>
+                <w:rFonts w:ascii="Times New Roman" w:hAnsi="Times New Roman"/>
+                <w:sz w:val="20"/>
+              </w:rPr>
+              <w:t>Дом, офис, предприятие</w:t>
+            </w:r>
+          </w:p>
+        </w:tc>
+        <w:tc>
+          <w:tcPr>
+            <w:tcW w:type="dxa" w:w="2493"/>
+          </w:tcPr>
+          <w:p>
+            <w:r>
+              <w:rPr>
+                <w:rFonts w:ascii="Times New Roman" w:hAnsi="Times New Roman"/>
+                <w:sz w:val="20"/>
+              </w:rPr>
+              <w:t>Ethernet, Wi‑Fi, Industrial Ethernet</w:t>
+            </w:r>
+          </w:p>
+        </w:tc>
+        <w:tc>
+          <w:tcPr>
+            <w:tcW w:type="dxa" w:w="2493"/>
+          </w:tcPr>
+          <w:p>
+            <w:r>
+              <w:rPr>
+                <w:rFonts w:ascii="Times New Roman" w:hAnsi="Times New Roman"/>
+                <w:sz w:val="20"/>
+              </w:rPr>
+              <w:t>Шлюзы, камеры, локальная автоматизация</w:t>
+            </w:r>
+          </w:p>
+        </w:tc>
+      </w:tr>
+      <w:tr>
+        <w:tc>
+          <w:tcPr>
+            <w:tcW w:type="dxa" w:w="2493"/>
+          </w:tcPr>
+          <w:p>
+            <w:r>
+              <w:rPr>
+                <w:rFonts w:ascii="Times New Roman" w:hAnsi="Times New Roman"/>
+                <w:sz w:val="20"/>
+              </w:rPr>
+              <w:t>WAN</w:t>
+            </w:r>
+          </w:p>
+        </w:tc>
+        <w:tc>
+          <w:tcPr>
+            <w:tcW w:type="dxa" w:w="2493"/>
+          </w:tcPr>
+          <w:p>
+            <w:r>
+              <w:rPr>
+                <w:rFonts w:ascii="Times New Roman" w:hAnsi="Times New Roman"/>
+                <w:sz w:val="20"/>
+              </w:rPr>
+              <w:t>Город, регион, глобальная сеть</w:t>
+            </w:r>
+          </w:p>
+        </w:tc>
+        <w:tc>
+          <w:tcPr>
+            <w:tcW w:type="dxa" w:w="2493"/>
+          </w:tcPr>
+          <w:p>
+            <w:r>
+              <w:rPr>
+                <w:rFonts w:ascii="Times New Roman" w:hAnsi="Times New Roman"/>
+                <w:sz w:val="20"/>
+              </w:rPr>
+              <w:t>2G/3G/4G/5G, LPWAN, спутниковая связь</w:t>
+            </w:r>
+          </w:p>
+        </w:tc>
+        <w:tc>
+          <w:tcPr>
+            <w:tcW w:type="dxa" w:w="2493"/>
+          </w:tcPr>
+          <w:p>
+            <w:r>
+              <w:rPr>
+                <w:rFonts w:ascii="Times New Roman" w:hAnsi="Times New Roman"/>
+                <w:sz w:val="20"/>
+              </w:rPr>
+              <w:t>Транспорт, логистика, удаленный мониторинг</w:t>
+            </w:r>
+          </w:p>
+        </w:tc>
+      </w:tr>
+    </w:tbl>
+    <w:p/>
+    <w:p>
+      <w:r>
+        <w:br w:type="page"/>
+      </w:r>
+    </w:p>
+    <w:p>
+      <w:pPr>
+        <w:pStyle w:val="Heading1"/>
+      </w:pPr>
+      <w:r>
+        <w:rPr>
+          <w:rFonts w:ascii="Times New Roman" w:hAnsi="Times New Roman"/>
+          <w:b/>
+          <w:sz w:val="28"/>
+        </w:rPr>
+        <w:t>45. Стандарт IEEE Std 802.15.4</w:t>
+      </w:r>
+    </w:p>
+    <w:p>
+      <w:pPr>
+        <w:spacing w:after="120" w:line="276" w:lineRule="auto"/>
+        <w:ind w:firstLine="425"/>
+      </w:pPr>
+      <w:r>
+        <w:rPr>
+          <w:rFonts w:ascii="Times New Roman" w:hAnsi="Times New Roman"/>
+          <w:sz w:val="24"/>
+        </w:rPr>
+        <w:t>IEEE 802.15.4 — базовый стандарт для маломощных беспроводных персональных сетей WPAN с низкой скоростью передачи данных. Он предназначен для устройств, которым важны низкая стоимость, энергоэффективность и надежный обмен небольшими сообщениями. Именно поэтому стандарт широко используется в сенсорных сетях и IoT.</w:t>
+      </w:r>
+    </w:p>
+    <w:p>
+      <w:pPr>
+        <w:spacing w:after="120" w:line="276" w:lineRule="auto"/>
+        <w:ind w:firstLine="425"/>
+      </w:pPr>
+      <w:r>
+        <w:rPr>
+          <w:rFonts w:ascii="Times New Roman" w:hAnsi="Times New Roman"/>
+          <w:sz w:val="24"/>
+        </w:rPr>
+        <w:t>IEEE 802.15.4 определяет два нижних уровня сетевой модели: физический уровень PHY и уровень доступа к среде MAC. PHY описывает радиопередачу, частотные диапазоны, модуляцию, скорость и параметры канала. MAC отвечает за доступ устройств к общей среде, формирование кадров, подтверждения, обнаружение занятости канала, работу с коллизиями и базовые механизмы безопасности.</w:t>
+      </w:r>
+    </w:p>
+    <w:p>
+      <w:pPr>
+        <w:spacing w:after="120" w:line="276" w:lineRule="auto"/>
+        <w:ind w:firstLine="425"/>
+      </w:pPr>
+      <w:r>
+        <w:rPr>
+          <w:rFonts w:ascii="Times New Roman" w:hAnsi="Times New Roman"/>
+          <w:sz w:val="24"/>
+        </w:rPr>
+        <w:t>Стандарт является основой для более высокоуровневых технологий: ZigBee, WirelessHART, ISA100.11a, MiWi, а также может использоваться вместе с 6LoWPAN для передачи IPv6-пакетов в маломощных сетях. То есть 802.15.4 сам по себе не задает полную прикладную логику IoT-системы, но предоставляет надежный фундамент для построения стека протоколов.</w:t>
+      </w:r>
+    </w:p>
+    <w:p>
+      <w:pPr>
+        <w:spacing w:after="120" w:line="276" w:lineRule="auto"/>
+        <w:ind w:firstLine="425"/>
+      </w:pPr>
+      <w:r>
+        <w:rPr>
+          <w:rFonts w:ascii="Times New Roman" w:hAnsi="Times New Roman"/>
+          <w:sz w:val="24"/>
+        </w:rPr>
+        <w:t>Важная характеристика 802.15.4 — поддержка разных топологий: звезда, одноранговая сеть, mesh через надстройки. Стандарт подходит для датчиков температуры, движения, освещенности, счетчиков, промышленной телеметрии, умного дома и автоматизации зданий. Его преимущество — возможность длительной работы от батареи; недостаток — малая скорость и ограниченная дальность по сравнению с Wi‑Fi или сотовыми технологиями. Для IoT это часто приемлемый компромисс: датчику не нужна высокая скорость, ему нужно надежно и долго передавать короткие сообщения.</w:t>
+      </w:r>
+    </w:p>
+    <w:p>
+      <w:r>
+        <w:br w:type="page"/>
+      </w:r>
+    </w:p>
+    <w:p>
+      <w:pPr>
+        <w:pStyle w:val="Heading1"/>
+      </w:pPr>
+      <w:r>
+        <w:rPr>
+          <w:rFonts w:ascii="Times New Roman" w:hAnsi="Times New Roman"/>
+          <w:b/>
+          <w:sz w:val="28"/>
+        </w:rPr>
+        <w:t>46. Стандарт ZigBee</w:t>
+      </w:r>
+    </w:p>
+    <w:p>
+      <w:pPr>
+        <w:spacing w:after="120" w:line="276" w:lineRule="auto"/>
+        <w:ind w:firstLine="425"/>
+      </w:pPr>
+      <w:r>
+        <w:rPr>
+          <w:rFonts w:ascii="Times New Roman" w:hAnsi="Times New Roman"/>
+          <w:sz w:val="24"/>
+        </w:rPr>
+        <w:t>ZigBee — это стандарт и стек протоколов для беспроводных сенсорных сетей, построенный поверх IEEE 802.15.4. Если IEEE 802.15.4 задает физический и MAC-уровни, то ZigBee определяет сетевой, прикладной и сервисный уровни, обеспечивая совместимость устройств и построение законченных IoT-сетей.</w:t>
+      </w:r>
+    </w:p>
+    <w:p>
+      <w:pPr>
+        <w:spacing w:after="120" w:line="276" w:lineRule="auto"/>
+        <w:ind w:firstLine="425"/>
+      </w:pPr>
+      <w:r>
+        <w:rPr>
+          <w:rFonts w:ascii="Times New Roman" w:hAnsi="Times New Roman"/>
+          <w:sz w:val="24"/>
+        </w:rPr>
+        <w:t>Альянс ZigBee был создан крупными производителями аппаратных и программных решений. Стандарт ратифицирован в 2004 году и ориентирован на приложения, где нужна безопасная и надежная передача небольших объемов данных при низком энергопотреблении. Название ZigBee связано с «зигзагообразным» движением пчелы, что метафорически отражает передачу данных между узлами сети.</w:t>
+      </w:r>
+    </w:p>
+    <w:p>
+      <w:pPr>
+        <w:spacing w:after="120" w:line="276" w:lineRule="auto"/>
+        <w:ind w:firstLine="425"/>
+      </w:pPr>
+      <w:r>
+        <w:rPr>
+          <w:rFonts w:ascii="Times New Roman" w:hAnsi="Times New Roman"/>
+          <w:sz w:val="24"/>
+        </w:rPr>
+        <w:t>ZigBee поддерживает топологии «звезда», «дерево» и mesh. В mesh-сети устройства могут пересылать сообщения друг через друга, расширяя зону покрытия и повышая устойчивость. Типовые роли устройств: координатор, маршрутизатор и конечное устройство. Конечные устройства могут долго спать, экономя батарею, а маршрутизаторы поддерживают сетевую связность.</w:t>
+      </w:r>
+    </w:p>
+    <w:p>
+      <w:pPr>
+        <w:spacing w:after="120" w:line="276" w:lineRule="auto"/>
+        <w:ind w:firstLine="425"/>
+      </w:pPr>
+      <w:r>
+        <w:rPr>
+          <w:rFonts w:ascii="Times New Roman" w:hAnsi="Times New Roman"/>
+          <w:sz w:val="24"/>
+        </w:rPr>
+        <w:t>Области применения ZigBee: умный дом, автоматизация зданий, датчики безопасности, управление освещением, климатом, счетчики, промышленный мониторинг. Его преимущества — низкое энергопотребление, поддержка самоорганизующихся сетей, достаточная надежность, развитая экосистема. Недостатки — относительно низкая скорость, ограниченная дальность одного радиоканала и необходимость шлюза для интеграции с IP/Интернетом. В IoT ZigBee используется там, где важны массовые недорогие датчики и актуаторы, а не передача больших файлов.</w:t>
+      </w:r>
+    </w:p>
+    <w:p>
+      <w:r>
+        <w:br w:type="page"/>
+      </w:r>
+    </w:p>
+    <w:p>
+      <w:pPr>
+        <w:pStyle w:val="Heading1"/>
+      </w:pPr>
+      <w:r>
+        <w:rPr>
+          <w:rFonts w:ascii="Times New Roman" w:hAnsi="Times New Roman"/>
+          <w:b/>
+          <w:sz w:val="28"/>
+        </w:rPr>
+        <w:t>47. Стандарт 6LoWPAN</w:t>
+      </w:r>
+    </w:p>
+    <w:p>
+      <w:pPr>
+        <w:spacing w:after="120" w:line="276" w:lineRule="auto"/>
+        <w:ind w:firstLine="425"/>
+      </w:pPr>
+      <w:r>
+        <w:rPr>
+          <w:rFonts w:ascii="Times New Roman" w:hAnsi="Times New Roman"/>
+          <w:sz w:val="24"/>
+        </w:rPr>
+        <w:t>6LoWPAN (IPv6 Low-Power Wireless Personal Area Network) — стандарт, позволяющий передавать IPv6-пакеты в маломощных беспроводных персональных сетях. Он разработан IETF и описан в RFC 4944 и RFC 4919. Его главная задача — связать сенсорные сети и ограниченные устройства с IP-инфраструктурой Интернета.</w:t>
+      </w:r>
+    </w:p>
+    <w:p>
+      <w:pPr>
+        <w:spacing w:after="120" w:line="276" w:lineRule="auto"/>
+        <w:ind w:firstLine="425"/>
+      </w:pPr>
+      <w:r>
+        <w:rPr>
+          <w:rFonts w:ascii="Times New Roman" w:hAnsi="Times New Roman"/>
+          <w:sz w:val="24"/>
+        </w:rPr>
+        <w:t>Проблема состоит в том, что обычные IPv6-пакеты и заголовки слишком велики для сетей IEEE 802.15.4, где кадры малы, скорость невысока, а устройства имеют ограниченную память и энергию. 6LoWPAN вводит адаптационный уровень: сжатие заголовков, фрагментацию и сборку пакетов, механизмы адресации и передачи, подходящие для маломощных узлов.</w:t>
+      </w:r>
+    </w:p>
+    <w:p>
+      <w:pPr>
+        <w:spacing w:after="120" w:line="276" w:lineRule="auto"/>
+        <w:ind w:firstLine="425"/>
+      </w:pPr>
+      <w:r>
+        <w:rPr>
+          <w:rFonts w:ascii="Times New Roman" w:hAnsi="Times New Roman"/>
+          <w:sz w:val="24"/>
+        </w:rPr>
+        <w:t>В материалах указано, что 6LoWPAN используется в основном для сетей датчиков и автоматизации жилых/офисных помещений с возможностью управления через Интернет, но может работать и автономно. Сети 6LoWPAN являются подсетями IPv6: они могут взаимодействовать с другими IP-узлами, хотя не предназначены быть транзитными сетями для обычного интернет-трафика.</w:t>
+      </w:r>
+    </w:p>
+    <w:p>
+      <w:pPr>
+        <w:spacing w:after="120" w:line="276" w:lineRule="auto"/>
+        <w:ind w:firstLine="425"/>
+      </w:pPr>
+      <w:r>
+        <w:rPr>
+          <w:rFonts w:ascii="Times New Roman" w:hAnsi="Times New Roman"/>
+          <w:sz w:val="24"/>
+        </w:rPr>
+        <w:t>Узлы 6LoWPAN могут быть хостами и маршрутизаторами; часто в сети есть граничный маршрутизатор, который соединяет маломощную сеть с внешней IPv6-сетью. Преимущество стандарта — использование единой IP-модели от датчика до приложения. Это упрощает интеграцию с облаками, web-сервисами и IoT-платформами. 6LoWPAN особенно важен там, где нужно уйти от закрытых шлюзовых протоколов и сделать устройства полноценными участниками IP-сети, сохранив низкое энергопотребление.</w:t>
+      </w:r>
+    </w:p>
+    <w:p>
+      <w:r>
+        <w:br w:type="page"/>
+      </w:r>
+    </w:p>
+    <w:p>
+      <w:pPr>
+        <w:pStyle w:val="Heading1"/>
+      </w:pPr>
+      <w:r>
+        <w:rPr>
+          <w:rFonts w:ascii="Times New Roman" w:hAnsi="Times New Roman"/>
+          <w:b/>
+          <w:sz w:val="28"/>
+        </w:rPr>
+        <w:t>48. Стандарты WirelessHART и ISA100.11a</w:t>
+      </w:r>
+    </w:p>
+    <w:p>
+      <w:pPr>
+        <w:spacing w:after="120" w:line="276" w:lineRule="auto"/>
+        <w:ind w:firstLine="425"/>
+      </w:pPr>
+      <w:r>
+        <w:rPr>
+          <w:rFonts w:ascii="Times New Roman" w:hAnsi="Times New Roman"/>
+          <w:sz w:val="24"/>
+        </w:rPr>
+        <w:t>WirelessHART и ISA100.11a — стандарты промышленных беспроводных сетей, ориентированные на автоматизацию производства и технологические процессы. Оба стандарта построены поверх физического уровня IEEE 802.15.4, но отличаются от бытовых IoT-протоколов повышенными требованиями к надежности, безопасности, предсказуемости и работе в сложной промышленной среде.</w:t>
+      </w:r>
+    </w:p>
+    <w:p>
+      <w:pPr>
+        <w:spacing w:after="120" w:line="276" w:lineRule="auto"/>
+        <w:ind w:firstLine="425"/>
+      </w:pPr>
+      <w:r>
+        <w:rPr>
+          <w:rFonts w:ascii="Times New Roman" w:hAnsi="Times New Roman"/>
+          <w:sz w:val="24"/>
+        </w:rPr>
+        <w:t>WirelessHART разработан HART Communication Foundation как беспроводное развитие проводного протокола HART, который давно используется для взаимодействия с полевыми датчиками по двухпроводной линии 4–20 мА. WirelessHART передает HART-сообщения по беспроводной среде, работает в диапазоне 2,4 ГГц, поддерживает mesh-топологию, синхронизацию времени, шифрование и надежную доставку. В материалах указана скорость до 250 кбит/с и дальность до 200 м в пределах прямой видимости.</w:t>
+      </w:r>
+    </w:p>
+    <w:p>
+      <w:pPr>
+        <w:spacing w:after="120" w:line="276" w:lineRule="auto"/>
+        <w:ind w:firstLine="425"/>
+      </w:pPr>
+      <w:r>
+        <w:rPr>
+          <w:rFonts w:ascii="Times New Roman" w:hAnsi="Times New Roman"/>
+          <w:sz w:val="24"/>
+        </w:rPr>
+        <w:t>ISA100.11a разработан Международной ассоциацией автоматизации ISA и также предназначен для беспроводной промышленной автоматики. Он ориентирован на мониторинг, управление и интеграцию полевых устройств. Как и WirelessHART, стандарт учитывает требования промышленной надежности и безопасности.</w:t>
+      </w:r>
+    </w:p>
+    <w:p>
+      <w:pPr>
+        <w:spacing w:after="120" w:line="276" w:lineRule="auto"/>
+        <w:ind w:firstLine="425"/>
+      </w:pPr>
+      <w:r>
+        <w:rPr>
+          <w:rFonts w:ascii="Times New Roman" w:hAnsi="Times New Roman"/>
+          <w:sz w:val="24"/>
+        </w:rPr>
+        <w:t>Эти стандарты конкурируют между собой. Планировалась их конвергенция в ISA100.12, но работы были прекращены из-за нерешенных вопросов совместимости. Главное отличие промышленных стандартов от ZigBee или BLE — ориентация не на бытовое удобство, а на устойчивую работу в производственной среде, где отказ связи может привести к простоям, авариям или финансовым потерям. В IoT/IIoT WirelessHART и ISA100.11a применяются для датчиков давления, температуры, расхода, вибрации, состояния оборудования и удаленного мониторинга технологических процессов.</w:t>
+      </w:r>
+    </w:p>
+    <w:p>
+      <w:r>
+        <w:br w:type="page"/>
+      </w:r>
+    </w:p>
+    <w:p>
+      <w:pPr>
+        <w:pStyle w:val="Heading1"/>
+      </w:pPr>
+      <w:r>
+        <w:rPr>
+          <w:rFonts w:ascii="Times New Roman" w:hAnsi="Times New Roman"/>
+          <w:b/>
+          <w:sz w:val="28"/>
+        </w:rPr>
+        <w:t>49. Стандарт Z-Wave</w:t>
+      </w:r>
+    </w:p>
+    <w:p>
+      <w:pPr>
+        <w:spacing w:after="120" w:line="276" w:lineRule="auto"/>
+        <w:ind w:firstLine="425"/>
+      </w:pPr>
+      <w:r>
+        <w:rPr>
+          <w:rFonts w:ascii="Times New Roman" w:hAnsi="Times New Roman"/>
+          <w:sz w:val="24"/>
+        </w:rPr>
+        <w:t>Z-Wave — открытый беспроводной стандарт домашней автоматизации, предназначенный прежде всего для систем «умный дом». Он основан на спецификации ITU G.9959 и описывает взаимодействие устройств, поддерживающих этот протокол, обеспечивая их совместимость.</w:t>
+      </w:r>
+    </w:p>
+    <w:p>
+      <w:pPr>
+        <w:spacing w:after="120" w:line="276" w:lineRule="auto"/>
+        <w:ind w:firstLine="425"/>
+      </w:pPr>
+      <w:r>
+        <w:rPr>
+          <w:rFonts w:ascii="Times New Roman" w:hAnsi="Times New Roman"/>
+          <w:sz w:val="24"/>
+        </w:rPr>
+        <w:t>Основная идея Z-Wave — создание маломощной ячеистой mesh-сети бытовых устройств. В нее могут входить выключатели, датчики движения, датчики открытия дверей, термостаты, розетки, замки, модули управления освещением, отоплением, вентиляцией, бытовой техникой и системами безопасности. Устройства способны пересылать команды друг через друга, расширяя покрытие сети внутри дома.</w:t>
+      </w:r>
+    </w:p>
+    <w:p>
+      <w:pPr>
+        <w:spacing w:after="120" w:line="276" w:lineRule="auto"/>
+        <w:ind w:firstLine="425"/>
+      </w:pPr>
+      <w:r>
+        <w:rPr>
+          <w:rFonts w:ascii="Times New Roman" w:hAnsi="Times New Roman"/>
+          <w:sz w:val="24"/>
+        </w:rPr>
+        <w:t>В отличие от Wi‑Fi, рассчитанного на высокоскоростную передачу больших объемов данных, Z-Wave оптимизирован для коротких управляющих сообщений и телеметрии. Он работает в диапазоне до 1 ГГц, что снижает конкуренцию с Wi‑Fi и Bluetooth в диапазоне 2,4 ГГц и может улучшать прохождение сигнала через стены. Низкая скорость здесь не является недостатком, потому что команде «включить свет» или «закрыть замок» не требуется широкая полоса.</w:t>
+      </w:r>
+    </w:p>
+    <w:p>
+      <w:pPr>
+        <w:spacing w:after="120" w:line="276" w:lineRule="auto"/>
+        <w:ind w:firstLine="425"/>
+      </w:pPr>
+      <w:r>
+        <w:rPr>
+          <w:rFonts w:ascii="Times New Roman" w:hAnsi="Times New Roman"/>
+          <w:sz w:val="24"/>
+        </w:rPr>
+        <w:t>Преимущества Z-Wave: низкое энергопотребление, хорошая совместимость устройств внутри экосистемы, mesh-топология, ориентация на бытовую автоматизацию. Ограничения — зависимость от контроллера/шлюза, меньшая универсальность по сравнению с IP-сетями и привязка к конкретным частотным диапазонам в разных регионах. В IoT Z-Wave занимает нишу надежной домашней автоматизации, где важна простая установка и стабильное управление устройствами.</w:t>
+      </w:r>
+    </w:p>
+    <w:p>
+      <w:r>
+        <w:br w:type="page"/>
+      </w:r>
+    </w:p>
+    <w:p>
+      <w:pPr>
+        <w:pStyle w:val="Heading1"/>
+      </w:pPr>
+      <w:r>
+        <w:rPr>
+          <w:rFonts w:ascii="Times New Roman" w:hAnsi="Times New Roman"/>
+          <w:b/>
+          <w:sz w:val="28"/>
+        </w:rPr>
+        <w:t>50. Стандарт Bluetooth Low Energy</w:t>
+      </w:r>
+    </w:p>
+    <w:p>
+      <w:pPr>
+        <w:spacing w:after="120" w:line="276" w:lineRule="auto"/>
+        <w:ind w:firstLine="425"/>
+      </w:pPr>
+      <w:r>
+        <w:rPr>
+          <w:rFonts w:ascii="Times New Roman" w:hAnsi="Times New Roman"/>
+          <w:sz w:val="24"/>
+        </w:rPr>
+        <w:t>Bluetooth Low Energy (BLE), или Bluetooth 4.0 и выше, — технология беспроводной связи ближнего радиуса действия, разработанная Bluetooth SIG для устройств с автономным питанием. В отличие от классического Bluetooth, BLE изначально ориентирован на датчики, мониторинг, носимые устройства и обмен короткими сообщениями при очень низком энергопотреблении.</w:t>
+      </w:r>
+    </w:p>
+    <w:p>
+      <w:pPr>
+        <w:spacing w:after="120" w:line="276" w:lineRule="auto"/>
+        <w:ind w:firstLine="425"/>
+      </w:pPr>
+      <w:r>
+        <w:rPr>
+          <w:rFonts w:ascii="Times New Roman" w:hAnsi="Times New Roman"/>
+          <w:sz w:val="24"/>
+        </w:rPr>
+        <w:t>В материалах отмечено, что BLE потребляет в 10–20 раз меньше энергии и способен передавать данные значительно эффективнее классических Bluetooth-решений. BLE работает в диапазоне 2,4 ГГц и использует 40 частотных каналов с шагом 2 МГц. На физическом уровне применяется GFSK-модуляция, позволяющая снижать пиковое потребление энергии.</w:t>
+      </w:r>
+    </w:p>
+    <w:p>
+      <w:pPr>
+        <w:spacing w:after="120" w:line="276" w:lineRule="auto"/>
+        <w:ind w:firstLine="425"/>
+      </w:pPr>
+      <w:r>
+        <w:rPr>
+          <w:rFonts w:ascii="Times New Roman" w:hAnsi="Times New Roman"/>
+          <w:sz w:val="24"/>
+        </w:rPr>
+        <w:t>В отличие от ZigBee, 6LoWPAN или Z-Wave, которые часто ориентированы на разветвленные mesh-сети, BLE традиционно лучше подходит для топологий «точка-точка» и «звезда»: датчик связывается со смартфоном, браслет — с телефоном, медицинский прибор — с домашним шлюзом. Современные версии Bluetooth также поддерживают mesh, но типовой сценарий BLE — короткие сеансы связи и экономия батареи.</w:t>
+      </w:r>
+    </w:p>
+    <w:p>
+      <w:pPr>
+        <w:spacing w:after="120" w:line="276" w:lineRule="auto"/>
+        <w:ind w:firstLine="425"/>
+      </w:pPr>
+      <w:r>
+        <w:rPr>
+          <w:rFonts w:ascii="Times New Roman" w:hAnsi="Times New Roman"/>
+          <w:sz w:val="24"/>
+        </w:rPr>
+        <w:t>Области применения BLE: фитнес-браслеты, умные часы, маяки beacons, датчики с батарейным питанием, домашние медицинские приборы, спортивные тренажеры, системы безопасности, управление электроприборами, отображение показаний. Для IoT BLE важен тем, что смартфон может выступать универсальным шлюзом между персональными датчиками и облачным сервисом. Преимущества — массовая поддержка в телефонах, низкая стоимость и энергоэффективность; ограничения — небольшая дальность и не лучшая пригодность для больших промышленных сетей.</w:t>
+      </w:r>
+    </w:p>
+    <w:p>
+      <w:r>
+        <w:br w:type="page"/>
+      </w:r>
+    </w:p>
+    <w:p>
+      <w:pPr>
+        <w:pStyle w:val="Heading1"/>
+      </w:pPr>
+      <w:r>
+        <w:rPr>
+          <w:rFonts w:ascii="Times New Roman" w:hAnsi="Times New Roman"/>
+          <w:b/>
+          <w:sz w:val="28"/>
+        </w:rPr>
+        <w:t>51. Семейство стандартов IEEE 802.11</w:t>
+      </w:r>
+    </w:p>
+    <w:p>
+      <w:pPr>
+        <w:spacing w:after="120" w:line="276" w:lineRule="auto"/>
+        <w:ind w:firstLine="425"/>
+      </w:pPr>
+      <w:r>
+        <w:rPr>
+          <w:rFonts w:ascii="Times New Roman" w:hAnsi="Times New Roman"/>
+          <w:sz w:val="24"/>
+        </w:rPr>
+        <w:t>IEEE 802.11 — семейство стандартов беспроводных локальных сетей, более известное как Wi‑Fi. Оно широко применяется для домашних и офисных сетей, общественного доступа к Интернету, подключения ноутбуков, смартфонов, камер, бытовых устройств и IoT-шлюзов.</w:t>
+      </w:r>
+    </w:p>
+    <w:p>
+      <w:pPr>
+        <w:spacing w:after="120" w:line="276" w:lineRule="auto"/>
+        <w:ind w:firstLine="425"/>
+      </w:pPr>
+      <w:r>
+        <w:rPr>
+          <w:rFonts w:ascii="Times New Roman" w:hAnsi="Times New Roman"/>
+          <w:sz w:val="24"/>
+        </w:rPr>
+        <w:t>Стек IEEE 802.11, как и другие стандарты IEEE 802, определяет физический уровень и канальный уровень, включая MAC-подуровень доступа к среде и LLC-подуровень логической передачи данных. Разные версии стандарта отличаются частотными диапазонами, модуляцией, шириной канала, скоростью, дальностью и устойчивостью к помехам.</w:t>
+      </w:r>
+    </w:p>
+    <w:p>
+      <w:pPr>
+        <w:spacing w:after="120" w:line="276" w:lineRule="auto"/>
+        <w:ind w:firstLine="425"/>
+      </w:pPr>
+      <w:r>
+        <w:rPr>
+          <w:rFonts w:ascii="Times New Roman" w:hAnsi="Times New Roman"/>
+          <w:sz w:val="24"/>
+        </w:rPr>
+        <w:t>В IoT Wi‑Fi применяется там, где нужна относительно высокая скорость передачи и уже есть инфраструктура точки доступа. Например, IP-камеры, умные колонки, бытовая техника, контроллеры умного дома, панели управления и шлюзы часто используют Wi‑Fi. Преимущество — простая интеграция с IP-сетями и Интернетом без специальных шлюзов.</w:t>
+      </w:r>
+    </w:p>
+    <w:p>
+      <w:pPr>
+        <w:spacing w:after="120" w:line="276" w:lineRule="auto"/>
+        <w:ind w:firstLine="425"/>
+      </w:pPr>
+      <w:r>
+        <w:rPr>
+          <w:rFonts w:ascii="Times New Roman" w:hAnsi="Times New Roman"/>
+          <w:sz w:val="24"/>
+        </w:rPr>
+        <w:t>Однако Wi‑Fi не всегда подходит для маломощных датчиков. Он потребляет больше энергии, чем ZigBee, BLE или 802.15.4, а значит хуже подходит для устройств, которые должны работать от батареи годами. Поэтому в IoT Wi‑Fi часто используют для устройств с питанием от сети или для шлюзов, а не для каждого маленького сенсора.</w:t>
+      </w:r>
+    </w:p>
+    <w:p>
+      <w:pPr>
+        <w:spacing w:after="120" w:line="276" w:lineRule="auto"/>
+        <w:ind w:firstLine="425"/>
+      </w:pPr>
+      <w:r>
+        <w:rPr>
+          <w:rFonts w:ascii="Times New Roman" w:hAnsi="Times New Roman"/>
+          <w:sz w:val="24"/>
+        </w:rPr>
+        <w:t>Сильные стороны IEEE 802.11 — высокая скорость, зрелая инфраструктура, массовая совместимость, широкая поддержка безопасности. Ограничения — энергопотребление, загруженность диапазонов, сравнительно небольшая дальность внутри зданий и конкуренция с другими беспроводными сетями. В архитектуре IoT Wi‑Fi обычно занимает уровень локальной сети LAN.</w:t>
+      </w:r>
+    </w:p>
+    <w:p>
+      <w:r>
+        <w:br w:type="page"/>
+      </w:r>
+    </w:p>
+    <w:p>
+      <w:pPr>
+        <w:pStyle w:val="Heading1"/>
+      </w:pPr>
+      <w:r>
+        <w:rPr>
+          <w:rFonts w:ascii="Times New Roman" w:hAnsi="Times New Roman"/>
+          <w:b/>
+          <w:sz w:val="28"/>
+        </w:rPr>
+        <w:t>52. Стандарт DECT ULE</w:t>
+      </w:r>
+    </w:p>
+    <w:p>
+      <w:pPr>
+        <w:spacing w:after="120" w:line="276" w:lineRule="auto"/>
+        <w:ind w:firstLine="425"/>
+      </w:pPr>
+      <w:r>
+        <w:rPr>
+          <w:rFonts w:ascii="Times New Roman" w:hAnsi="Times New Roman"/>
+          <w:sz w:val="24"/>
+        </w:rPr>
+        <w:t>DECT ULE (Digital European Cordless Telecommunications Ultra Low Energy) — беспроводная технология с низким энергопотреблением, развившаяся из стандарта DECT, известного по беспроводной телефонной связи. Цель DECT ULE — поддержка устройств с низкой пропускной способностью и автономным питанием: сенсоров, умных счетчиков, устройств домашней автоматизации.</w:t>
+      </w:r>
+    </w:p>
+    <w:p>
+      <w:pPr>
+        <w:spacing w:after="120" w:line="276" w:lineRule="auto"/>
+        <w:ind w:firstLine="425"/>
+      </w:pPr>
+      <w:r>
+        <w:rPr>
+          <w:rFonts w:ascii="Times New Roman" w:hAnsi="Times New Roman"/>
+          <w:sz w:val="24"/>
+        </w:rPr>
+        <w:t>Стандарт сохранил сильные стороны DECT: выделенный частотный диапазон, устойчивость к помехам, хорошую дальность, зрелость технологии и возможность сосуществования с Wi‑Fi, Bluetooth и другими радиосистемами. В Европе DECT ULE работает в диапазоне 1,88–1,90 ГГц. Отдельный диапазон снижает конкуренцию с Wi‑Fi и BLE, работающими на 2,4 ГГц.</w:t>
+      </w:r>
+    </w:p>
+    <w:p>
+      <w:pPr>
+        <w:spacing w:after="120" w:line="276" w:lineRule="auto"/>
+        <w:ind w:firstLine="425"/>
+      </w:pPr>
+      <w:r>
+        <w:rPr>
+          <w:rFonts w:ascii="Times New Roman" w:hAnsi="Times New Roman"/>
+          <w:sz w:val="24"/>
+        </w:rPr>
+        <w:t>Важная особенность DECT ULE — поддержка IPv6, что делает стандарт пригодным для Интернета вещей. Устройства могут передавать данные через базовую станцию или шлюз в IP-сеть, а затем в облачные сервисы или приложения. Это позволяет строить системы умного дома и мониторинга с хорошей дальностью и низким энергопотреблением.</w:t>
+      </w:r>
+    </w:p>
+    <w:p>
+      <w:pPr>
+        <w:spacing w:after="120" w:line="276" w:lineRule="auto"/>
+        <w:ind w:firstLine="425"/>
+      </w:pPr>
+      <w:r>
+        <w:rPr>
+          <w:rFonts w:ascii="Times New Roman" w:hAnsi="Times New Roman"/>
+          <w:sz w:val="24"/>
+        </w:rPr>
+        <w:t>Типовые применения: датчики движения, дыма, протечки, температуры, умные розетки, охранные устройства, домашняя автоматика, медицинские и сервисные устройства. Преимущества DECT ULE — дальность, надежность, низкое энергопотребление, зрелая телефонная инфраструктура и поддержка IP. Ограничения — меньшая распространенность по сравнению с Wi‑Fi/BLE и зависимость от базовой станции. В IoT этот стандарт интересен как альтернатива домашним и офисным беспроводным протоколам там, где нужна устойчивая связь и отдельный радиодиапазон.</w:t>
+      </w:r>
+    </w:p>
+    <w:p>
+      <w:r>
+        <w:br w:type="page"/>
+      </w:r>
+    </w:p>
+    <w:p>
+      <w:pPr>
+        <w:pStyle w:val="Heading1"/>
+      </w:pPr>
+      <w:r>
+        <w:rPr>
+          <w:rFonts w:ascii="Times New Roman" w:hAnsi="Times New Roman"/>
+          <w:b/>
+          <w:sz w:val="28"/>
+        </w:rPr>
+        <w:t>53. Протокол MQTT</w:t>
+      </w:r>
+    </w:p>
+    <w:p>
+      <w:pPr>
+        <w:spacing w:after="120" w:line="276" w:lineRule="auto"/>
+        <w:ind w:firstLine="425"/>
+      </w:pPr>
+      <w:r>
+        <w:rPr>
+          <w:rFonts w:ascii="Times New Roman" w:hAnsi="Times New Roman"/>
+          <w:sz w:val="24"/>
+        </w:rPr>
+        <w:t>MQTT (Message Queuing Telemetry Transport) — легкий протокол обмена телеметрическими сообщениями, построенный по модели «публикация/подписка» (publish/subscribe). Он специально подходит для IoT и M2M, где устройства часто имеют ограниченные ресурсы, нестабильный канал связи и передают небольшие сообщения.</w:t>
+      </w:r>
+    </w:p>
+    <w:p>
+      <w:pPr>
+        <w:spacing w:after="120" w:line="276" w:lineRule="auto"/>
+        <w:ind w:firstLine="425"/>
+      </w:pPr>
+      <w:r>
+        <w:rPr>
+          <w:rFonts w:ascii="Times New Roman" w:hAnsi="Times New Roman"/>
+          <w:sz w:val="24"/>
+        </w:rPr>
+        <w:t>В отличие от классического HTTP, где клиент напрямую запрашивает ресурс у сервера, MQTT использует брокер сообщений. Устройство-публикатор отправляет сообщение в определенную тему (topic), а устройства или приложения-подписчики получают все сообщения по темам, на которые они подписаны. Публикатор и подписчик не обязаны знать друг о друге; их связывает брокер.</w:t>
+      </w:r>
+    </w:p>
+    <w:p>
+      <w:pPr>
+        <w:spacing w:after="120" w:line="276" w:lineRule="auto"/>
+        <w:ind w:firstLine="425"/>
+      </w:pPr>
+      <w:r>
+        <w:rPr>
+          <w:rFonts w:ascii="Times New Roman" w:hAnsi="Times New Roman"/>
+          <w:sz w:val="24"/>
+        </w:rPr>
+        <w:t>Такая архитектура удобна для IoT. Например, датчик температуры публикует сообщение в topic home/room1/temp, а панель мониторинга, система отопления и облачный архив подписаны на эту тему. Если появляется новый сервис аналитики, его можно просто подписать на нужные темы без изменения прошивки датчика.</w:t>
+      </w:r>
+    </w:p>
+    <w:p>
+      <w:pPr>
+        <w:spacing w:after="120" w:line="276" w:lineRule="auto"/>
+        <w:ind w:firstLine="425"/>
+      </w:pPr>
+      <w:r>
+        <w:rPr>
+          <w:rFonts w:ascii="Times New Roman" w:hAnsi="Times New Roman"/>
+          <w:sz w:val="24"/>
+        </w:rPr>
+        <w:t>MQTT был создан для телеметрии, в том числе для датчиков удаленных объектов, а затем получил широкое применение во встраиваемых системах, мобильных приложениях и облачных IoT-платформах. Его преимущества — малый служебный трафик, простота, поддержка разных уровней качества доставки QoS, возможность работы при плохой связи, масштабируемость через брокеры.</w:t>
+      </w:r>
+    </w:p>
+    <w:p>
+      <w:pPr>
+        <w:spacing w:after="120" w:line="276" w:lineRule="auto"/>
+        <w:ind w:firstLine="425"/>
+      </w:pPr>
+      <w:r>
+        <w:rPr>
+          <w:rFonts w:ascii="Times New Roman" w:hAnsi="Times New Roman"/>
+          <w:sz w:val="24"/>
+        </w:rPr>
+        <w:t>В IoT MQTT часто используется между устройствами, шлюзами, облаками и приложениями. Он не заменяет физические протоколы вроде ZigBee или BLE: датчик может передавать данные на шлюз по ZigBee, а шлюз публикует их в облако через MQTT. Поэтому MQTT является одним из ключевых прикладных протоколов IoT.</w:t>
+      </w:r>
+    </w:p>
+    <w:tbl>
+      <w:tblPr>
+        <w:tblStyle w:val="TableGrid"/>
+        <w:tblW w:type="auto" w:w="0"/>
+        <w:tblLook w:firstColumn="1" w:firstRow="1" w:lastColumn="0" w:lastRow="0" w:noHBand="0" w:noVBand="1" w:val="04A0"/>
+      </w:tblPr>
+      <w:tblGrid>
+        <w:gridCol w:w="4986"/>
+        <w:gridCol w:w="4986"/>
+      </w:tblGrid>
+      <w:tr>
+        <w:tc>
+          <w:tcPr>
+            <w:tcW w:type="dxa" w:w="4986"/>
+          </w:tcPr>
+          <w:p>
+            <w:r>
+              <w:rPr>
+                <w:rFonts w:ascii="Times New Roman" w:hAnsi="Times New Roman"/>
+                <w:b/>
+                <w:sz w:val="20"/>
+              </w:rPr>
+              <w:t>Элемент MQTT</w:t>
+            </w:r>
+          </w:p>
+        </w:tc>
+        <w:tc>
+          <w:tcPr>
+            <w:tcW w:type="dxa" w:w="4986"/>
+          </w:tcPr>
+          <w:p>
+            <w:r>
+              <w:rPr>
+                <w:rFonts w:ascii="Times New Roman" w:hAnsi="Times New Roman"/>
+                <w:b/>
+                <w:sz w:val="20"/>
+              </w:rPr>
+              <w:t>Назначение</w:t>
+            </w:r>
+          </w:p>
+        </w:tc>
+      </w:tr>
+      <w:tr>
+        <w:tc>
+          <w:tcPr>
+            <w:tcW w:type="dxa" w:w="4986"/>
+          </w:tcPr>
+          <w:p>
+            <w:r>
+              <w:rPr>
+                <w:rFonts w:ascii="Times New Roman" w:hAnsi="Times New Roman"/>
+                <w:sz w:val="20"/>
+              </w:rPr>
+              <w:t>Publisher</w:t>
+            </w:r>
+          </w:p>
+        </w:tc>
+        <w:tc>
+          <w:tcPr>
+            <w:tcW w:type="dxa" w:w="4986"/>
+          </w:tcPr>
+          <w:p>
+            <w:r>
+              <w:rPr>
+                <w:rFonts w:ascii="Times New Roman" w:hAnsi="Times New Roman"/>
+                <w:sz w:val="20"/>
+              </w:rPr>
+              <w:t>Публикует сообщение в тему</w:t>
+            </w:r>
+          </w:p>
+        </w:tc>
+      </w:tr>
+      <w:tr>
+        <w:tc>
+          <w:tcPr>
+            <w:tcW w:type="dxa" w:w="4986"/>
+          </w:tcPr>
+          <w:p>
+            <w:r>
+              <w:rPr>
+                <w:rFonts w:ascii="Times New Roman" w:hAnsi="Times New Roman"/>
+                <w:sz w:val="20"/>
+              </w:rPr>
+              <w:t>Subscriber</w:t>
+            </w:r>
+          </w:p>
+        </w:tc>
+        <w:tc>
+          <w:tcPr>
+            <w:tcW w:type="dxa" w:w="4986"/>
+          </w:tcPr>
+          <w:p>
+            <w:r>
+              <w:rPr>
+                <w:rFonts w:ascii="Times New Roman" w:hAnsi="Times New Roman"/>
+                <w:sz w:val="20"/>
+              </w:rPr>
+              <w:t>Подписывается на тему и получает сообщения</w:t>
+            </w:r>
+          </w:p>
+        </w:tc>
+      </w:tr>
+      <w:tr>
+        <w:tc>
+          <w:tcPr>
+            <w:tcW w:type="dxa" w:w="4986"/>
+          </w:tcPr>
+          <w:p>
+            <w:r>
+              <w:rPr>
+                <w:rFonts w:ascii="Times New Roman" w:hAnsi="Times New Roman"/>
+                <w:sz w:val="20"/>
+              </w:rPr>
+              <w:t>Broker</w:t>
+            </w:r>
+          </w:p>
+        </w:tc>
+        <w:tc>
+          <w:tcPr>
+            <w:tcW w:type="dxa" w:w="4986"/>
+          </w:tcPr>
+          <w:p>
+            <w:r>
+              <w:rPr>
+                <w:rFonts w:ascii="Times New Roman" w:hAnsi="Times New Roman"/>
+                <w:sz w:val="20"/>
+              </w:rPr>
+              <w:t>Посредник, принимает публикации и рассылает подписчикам</w:t>
+            </w:r>
+          </w:p>
+        </w:tc>
+      </w:tr>
+      <w:tr>
+        <w:tc>
+          <w:tcPr>
+            <w:tcW w:type="dxa" w:w="4986"/>
+          </w:tcPr>
+          <w:p>
+            <w:r>
+              <w:rPr>
+                <w:rFonts w:ascii="Times New Roman" w:hAnsi="Times New Roman"/>
+                <w:sz w:val="20"/>
+              </w:rPr>
+              <w:t>Topic</w:t>
+            </w:r>
+          </w:p>
+        </w:tc>
+        <w:tc>
+          <w:tcPr>
+            <w:tcW w:type="dxa" w:w="4986"/>
+          </w:tcPr>
+          <w:p>
+            <w:r>
+              <w:rPr>
+                <w:rFonts w:ascii="Times New Roman" w:hAnsi="Times New Roman"/>
+                <w:sz w:val="20"/>
+              </w:rPr>
+              <w:t>Иерархическое имя канала сообщений</w:t>
+            </w:r>
+          </w:p>
+        </w:tc>
+      </w:tr>
+      <w:tr>
+        <w:tc>
+          <w:tcPr>
+            <w:tcW w:type="dxa" w:w="4986"/>
+          </w:tcPr>
+          <w:p>
+            <w:r>
+              <w:rPr>
+                <w:rFonts w:ascii="Times New Roman" w:hAnsi="Times New Roman"/>
+                <w:sz w:val="20"/>
+              </w:rPr>
+              <w:t>QoS</w:t>
+            </w:r>
+          </w:p>
+        </w:tc>
+        <w:tc>
+          <w:tcPr>
+            <w:tcW w:type="dxa" w:w="4986"/>
+          </w:tcPr>
+          <w:p>
+            <w:r>
+              <w:rPr>
+                <w:rFonts w:ascii="Times New Roman" w:hAnsi="Times New Roman"/>
+                <w:sz w:val="20"/>
+              </w:rPr>
+              <w:t>Уровень гарантии доставки сообщения</w:t>
+            </w:r>
+          </w:p>
+        </w:tc>
+      </w:tr>
+    </w:tbl>
+    <w:p/>
+    <w:p>
+      <w:r>
+        <w:br w:type="page"/>
+      </w:r>
+    </w:p>
+    <w:p>
+      <w:pPr>
+        <w:pStyle w:val="Heading1"/>
+      </w:pPr>
+      <w:r>
+        <w:rPr>
+          <w:rFonts w:ascii="Times New Roman" w:hAnsi="Times New Roman"/>
+          <w:b/>
+          <w:sz w:val="28"/>
+        </w:rPr>
+        <w:t>54. «Умная планета»</w:t>
+      </w:r>
+    </w:p>
+    <w:p>
+      <w:pPr>
+        <w:spacing w:after="120" w:line="276" w:lineRule="auto"/>
+        <w:ind w:firstLine="425"/>
+      </w:pPr>
+      <w:r>
+        <w:rPr>
+          <w:rFonts w:ascii="Times New Roman" w:hAnsi="Times New Roman"/>
+          <w:sz w:val="24"/>
+        </w:rPr>
+        <w:t>«Умная планета» — глобальная концепция применения IoT, в которой данные от распределенных датчиков, спутников, промышленных систем, транспорта, энергетики и городской инфраструктуры используются для понимания состояния Земли и более рационального управления ресурсами. В материалах отмечается, что человек сможет буквально «держать руку на пульсе» планеты: своевременно реагировать на экологические проблемы, ошибки планирования и угрозы.</w:t>
+      </w:r>
+    </w:p>
+    <w:p>
+      <w:pPr>
+        <w:spacing w:after="120" w:line="276" w:lineRule="auto"/>
+        <w:ind w:firstLine="425"/>
+      </w:pPr>
+      <w:r>
+        <w:rPr>
+          <w:rFonts w:ascii="Times New Roman" w:hAnsi="Times New Roman"/>
+          <w:sz w:val="24"/>
+        </w:rPr>
+        <w:t>Основная идея — превратить планету в наблюдаемую и управляемую систему. Датчики могут фиксировать загрязнение воздуха и воды, состояние лесов, уровень рек, движение транспорта, потребление энергии, состояние инфраструктуры, погодные и климатические параметры. Эти данные объединяются в больших хранилищах, анализируются и используются для принятия решений.</w:t>
+      </w:r>
+    </w:p>
+    <w:p>
+      <w:pPr>
+        <w:spacing w:after="120" w:line="276" w:lineRule="auto"/>
+        <w:ind w:firstLine="425"/>
+      </w:pPr>
+      <w:r>
+        <w:rPr>
+          <w:rFonts w:ascii="Times New Roman" w:hAnsi="Times New Roman"/>
+          <w:sz w:val="24"/>
+        </w:rPr>
+        <w:t>Практические направления: экологический мониторинг, предупреждение чрезвычайных ситуаций, управление природными ресурсами, мониторинг сельского хозяйства, контроль выбросов, наблюдение за океанами и атмосферой, борьба с последствиями стихийных бедствий. Например, сеть датчиков и спутниковых данных может заранее обнаружить засуху, наводнение или лесной пожар и помочь службам быстрее реагировать.</w:t>
+      </w:r>
+    </w:p>
+    <w:p>
+      <w:pPr>
+        <w:spacing w:after="120" w:line="276" w:lineRule="auto"/>
+        <w:ind w:firstLine="425"/>
+      </w:pPr>
+      <w:r>
+        <w:rPr>
+          <w:rFonts w:ascii="Times New Roman" w:hAnsi="Times New Roman"/>
+          <w:sz w:val="24"/>
+        </w:rPr>
+        <w:t>Для реализации «умной планеты» нужны не только датчики, но и большие данные, облачные вычисления, геоинформационные системы, модели прогнозирования, стандарты обмена, безопасность и международное сотрудничество. Это самый широкий уровень IoT: от отдельной «умной вещи» до инфраструктуры, поддерживающей устойчивое развитие общества и экономное использование невозобновляемых ресурсов.</w:t>
+      </w:r>
+    </w:p>
+    <w:p>
+      <w:r>
+        <w:br w:type="page"/>
+      </w:r>
+    </w:p>
+    <w:p>
+      <w:pPr>
+        <w:pStyle w:val="Heading1"/>
+      </w:pPr>
+      <w:r>
+        <w:rPr>
+          <w:rFonts w:ascii="Times New Roman" w:hAnsi="Times New Roman"/>
+          <w:b/>
+          <w:sz w:val="28"/>
+        </w:rPr>
+        <w:t>55. «Умный город»</w:t>
+      </w:r>
+    </w:p>
+    <w:p>
+      <w:pPr>
+        <w:spacing w:after="120" w:line="276" w:lineRule="auto"/>
+        <w:ind w:firstLine="425"/>
+      </w:pPr>
+      <w:r>
+        <w:rPr>
+          <w:rFonts w:ascii="Times New Roman" w:hAnsi="Times New Roman"/>
+          <w:sz w:val="24"/>
+        </w:rPr>
+        <w:t>«Умный город» — городская среда, в которой инфраструктура, муниципальные услуги и сервисы связаны через датчики, сети, платформы данных и системы управления. Цель — сделать город более безопасным, эффективным, экологичным и удобным для жителей.</w:t>
+      </w:r>
+    </w:p>
+    <w:p>
+      <w:pPr>
+        <w:spacing w:after="120" w:line="276" w:lineRule="auto"/>
+        <w:ind w:firstLine="425"/>
+      </w:pPr>
+      <w:r>
+        <w:rPr>
+          <w:rFonts w:ascii="Times New Roman" w:hAnsi="Times New Roman"/>
+          <w:sz w:val="24"/>
+        </w:rPr>
+        <w:t>В материалах перечислены ключевые области: образование, здравоохранение, общественная безопасность, ЖКХ, транспорт и другие муниципальные услуги. IoT позволяет получать данные в реальном времени: загруженность дорог, состояние светофоров, наличие свободных парковок, уровень мусора в контейнерах, потребление воды и тепла, качество воздуха, аварии на сетях.</w:t>
+      </w:r>
+    </w:p>
+    <w:p>
+      <w:pPr>
+        <w:spacing w:after="120" w:line="276" w:lineRule="auto"/>
+        <w:ind w:firstLine="425"/>
+      </w:pPr>
+      <w:r>
+        <w:rPr>
+          <w:rFonts w:ascii="Times New Roman" w:hAnsi="Times New Roman"/>
+          <w:sz w:val="24"/>
+        </w:rPr>
+        <w:t>На основе этих данных городские службы могут быстрее принимать решения. Например, умное освещение снижает яркость ночью при отсутствии людей и повышает ее при движении; датчики протечек помогают обнаружить аварии в водопроводе; интеллектуальные парковки показывают свободные места; транспортные системы оптимизируют маршруты и светофорные фазы.</w:t>
+      </w:r>
+    </w:p>
+    <w:p>
+      <w:pPr>
+        <w:spacing w:after="120" w:line="276" w:lineRule="auto"/>
+        <w:ind w:firstLine="425"/>
+      </w:pPr>
+      <w:r>
+        <w:rPr>
+          <w:rFonts w:ascii="Times New Roman" w:hAnsi="Times New Roman"/>
+          <w:sz w:val="24"/>
+        </w:rPr>
+        <w:t>«Умный город» требует интеграции разных систем: датчиков, камер, диспетчерских центров, мобильных приложений, облачных платформ, геоинформационных сервисов и аналитики. Особое значение имеют безопасность и защита персональных данных, потому что городские IoT-системы часто собирают чувствительную информацию о перемещениях и поведении людей.</w:t>
+      </w:r>
+    </w:p>
+    <w:p>
+      <w:pPr>
+        <w:spacing w:after="120" w:line="276" w:lineRule="auto"/>
+        <w:ind w:firstLine="425"/>
+      </w:pPr>
+      <w:r>
+        <w:rPr>
+          <w:rFonts w:ascii="Times New Roman" w:hAnsi="Times New Roman"/>
+          <w:sz w:val="24"/>
+        </w:rPr>
+        <w:t>Хороший умный город не просто устанавливает датчики, а улучшает реальные процессы: сокращает пробки, снижает коммунальные потери, повышает качество воздуха, ускоряет реакцию на аварии и делает услуги доступнее. Поэтому IoT здесь выступает инструментом управления городской жизнью, а не самоцелью.</w:t>
+      </w:r>
+    </w:p>
+    <w:p>
+      <w:r>
+        <w:br w:type="page"/>
+      </w:r>
+    </w:p>
+    <w:p>
+      <w:pPr>
+        <w:pStyle w:val="Heading1"/>
+      </w:pPr>
+      <w:r>
+        <w:rPr>
+          <w:rFonts w:ascii="Times New Roman" w:hAnsi="Times New Roman"/>
+          <w:b/>
+          <w:sz w:val="28"/>
+        </w:rPr>
+        <w:t>56. «Умный дом»</w:t>
+      </w:r>
+    </w:p>
+    <w:p>
+      <w:pPr>
+        <w:spacing w:after="120" w:line="276" w:lineRule="auto"/>
+        <w:ind w:firstLine="425"/>
+      </w:pPr>
+      <w:r>
+        <w:rPr>
+          <w:rFonts w:ascii="Times New Roman" w:hAnsi="Times New Roman"/>
+          <w:sz w:val="24"/>
+        </w:rPr>
+        <w:t>«Умный дом» — система автоматизации жилья, которая распознает ситуации внутри дома и реагирует на них так, чтобы обеспечить безопасность, комфорт и ресурсосбережение. Это один из самых понятных бытовых примеров IoT.</w:t>
+      </w:r>
+    </w:p>
+    <w:p>
+      <w:pPr>
+        <w:spacing w:after="120" w:line="276" w:lineRule="auto"/>
+        <w:ind w:firstLine="425"/>
+      </w:pPr>
+      <w:r>
+        <w:rPr>
+          <w:rFonts w:ascii="Times New Roman" w:hAnsi="Times New Roman"/>
+          <w:sz w:val="24"/>
+        </w:rPr>
+        <w:t>Компоненты умного дома: датчики движения, открытия дверей и окон, температуры, влажности, освещенности, дыма, газа, протечки; исполнительные устройства — реле, розетки, замки, клапаны, термостаты, приводы штор, освещение; контроллер или шлюз; мобильное приложение или web-интерфейс. Для связи могут использоваться Wi‑Fi, ZigBee, Z-Wave, BLE, DECT ULE, Ethernet и MQTT.</w:t>
+      </w:r>
+    </w:p>
+    <w:p>
+      <w:pPr>
+        <w:spacing w:after="120" w:line="276" w:lineRule="auto"/>
+        <w:ind w:firstLine="425"/>
+      </w:pPr>
+      <w:r>
+        <w:rPr>
+          <w:rFonts w:ascii="Times New Roman" w:hAnsi="Times New Roman"/>
+          <w:sz w:val="24"/>
+        </w:rPr>
+        <w:t>Сценарии работы: автоматическое включение света при движении, поддержание температуры по расписанию, отключение электроприборов при уходе, перекрытие воды при протечке, отправка уведомления при задымлении или открытии двери, имитация присутствия владельца, голосовое управление. Важна не отдельная «умная лампочка», а связанная система правил и событий.</w:t>
+      </w:r>
+    </w:p>
+    <w:p>
+      <w:pPr>
+        <w:spacing w:after="120" w:line="276" w:lineRule="auto"/>
+        <w:ind w:firstLine="425"/>
+      </w:pPr>
+      <w:r>
+        <w:rPr>
+          <w:rFonts w:ascii="Times New Roman" w:hAnsi="Times New Roman"/>
+          <w:sz w:val="24"/>
+        </w:rPr>
+        <w:t>Преимущества умного дома — комфорт, экономия энергии, безопасность, удаленный контроль и гибкая автоматизация. Например, отопление может снижаться ночью и повышаться перед пробуждением; свет выключается, когда в комнате никого нет; камера и датчик открытия двери отправляют уведомление владельцу.</w:t>
+      </w:r>
+    </w:p>
+    <w:p>
+      <w:pPr>
+        <w:spacing w:after="120" w:line="276" w:lineRule="auto"/>
+        <w:ind w:firstLine="425"/>
+      </w:pPr>
+      <w:r>
+        <w:rPr>
+          <w:rFonts w:ascii="Times New Roman" w:hAnsi="Times New Roman"/>
+          <w:sz w:val="24"/>
+        </w:rPr>
+        <w:t>Проблемы — совместимость устройств разных производителей, зависимость от облачных сервисов, кибербезопасность, приватность, надежность связи и сложность настройки. Правильно спроектированный умный дом должен продолжать выполнять критические функции даже при сбое Интернета, а внешние подключения должны быть защищены.</w:t>
+      </w:r>
+    </w:p>
+    <w:p>
+      <w:r>
+        <w:br w:type="page"/>
+      </w:r>
+    </w:p>
+    <w:p>
+      <w:pPr>
+        <w:pStyle w:val="Heading1"/>
+      </w:pPr>
+      <w:r>
+        <w:rPr>
+          <w:rFonts w:ascii="Times New Roman" w:hAnsi="Times New Roman"/>
+          <w:b/>
+          <w:sz w:val="28"/>
+        </w:rPr>
+        <w:t>57. «Умная энергия»</w:t>
+      </w:r>
+    </w:p>
+    <w:p>
+      <w:pPr>
+        <w:spacing w:after="120" w:line="276" w:lineRule="auto"/>
+        <w:ind w:firstLine="425"/>
+      </w:pPr>
+      <w:r>
+        <w:rPr>
+          <w:rFonts w:ascii="Times New Roman" w:hAnsi="Times New Roman"/>
+          <w:sz w:val="24"/>
+        </w:rPr>
+        <w:t>«Умная энергия» связана с применением IoT в электроэнергетике и прежде всего с концепцией Smart Grid — интеллектуальных энергосетей. В материалах это направление названо одним из наиболее проработанных вариантов применения IoT.</w:t>
+      </w:r>
+    </w:p>
+    <w:p>
+      <w:pPr>
+        <w:spacing w:after="120" w:line="276" w:lineRule="auto"/>
+        <w:ind w:firstLine="425"/>
+      </w:pPr>
+      <w:r>
+        <w:rPr>
+          <w:rFonts w:ascii="Times New Roman" w:hAnsi="Times New Roman"/>
+          <w:sz w:val="24"/>
+        </w:rPr>
+        <w:t>Smart Grid основана на том, что поставщик и потребитель получают объективную картину использования энергоресурсов за счет мониторинга всех участков сети. Умные счетчики, датчики нагрузки, контроллеры качества электроэнергии и системы связи позволяют оперативно управлять производством, передачей, распределением и потреблением энергии.</w:t>
+      </w:r>
+    </w:p>
+    <w:p>
+      <w:pPr>
+        <w:spacing w:after="120" w:line="276" w:lineRule="auto"/>
+        <w:ind w:firstLine="425"/>
+      </w:pPr>
+      <w:r>
+        <w:rPr>
+          <w:rFonts w:ascii="Times New Roman" w:hAnsi="Times New Roman"/>
+          <w:sz w:val="24"/>
+        </w:rPr>
+        <w:t>В случае аварии интеллектуальная сеть способна автоматически определить проблемный участок, изолировать его и направить электроэнергию по резервной схеме. Это сокращает время отключений и повышает надежность электроснабжения. Для потребителей умная энергетика означает возможность гибко регулировать потребление вручную или автоматически: например, переносить работу энергоемких приборов на периоды низкой нагрузки.</w:t>
+      </w:r>
+    </w:p>
+    <w:p>
+      <w:pPr>
+        <w:spacing w:after="120" w:line="276" w:lineRule="auto"/>
+        <w:ind w:firstLine="425"/>
+      </w:pPr>
+      <w:r>
+        <w:rPr>
+          <w:rFonts w:ascii="Times New Roman" w:hAnsi="Times New Roman"/>
+          <w:sz w:val="24"/>
+        </w:rPr>
+        <w:t>В материалах выделены Smart Routing и Smart Metering. Smart Routing — интеллектуальная маршрутизация энергопотоков, контроль нагрузки, качества, самовосстановление сетей, хранение энергии. Smart Metering — умные измерения: интеллектуальные счетчики, системы умного здания и умные бытовые приборы.</w:t>
+      </w:r>
+    </w:p>
+    <w:p>
+      <w:pPr>
+        <w:spacing w:after="120" w:line="276" w:lineRule="auto"/>
+        <w:ind w:firstLine="425"/>
+      </w:pPr>
+      <w:r>
+        <w:rPr>
+          <w:rFonts w:ascii="Times New Roman" w:hAnsi="Times New Roman"/>
+          <w:sz w:val="24"/>
+        </w:rPr>
+        <w:t>IoT в энергетике помогает интегрировать возобновляемые источники, управлять зарядкой электромобилей, снижать потери, обнаруживать хищения и повышать энергоэффективность. Главные требования — надежность, безопасность, защита от кибератак и точность измерений, потому что энергетическая инфраструктура критически важна для общества.</w:t>
+      </w:r>
+    </w:p>
+    <w:p>
+      <w:r>
+        <w:br w:type="page"/>
+      </w:r>
+    </w:p>
+    <w:p>
+      <w:pPr>
+        <w:pStyle w:val="Heading1"/>
+      </w:pPr>
+      <w:r>
+        <w:rPr>
+          <w:rFonts w:ascii="Times New Roman" w:hAnsi="Times New Roman"/>
+          <w:b/>
+          <w:sz w:val="28"/>
+        </w:rPr>
+        <w:t>58. «Умный транспорт»</w:t>
+      </w:r>
+    </w:p>
+    <w:p>
+      <w:pPr>
+        <w:spacing w:after="120" w:line="276" w:lineRule="auto"/>
+        <w:ind w:firstLine="425"/>
+      </w:pPr>
+      <w:r>
+        <w:rPr>
+          <w:rFonts w:ascii="Times New Roman" w:hAnsi="Times New Roman"/>
+          <w:sz w:val="24"/>
+        </w:rPr>
+        <w:t>«Умный транспорт» — применение IoT, сенсорных сетей, навигации, связи и аналитики для повышения удобства, скорости и безопасности перемещения людей и грузов. В материалах отмечается, что такое направление делает перемещение пассажиров из одной точки в другую более удобным, быстрым и безопасным.</w:t>
+      </w:r>
+    </w:p>
+    <w:p>
+      <w:pPr>
+        <w:spacing w:after="120" w:line="276" w:lineRule="auto"/>
+        <w:ind w:firstLine="425"/>
+      </w:pPr>
+      <w:r>
+        <w:rPr>
+          <w:rFonts w:ascii="Times New Roman" w:hAnsi="Times New Roman"/>
+          <w:sz w:val="24"/>
+        </w:rPr>
+        <w:t>Компоненты умного транспорта: GPS/ГЛОНАСС-трекеры, датчики состояния автомобиля, камеры, дорожные контроллеры, интеллектуальные светофоры, электронные табло, RFID/NFC-билеты, системы оплаты, датчики парковок, мобильные приложения. Данные передаются в диспетчерские центры и сервисы, где анализируются в реальном времени.</w:t>
+      </w:r>
+    </w:p>
+    <w:p>
+      <w:pPr>
+        <w:spacing w:after="120" w:line="276" w:lineRule="auto"/>
+        <w:ind w:firstLine="425"/>
+      </w:pPr>
+      <w:r>
+        <w:rPr>
+          <w:rFonts w:ascii="Times New Roman" w:hAnsi="Times New Roman"/>
+          <w:sz w:val="24"/>
+        </w:rPr>
+        <w:t>Примеры: мониторинг общественного транспорта и прогноз времени прибытия; автоматическая оплата проезда; управление светофорами по фактическому трафику; обнаружение ДТП; оптимизация маршрутов грузовиков; контроль топлива; интеллектуальные парковки; информирование водителя об оптимальном маршруте. В логистике IoT позволяет отслеживать контейнеры, температуру груза, местоположение транспорта и состояние товара.</w:t>
+      </w:r>
+    </w:p>
+    <w:p>
+      <w:pPr>
+        <w:spacing w:after="120" w:line="276" w:lineRule="auto"/>
+        <w:ind w:firstLine="425"/>
+      </w:pPr>
+      <w:r>
+        <w:rPr>
+          <w:rFonts w:ascii="Times New Roman" w:hAnsi="Times New Roman"/>
+          <w:sz w:val="24"/>
+        </w:rPr>
+        <w:t>Отдельное направление — взаимодействие транспортных средств между собой и с инфраструктурой: V2V и V2I. Машины могут обмениваться предупреждениями об авариях, торможении, гололеде, дорожных работах. Это повышает безопасность и является шагом к автономному транспорту.</w:t>
+      </w:r>
+    </w:p>
+    <w:p>
+      <w:pPr>
+        <w:spacing w:after="120" w:line="276" w:lineRule="auto"/>
+        <w:ind w:firstLine="425"/>
+      </w:pPr>
+      <w:r>
+        <w:rPr>
+          <w:rFonts w:ascii="Times New Roman" w:hAnsi="Times New Roman"/>
+          <w:sz w:val="24"/>
+        </w:rPr>
+        <w:t>Проблемы умного транспорта — надежность связи, задержки, безопасность данных, защита от вмешательства в управление, стандартизация и стоимость инфраструктуры. Но эффект может быть большим: меньше пробок, ниже расход топлива, быстрее реагирование служб, безопаснее дороги и удобнее городской транспорт.</w:t>
+      </w:r>
+    </w:p>
+    <w:p>
+      <w:r>
+        <w:br w:type="page"/>
+      </w:r>
+    </w:p>
+    <w:p>
+      <w:pPr>
+        <w:pStyle w:val="Heading1"/>
+      </w:pPr>
+      <w:r>
+        <w:rPr>
+          <w:rFonts w:ascii="Times New Roman" w:hAnsi="Times New Roman"/>
+          <w:b/>
+          <w:sz w:val="28"/>
+        </w:rPr>
+        <w:t>59. «Умное производство»</w:t>
+      </w:r>
+    </w:p>
+    <w:p>
+      <w:pPr>
+        <w:spacing w:after="120" w:line="276" w:lineRule="auto"/>
+        <w:ind w:firstLine="425"/>
+      </w:pPr>
+      <w:r>
+        <w:rPr>
+          <w:rFonts w:ascii="Times New Roman" w:hAnsi="Times New Roman"/>
+          <w:sz w:val="24"/>
+        </w:rPr>
+        <w:t>«Умное производство» — применение IoT в промышленности, связанное с четвертой индустриальной революцией и концепциями Industry 4.0/IIoT. Если первые индустриальные революции были связаны с паровой машиной, конвейером и компьютерами, то современный этап основан на объединении оборудования, датчиков, роботов, информационных систем и аналитики в единую цифровую производственную среду.</w:t>
+      </w:r>
+    </w:p>
+    <w:p>
+      <w:pPr>
+        <w:spacing w:after="120" w:line="276" w:lineRule="auto"/>
+        <w:ind w:firstLine="425"/>
+      </w:pPr>
+      <w:r>
+        <w:rPr>
+          <w:rFonts w:ascii="Times New Roman" w:hAnsi="Times New Roman"/>
+          <w:sz w:val="24"/>
+        </w:rPr>
+        <w:t>В умном производстве сенсорами оснащаются станки, инструменты, транспорт, здания, склады, готовая продукция и даже отдельные детали. Они регулярно сообщают о своем состоянии, местоположении, нагрузке, температуре, вибрации, потреблении энергии и качестве выполнения операций. Эти данные позволяют оптимизировать все: от складских запасов до выполнения производственных заданий.</w:t>
+      </w:r>
+    </w:p>
+    <w:p>
+      <w:pPr>
+        <w:spacing w:after="120" w:line="276" w:lineRule="auto"/>
+        <w:ind w:firstLine="425"/>
+      </w:pPr>
+      <w:r>
+        <w:rPr>
+          <w:rFonts w:ascii="Times New Roman" w:hAnsi="Times New Roman"/>
+          <w:sz w:val="24"/>
+        </w:rPr>
+        <w:t>Ключевые сценарии: предиктивное обслуживание оборудования, контроль качества, цифровые двойники, прослеживаемость продукции, автоматизация логистики внутри завода, мониторинг энергопотребления, управление роботами и производственными линиями, адаптация производства под заказ. Например, автомобиль после продажи может оставаться связанным с производителем: данные о работе узлов помогают выявлять дефекты, планировать сервис и улучшать следующие модели.</w:t>
+      </w:r>
+    </w:p>
+    <w:p>
+      <w:pPr>
+        <w:spacing w:after="120" w:line="276" w:lineRule="auto"/>
+        <w:ind w:firstLine="425"/>
+      </w:pPr>
+      <w:r>
+        <w:rPr>
+          <w:rFonts w:ascii="Times New Roman" w:hAnsi="Times New Roman"/>
+          <w:sz w:val="24"/>
+        </w:rPr>
+        <w:t>Преимущества умного производства — снижение простоев, экономия ресурсов, повышение качества, гибкость выпуска, прозрачность процессов и безопасность персонала. Но внедрение требует промышленной надежности, защищенных сетей, совместимости старого оборудования с новыми платформами и подготовки специалистов.</w:t>
+      </w:r>
+    </w:p>
+    <w:p>
+      <w:pPr>
+        <w:spacing w:after="120" w:line="276" w:lineRule="auto"/>
+        <w:ind w:firstLine="425"/>
+      </w:pPr>
+      <w:r>
+        <w:rPr>
+          <w:rFonts w:ascii="Times New Roman" w:hAnsi="Times New Roman"/>
+          <w:sz w:val="24"/>
+        </w:rPr>
+        <w:t>IoT здесь особенно важен, потому что он превращает физическое производство в измеряемую и управляемую цифровую систему. Без постоянных данных от оборудования невозможно реализовать полноценную промышленную аналитику и автоматическое управление.</w:t>
+      </w:r>
+    </w:p>
+    <w:p>
+      <w:r>
+        <w:br w:type="page"/>
+      </w:r>
+    </w:p>
+    <w:p>
+      <w:pPr>
+        <w:pStyle w:val="Heading1"/>
+      </w:pPr>
+      <w:r>
+        <w:rPr>
+          <w:rFonts w:ascii="Times New Roman" w:hAnsi="Times New Roman"/>
+          <w:b/>
+          <w:sz w:val="28"/>
+        </w:rPr>
+        <w:t>60. «Умная медицина»</w:t>
+      </w:r>
+    </w:p>
+    <w:p>
+      <w:pPr>
+        <w:spacing w:after="120" w:line="276" w:lineRule="auto"/>
+        <w:ind w:firstLine="425"/>
+      </w:pPr>
+      <w:r>
+        <w:rPr>
+          <w:rFonts w:ascii="Times New Roman" w:hAnsi="Times New Roman"/>
+          <w:sz w:val="24"/>
+        </w:rPr>
+        <w:t>«Умная медицина» — применение IoT для удаленного мониторинга здоровья, управления медицинским оборудованием, электронных медицинских данных, автоматизации лечения и повышения доступности медицинских услуг. В материалах отмечается, что врачи и пациенты смогут получать удаленный доступ к дорогому оборудованию и электронной истории болезни, а также использовать системы дистанционного наблюдения.</w:t>
+      </w:r>
+    </w:p>
+    <w:p>
+      <w:pPr>
+        <w:spacing w:after="120" w:line="276" w:lineRule="auto"/>
+        <w:ind w:firstLine="425"/>
+      </w:pPr>
+      <w:r>
+        <w:rPr>
+          <w:rFonts w:ascii="Times New Roman" w:hAnsi="Times New Roman"/>
+          <w:sz w:val="24"/>
+        </w:rPr>
+        <w:t>Основные устройства: носимые датчики пульса, давления, температуры, кислорода в крови, уровня глюкозы, ЭКГ; домашние медицинские приборы; умные дозаторы лекарств; трекеры активности; больничные RFID-метки; оборудование с сетевым интерфейсом. Эти устройства передают данные врачу, пациенту, родственникам или медицинской платформе.</w:t>
+      </w:r>
+    </w:p>
+    <w:p>
+      <w:pPr>
+        <w:spacing w:after="120" w:line="276" w:lineRule="auto"/>
+        <w:ind w:firstLine="425"/>
+      </w:pPr>
+      <w:r>
+        <w:rPr>
+          <w:rFonts w:ascii="Times New Roman" w:hAnsi="Times New Roman"/>
+          <w:sz w:val="24"/>
+        </w:rPr>
+        <w:t>Типовые сценарии: наблюдение за пациентами с хроническими заболеваниями, контроль пожилых людей, дистанционная реабилитация, автоматическое напоминание о лекарствах, обнаружение падений, мониторинг после операции, учет лекарств и оборудования в больнице. В экстренной ситуации система может распознать опасное состояние и отправить сигнал врачу или службе помощи.</w:t>
+      </w:r>
+    </w:p>
+    <w:p>
+      <w:pPr>
+        <w:spacing w:after="120" w:line="276" w:lineRule="auto"/>
+        <w:ind w:firstLine="425"/>
+      </w:pPr>
+      <w:r>
+        <w:rPr>
+          <w:rFonts w:ascii="Times New Roman" w:hAnsi="Times New Roman"/>
+          <w:sz w:val="24"/>
+        </w:rPr>
+        <w:t>Преимущества умной медицины — раннее выявление проблем, снижение числа визитов в больницу, персонализированное лечение, доступность помощи в удаленных регионах, контроль качества ухода. Для больниц IoT помогает отслеживать оборудование, лекарства, пациентов и загруженность ресурсов.</w:t>
+      </w:r>
+    </w:p>
+    <w:p>
+      <w:pPr>
+        <w:spacing w:after="120" w:line="276" w:lineRule="auto"/>
+        <w:ind w:firstLine="425"/>
+      </w:pPr>
+      <w:r>
+        <w:rPr>
+          <w:rFonts w:ascii="Times New Roman" w:hAnsi="Times New Roman"/>
+          <w:sz w:val="24"/>
+        </w:rPr>
+        <w:t>Самые важные требования — точность измерений, надежность, защита персональных медицинских данных и ответственность за автоматические решения. Ошибка датчика или утечка данных в медицине особенно критичны. Поэтому умная медицина должна сочетать IoT с сертификацией устройств, безопасной передачей, шифрованием, контролем доступа и участием врача в принятии значимых решений.</w:t>
+      </w:r>
+    </w:p>
+    <w:tbl>
+      <w:tblPr>
+        <w:tblStyle w:val="TableGrid"/>
+        <w:tblW w:type="auto" w:w="0"/>
+        <w:tblLook w:firstColumn="1" w:firstRow="1" w:lastColumn="0" w:lastRow="0" w:noHBand="0" w:noVBand="1" w:val="04A0"/>
+      </w:tblPr>
+      <w:tblGrid>
+        <w:gridCol w:w="4986"/>
+        <w:gridCol w:w="4986"/>
+      </w:tblGrid>
+      <w:tr>
+        <w:tc>
+          <w:tcPr>
+            <w:tcW w:type="dxa" w:w="4986"/>
+          </w:tcPr>
+          <w:p>
+            <w:r>
+              <w:rPr>
+                <w:rFonts w:ascii="Times New Roman" w:hAnsi="Times New Roman"/>
+                <w:b/>
+                <w:sz w:val="20"/>
+              </w:rPr>
+              <w:t>Направление</w:t>
+            </w:r>
+          </w:p>
+        </w:tc>
+        <w:tc>
+          <w:tcPr>
+            <w:tcW w:type="dxa" w:w="4986"/>
+          </w:tcPr>
+          <w:p>
+            <w:r>
+              <w:rPr>
+                <w:rFonts w:ascii="Times New Roman" w:hAnsi="Times New Roman"/>
+                <w:b/>
+                <w:sz w:val="20"/>
+              </w:rPr>
+              <w:t>Что дает IoT</w:t>
+            </w:r>
+          </w:p>
+        </w:tc>
+      </w:tr>
+      <w:tr>
+        <w:tc>
+          <w:tcPr>
+            <w:tcW w:type="dxa" w:w="4986"/>
+          </w:tcPr>
+          <w:p>
+            <w:r>
+              <w:rPr>
+                <w:rFonts w:ascii="Times New Roman" w:hAnsi="Times New Roman"/>
+                <w:sz w:val="20"/>
+              </w:rPr>
+              <w:t>Умная планета</w:t>
+            </w:r>
+          </w:p>
+        </w:tc>
+        <w:tc>
+          <w:tcPr>
+            <w:tcW w:type="dxa" w:w="4986"/>
+          </w:tcPr>
+          <w:p>
+            <w:r>
+              <w:rPr>
+                <w:rFonts w:ascii="Times New Roman" w:hAnsi="Times New Roman"/>
+                <w:sz w:val="20"/>
+              </w:rPr>
+              <w:t>Глобальный экологический и ресурсный мониторинг</w:t>
+            </w:r>
+          </w:p>
+        </w:tc>
+      </w:tr>
+      <w:tr>
+        <w:tc>
+          <w:tcPr>
+            <w:tcW w:type="dxa" w:w="4986"/>
+          </w:tcPr>
+          <w:p>
+            <w:r>
+              <w:rPr>
+                <w:rFonts w:ascii="Times New Roman" w:hAnsi="Times New Roman"/>
+                <w:sz w:val="20"/>
+              </w:rPr>
+              <w:t>Умный город</w:t>
+            </w:r>
+          </w:p>
+        </w:tc>
+        <w:tc>
+          <w:tcPr>
+            <w:tcW w:type="dxa" w:w="4986"/>
+          </w:tcPr>
+          <w:p>
+            <w:r>
+              <w:rPr>
+                <w:rFonts w:ascii="Times New Roman" w:hAnsi="Times New Roman"/>
+                <w:sz w:val="20"/>
+              </w:rPr>
+              <w:t>Оптимизация транспорта, ЖКХ, безопасности и услуг</w:t>
+            </w:r>
+          </w:p>
+        </w:tc>
+      </w:tr>
+      <w:tr>
+        <w:tc>
+          <w:tcPr>
+            <w:tcW w:type="dxa" w:w="4986"/>
+          </w:tcPr>
+          <w:p>
+            <w:r>
+              <w:rPr>
+                <w:rFonts w:ascii="Times New Roman" w:hAnsi="Times New Roman"/>
+                <w:sz w:val="20"/>
+              </w:rPr>
+              <w:t>Умный дом</w:t>
+            </w:r>
+          </w:p>
+        </w:tc>
+        <w:tc>
+          <w:tcPr>
+            <w:tcW w:type="dxa" w:w="4986"/>
+          </w:tcPr>
+          <w:p>
+            <w:r>
+              <w:rPr>
+                <w:rFonts w:ascii="Times New Roman" w:hAnsi="Times New Roman"/>
+                <w:sz w:val="20"/>
+              </w:rPr>
+              <w:t>Комфорт, безопасность и энергосбережение</w:t>
+            </w:r>
+          </w:p>
+        </w:tc>
+      </w:tr>
+      <w:tr>
+        <w:tc>
+          <w:tcPr>
+            <w:tcW w:type="dxa" w:w="4986"/>
+          </w:tcPr>
+          <w:p>
+            <w:r>
+              <w:rPr>
+                <w:rFonts w:ascii="Times New Roman" w:hAnsi="Times New Roman"/>
+                <w:sz w:val="20"/>
+              </w:rPr>
+              <w:t>Умная энергия</w:t>
+            </w:r>
+          </w:p>
+        </w:tc>
+        <w:tc>
+          <w:tcPr>
+            <w:tcW w:type="dxa" w:w="4986"/>
+          </w:tcPr>
+          <w:p>
+            <w:r>
+              <w:rPr>
+                <w:rFonts w:ascii="Times New Roman" w:hAnsi="Times New Roman"/>
+                <w:sz w:val="20"/>
+              </w:rPr>
+              <w:t>Smart Grid, умные счетчики, самовосстановление сетей</w:t>
+            </w:r>
+          </w:p>
+        </w:tc>
+      </w:tr>
+      <w:tr>
+        <w:tc>
+          <w:tcPr>
+            <w:tcW w:type="dxa" w:w="4986"/>
+          </w:tcPr>
+          <w:p>
+            <w:r>
+              <w:rPr>
+                <w:rFonts w:ascii="Times New Roman" w:hAnsi="Times New Roman"/>
+                <w:sz w:val="20"/>
+              </w:rPr>
+              <w:t>Умный транспорт</w:t>
+            </w:r>
+          </w:p>
+        </w:tc>
+        <w:tc>
+          <w:tcPr>
+            <w:tcW w:type="dxa" w:w="4986"/>
+          </w:tcPr>
+          <w:p>
+            <w:r>
+              <w:rPr>
+                <w:rFonts w:ascii="Times New Roman" w:hAnsi="Times New Roman"/>
+                <w:sz w:val="20"/>
+              </w:rPr>
+              <w:t>Меньше пробок, безопаснее движение, контроль грузов</w:t>
+            </w:r>
+          </w:p>
+        </w:tc>
+      </w:tr>
+      <w:tr>
+        <w:tc>
+          <w:tcPr>
+            <w:tcW w:type="dxa" w:w="4986"/>
+          </w:tcPr>
+          <w:p>
+            <w:r>
+              <w:rPr>
+                <w:rFonts w:ascii="Times New Roman" w:hAnsi="Times New Roman"/>
+                <w:sz w:val="20"/>
+              </w:rPr>
+              <w:t>Умное производство</w:t>
+            </w:r>
+          </w:p>
+        </w:tc>
+        <w:tc>
+          <w:tcPr>
+            <w:tcW w:type="dxa" w:w="4986"/>
+          </w:tcPr>
+          <w:p>
+            <w:r>
+              <w:rPr>
+                <w:rFonts w:ascii="Times New Roman" w:hAnsi="Times New Roman"/>
+                <w:sz w:val="20"/>
+              </w:rPr>
+              <w:t>IIoT, предиктивное обслуживание, контроль качества</w:t>
+            </w:r>
+          </w:p>
+        </w:tc>
+      </w:tr>
+      <w:tr>
+        <w:tc>
+          <w:tcPr>
+            <w:tcW w:type="dxa" w:w="4986"/>
+          </w:tcPr>
+          <w:p>
+            <w:r>
+              <w:rPr>
+                <w:rFonts w:ascii="Times New Roman" w:hAnsi="Times New Roman"/>
+                <w:sz w:val="20"/>
+              </w:rPr>
+              <w:t>Умная медицина</w:t>
+            </w:r>
+          </w:p>
+        </w:tc>
+        <w:tc>
+          <w:tcPr>
+            <w:tcW w:type="dxa" w:w="4986"/>
+          </w:tcPr>
+          <w:p>
+            <w:r>
+              <w:rPr>
+                <w:rFonts w:ascii="Times New Roman" w:hAnsi="Times New Roman"/>
+                <w:sz w:val="20"/>
+              </w:rPr>
+              <w:t>Удаленный мониторинг, электронные данные, контроль лечения</w:t>
+            </w:r>
+          </w:p>
+        </w:tc>
+      </w:tr>
+    </w:tbl>
+    <w:p/>
+    <w:p>
+      <w:r>
+        <w:br w:type="page"/>
+      </w:r>
+    </w:p>
+    <w:p>
+      <w:pPr>
+        <w:pStyle w:val="Heading1"/>
+      </w:pPr>
+      <w:r>
+        <w:rPr>
+          <w:rFonts w:ascii="Times New Roman" w:hAnsi="Times New Roman"/>
+          <w:b/>
+          <w:sz w:val="28"/>
+        </w:rPr>
         <w:t>Использованные материалы</w:t>
       </w:r>
     </w:p>
@@ -3739,6 +6044,30 @@
           <w:sz w:val="24"/>
         </w:rPr>
         <w:t>source/Лекция №2.pptx</w:t>
+      </w:r>
+    </w:p>
+    <w:p>
+      <w:pPr>
+        <w:pStyle w:val="ListBullet"/>
+      </w:pPr>
+      <w:r>
+        <w:rPr>
+          <w:rFonts w:ascii="Times New Roman" w:hAnsi="Times New Roman"/>
+          <w:sz w:val="24"/>
+        </w:rPr>
+        <w:t>source/Лекция №3.pptx</w:t>
+      </w:r>
+    </w:p>
+    <w:p>
+      <w:pPr>
+        <w:pStyle w:val="ListBullet"/>
+      </w:pPr>
+      <w:r>
+        <w:rPr>
+          <w:rFonts w:ascii="Times New Roman" w:hAnsi="Times New Roman"/>
+          <w:sz w:val="24"/>
+        </w:rPr>
+        <w:t>source/Лекция №5.pptx</w:t>
       </w:r>
     </w:p>
     <w:p>

</xml_diff>

<commit_message>
Add remaining exam answers 78-80
</commit_message>
<xml_diff>
--- a/answers_first_20.docx
+++ b/answers_first_20.docx
@@ -8117,6 +8117,25 @@
     </w:tbl>
     <w:p/>
     <w:p>
+      <w:r>
+        <w:br w:type="page"/>
+      </w:r>
+    </w:p>
+    <w:p>
+      <w:pPr>
+        <w:jc w:val="center"/>
+      </w:pPr>
+      <w:r>
+        <w:rPr>
+          <w:rFonts w:ascii="Times New Roman" w:hAnsi="Times New Roman"/>
+          <w:b/>
+          <w:sz w:val="32"/>
+        </w:rPr>
+        <w:t>Дополнение: вопросы 78–80</w:t>
+      </w:r>
+    </w:p>
+    <w:p/>
+    <w:p>
       <w:pPr>
         <w:pStyle w:val="Heading1"/>
       </w:pPr>
@@ -8126,6 +8145,398 @@
           <w:b/>
           <w:sz w:val="28"/>
         </w:rPr>
+        <w:t>78. Создание channels в Modbus в OpenHAB</w:t>
+      </w:r>
+    </w:p>
+    <w:p>
+      <w:pPr>
+        <w:spacing w:after="120" w:line="276" w:lineRule="auto"/>
+        <w:ind w:firstLine="425"/>
+      </w:pPr>
+      <w:r>
+        <w:rPr>
+          <w:rFonts w:ascii="Times New Roman" w:hAnsi="Times New Roman"/>
+          <w:sz w:val="24"/>
+        </w:rPr>
+        <w:t>Channel в Modbus Binding связывает конкретное значение из Modbus-регистра с моделью OpenHAB. Если bridge задает общее соединение, а Modbus thing/poller описывает устройство и диапазон опроса, то channel отвечает за конкретную точку данных: температуру, состояние реле, счетчик энергии, команду включения, значение holding register и т.п.</w:t>
+      </w:r>
+    </w:p>
+    <w:p>
+      <w:pPr>
+        <w:spacing w:after="120" w:line="276" w:lineRule="auto"/>
+        <w:ind w:firstLine="425"/>
+      </w:pPr>
+      <w:r>
+        <w:rPr>
+          <w:rFonts w:ascii="Times New Roman" w:hAnsi="Times New Roman"/>
+          <w:sz w:val="24"/>
+        </w:rPr>
+        <w:t>В материалах процесс создания channels в Modbus описан через интерфейс OpenHAB: перейти в Settings, далее Things, открыть уже созданный Modbus Thing, перейти на вкладку Channels. Часто после создания Modbus things часть каналов уже присутствует по умолчанию. Пользователь выбирает нужный канал и создает или привязывает Item, чтобы значение стало доступно в интерфейсе, правилах и сценариях.</w:t>
+      </w:r>
+    </w:p>
+    <w:p>
+      <w:pPr>
+        <w:spacing w:after="120" w:line="276" w:lineRule="auto"/>
+        <w:ind w:firstLine="425"/>
+      </w:pPr>
+      <w:r>
+        <w:rPr>
+          <w:rFonts w:ascii="Times New Roman" w:hAnsi="Times New Roman"/>
+          <w:sz w:val="24"/>
+        </w:rPr>
+        <w:t>Если канал создается вручную, нужно понимать карту регистров устройства. Важные параметры: тип регистра (coil, discrete input, input register, holding register), адрес, тип данных, доступ на чтение/запись, масштабирование, порядок байтов/слов, единицы измерения и частота обновления. Ошибка в адресе или типе данных приведет к неверному значению или отсутствию связи.</w:t>
+      </w:r>
+    </w:p>
+    <w:p>
+      <w:pPr>
+        <w:spacing w:after="120" w:line="276" w:lineRule="auto"/>
+        <w:ind w:firstLine="425"/>
+      </w:pPr>
+      <w:r>
+        <w:rPr>
+          <w:rFonts w:ascii="Times New Roman" w:hAnsi="Times New Roman"/>
+          <w:sz w:val="24"/>
+        </w:rPr>
+        <w:t>После настройки channel его связывают с item подходящего типа: Switch для coil/дискретного управления, Number для числовых регистров, Contact для дискретных входов и т.д. Далее item можно использовать в правилах OpenHAB: например, включать вентиляцию при превышении температуры, отображать потребление энергии на панели или отправлять команду контроллеру.</w:t>
+      </w:r>
+    </w:p>
+    <w:p>
+      <w:pPr>
+        <w:spacing w:after="120" w:line="276" w:lineRule="auto"/>
+        <w:ind w:firstLine="425"/>
+      </w:pPr>
+      <w:r>
+        <w:rPr>
+          <w:rFonts w:ascii="Times New Roman" w:hAnsi="Times New Roman"/>
+          <w:sz w:val="24"/>
+        </w:rPr>
+        <w:t>Для экзамена важно запомнить иерархию Modbus в OpenHAB: bridge — соединение, poller/thing — устройство и область регистров, channel — конкретный регистр или значение, item — элемент модели OpenHAB для интерфейса и автоматизации.</w:t>
+      </w:r>
+    </w:p>
+    <w:p>
+      <w:r>
+        <w:br w:type="page"/>
+      </w:r>
+    </w:p>
+    <w:p>
+      <w:pPr>
+        <w:pStyle w:val="Heading1"/>
+      </w:pPr>
+      <w:r>
+        <w:rPr>
+          <w:rFonts w:ascii="Times New Roman" w:hAnsi="Times New Roman"/>
+          <w:b/>
+          <w:sz w:val="28"/>
+        </w:rPr>
+        <w:t>79. Автоматизация освещения с помощью OpenHAB</w:t>
+      </w:r>
+    </w:p>
+    <w:p>
+      <w:pPr>
+        <w:spacing w:after="120" w:line="276" w:lineRule="auto"/>
+        <w:ind w:firstLine="425"/>
+      </w:pPr>
+      <w:r>
+        <w:rPr>
+          <w:rFonts w:ascii="Times New Roman" w:hAnsi="Times New Roman"/>
+          <w:sz w:val="24"/>
+        </w:rPr>
+        <w:t>Автоматизация освещения в OpenHAB строится на связке датчиков, items, channels, правил и исполнительного устройства освещения. В материалах описан пример, где используется виртуальный проект, MQTT/каналы, датчик освещенности и правило, которое включает или выключает свет в зависимости от показаний.</w:t>
+      </w:r>
+    </w:p>
+    <w:p>
+      <w:pPr>
+        <w:spacing w:after="120" w:line="276" w:lineRule="auto"/>
+        <w:ind w:firstLine="425"/>
+      </w:pPr>
+      <w:r>
+        <w:rPr>
+          <w:rFonts w:ascii="Times New Roman" w:hAnsi="Times New Roman"/>
+          <w:sz w:val="24"/>
+        </w:rPr>
+        <w:t>Общая последовательность такая. Сначала создается проект или модель помещения и настраиваются источники данных: датчик освещенности, датчик движения, выключатель или виртуальное освещение. Затем через MQTT или другой binding создаются things и channels, а channels связываются с items. Например, один item хранит значение датчика света, другой item управляет лампой как Switch.</w:t>
+      </w:r>
+    </w:p>
+    <w:p>
+      <w:pPr>
+        <w:spacing w:after="120" w:line="276" w:lineRule="auto"/>
+        <w:ind w:firstLine="425"/>
+      </w:pPr>
+      <w:r>
+        <w:rPr>
+          <w:rFonts w:ascii="Times New Roman" w:hAnsi="Times New Roman"/>
+          <w:sz w:val="24"/>
+        </w:rPr>
+        <w:t>После этого создается правило в разделе Rules. В материалах для правила указаны параметры: Unique ID light_auto и Label «Автоматизация освещения». В блоке When добавляется триггер Item Event: правило запускается при изменении значения датчика света. В блоке Then добавляется действие Run Script, например через Blockly, где описывается логика: если показание датчика меньше порога, включить освещение; если больше порога — выключить.</w:t>
+      </w:r>
+    </w:p>
+    <w:p>
+      <w:pPr>
+        <w:spacing w:after="120" w:line="276" w:lineRule="auto"/>
+        <w:ind w:firstLine="425"/>
+      </w:pPr>
+      <w:r>
+        <w:rPr>
+          <w:rFonts w:ascii="Times New Roman" w:hAnsi="Times New Roman"/>
+          <w:sz w:val="24"/>
+        </w:rPr>
+        <w:t>В примере используется порог 10000: при значении освещенности меньше 10000 свет включается, при значении больше 10000 выключается. Это простая, но типовая схема автоматизации: событие → проверка условия → команда исполнительному устройству.</w:t>
+      </w:r>
+    </w:p>
+    <w:p>
+      <w:pPr>
+        <w:spacing w:after="120" w:line="276" w:lineRule="auto"/>
+        <w:ind w:firstLine="425"/>
+      </w:pPr>
+      <w:r>
+        <w:rPr>
+          <w:rFonts w:ascii="Times New Roman" w:hAnsi="Times New Roman"/>
+          <w:sz w:val="24"/>
+        </w:rPr>
+        <w:t>Для реальной системы можно усложнить логику: учитывать движение, время суток, ручной режим, задержку выключения, состояние двери, присутствие человека. Но базовый принцип OpenHAB остается тем же: датчик обновляет item, триггер запускает rule, script проверяет условие, команда отправляется item освещения, а binding передает ее физическому устройству.</w:t>
+      </w:r>
+    </w:p>
+    <w:p>
+      <w:r>
+        <w:br w:type="page"/>
+      </w:r>
+    </w:p>
+    <w:p>
+      <w:pPr>
+        <w:pStyle w:val="Heading1"/>
+      </w:pPr>
+      <w:r>
+        <w:rPr>
+          <w:rFonts w:ascii="Times New Roman" w:hAnsi="Times New Roman"/>
+          <w:b/>
+          <w:sz w:val="28"/>
+        </w:rPr>
+        <w:t>80. Автоматизация освещения с помощью Node-RED</w:t>
+      </w:r>
+    </w:p>
+    <w:p>
+      <w:pPr>
+        <w:spacing w:after="120" w:line="276" w:lineRule="auto"/>
+        <w:ind w:firstLine="425"/>
+      </w:pPr>
+      <w:r>
+        <w:rPr>
+          <w:rFonts w:ascii="Times New Roman" w:hAnsi="Times New Roman"/>
+          <w:sz w:val="24"/>
+        </w:rPr>
+        <w:t>Автоматизация освещения в Node-RED реализуется как поток из связанных узлов. В отличие от OpenHAB, где логика часто строится вокруг items и rules, Node-RED визуально показывает цепочку обработки данных: входной узел получает событие, промежуточные узлы проверяют условия и преобразуют сообщения, выходной узел отправляет команду устройству.</w:t>
+      </w:r>
+    </w:p>
+    <w:p>
+      <w:pPr>
+        <w:spacing w:after="120" w:line="276" w:lineRule="auto"/>
+        <w:ind w:firstLine="425"/>
+      </w:pPr>
+      <w:r>
+        <w:rPr>
+          <w:rFonts w:ascii="Times New Roman" w:hAnsi="Times New Roman"/>
+          <w:sz w:val="24"/>
+        </w:rPr>
+        <w:t>В материалах описан пример автоматизации освещения при помощи Node-RED. Сначала создается новый проект и размещается окружение моделируемого пространства. Затем в глобальных настройках задаются IP-адрес и порт MQTT-брокера. После этого в проект добавляется диффузный фотоэлектрический датчик, для него включается статус и прописываются MQTT-топики: топик показаний и топик триггера/входа.</w:t>
+      </w:r>
+    </w:p>
+    <w:p>
+      <w:pPr>
+        <w:spacing w:after="120" w:line="276" w:lineRule="auto"/>
+        <w:ind w:firstLine="425"/>
+      </w:pPr>
+      <w:r>
+        <w:rPr>
+          <w:rFonts w:ascii="Times New Roman" w:hAnsi="Times New Roman"/>
+          <w:sz w:val="24"/>
+        </w:rPr>
+        <w:t>Далее добавляется исполнительное устройство освещения и узлы обработки. Поток может быть устроен так: MQTT input получает показания датчика, function или switch проверяет значение освещенности, затем MQTT output публикует команду включения или выключения света. Если освещенность ниже заданного порога, формируется команда включить свет; если выше — выключить.</w:t>
+      </w:r>
+    </w:p>
+    <w:p>
+      <w:pPr>
+        <w:spacing w:after="120" w:line="276" w:lineRule="auto"/>
+        <w:ind w:firstLine="425"/>
+      </w:pPr>
+      <w:r>
+        <w:rPr>
+          <w:rFonts w:ascii="Times New Roman" w:hAnsi="Times New Roman"/>
+          <w:sz w:val="24"/>
+        </w:rPr>
+        <w:t>Node-RED удобен тем, что логику можно собрать перетаскиванием блоков: mqtt-in, json, switch, function, delay/timer, mqtt-out, debug, dashboard. Узел debug помогает смотреть входящие сообщения и быстро находить ошибки. Кнопка Deploy разворачивает поток и запускает его.</w:t>
+      </w:r>
+    </w:p>
+    <w:p>
+      <w:pPr>
+        <w:spacing w:after="120" w:line="276" w:lineRule="auto"/>
+        <w:ind w:firstLine="425"/>
+      </w:pPr>
+      <w:r>
+        <w:rPr>
+          <w:rFonts w:ascii="Times New Roman" w:hAnsi="Times New Roman"/>
+          <w:sz w:val="24"/>
+        </w:rPr>
+        <w:t>Более сложная автоматизация может учитывать датчик движения и состояние двери. Например, если дверь открыта и есть движение — включить свет на 2 минуты; если дверь закрыта и движение есть — на 15 минут; при новом движении таймер обновляется. Такая логика хорошо выражается в Node-RED через ветвления, таймеры и переменные контекста. Главная идея: Node-RED строит автоматизацию освещения как наглядный поток обработки событий IoT.</w:t>
+      </w:r>
+    </w:p>
+    <w:tbl>
+      <w:tblPr>
+        <w:tblStyle w:val="TableGrid"/>
+        <w:tblW w:type="auto" w:w="0"/>
+        <w:tblLook w:firstColumn="1" w:firstRow="1" w:lastColumn="0" w:lastRow="0" w:noHBand="0" w:noVBand="1" w:val="04A0"/>
+      </w:tblPr>
+      <w:tblGrid>
+        <w:gridCol w:w="3324"/>
+        <w:gridCol w:w="3324"/>
+        <w:gridCol w:w="3324"/>
+      </w:tblGrid>
+      <w:tr>
+        <w:tc>
+          <w:tcPr>
+            <w:tcW w:type="dxa" w:w="3324"/>
+          </w:tcPr>
+          <w:p>
+            <w:r>
+              <w:rPr>
+                <w:rFonts w:ascii="Times New Roman" w:hAnsi="Times New Roman"/>
+                <w:b/>
+                <w:sz w:val="20"/>
+              </w:rPr>
+              <w:t>Среда</w:t>
+            </w:r>
+          </w:p>
+        </w:tc>
+        <w:tc>
+          <w:tcPr>
+            <w:tcW w:type="dxa" w:w="3324"/>
+          </w:tcPr>
+          <w:p>
+            <w:r>
+              <w:rPr>
+                <w:rFonts w:ascii="Times New Roman" w:hAnsi="Times New Roman"/>
+                <w:b/>
+                <w:sz w:val="20"/>
+              </w:rPr>
+              <w:t>Основная модель автоматизации</w:t>
+            </w:r>
+          </w:p>
+        </w:tc>
+        <w:tc>
+          <w:tcPr>
+            <w:tcW w:type="dxa" w:w="3324"/>
+          </w:tcPr>
+          <w:p>
+            <w:r>
+              <w:rPr>
+                <w:rFonts w:ascii="Times New Roman" w:hAnsi="Times New Roman"/>
+                <w:b/>
+                <w:sz w:val="20"/>
+              </w:rPr>
+              <w:t>Пример для освещения</w:t>
+            </w:r>
+          </w:p>
+        </w:tc>
+      </w:tr>
+      <w:tr>
+        <w:tc>
+          <w:tcPr>
+            <w:tcW w:type="dxa" w:w="3324"/>
+          </w:tcPr>
+          <w:p>
+            <w:r>
+              <w:rPr>
+                <w:rFonts w:ascii="Times New Roman" w:hAnsi="Times New Roman"/>
+                <w:sz w:val="20"/>
+              </w:rPr>
+              <w:t>OpenHAB</w:t>
+            </w:r>
+          </w:p>
+        </w:tc>
+        <w:tc>
+          <w:tcPr>
+            <w:tcW w:type="dxa" w:w="3324"/>
+          </w:tcPr>
+          <w:p>
+            <w:r>
+              <w:rPr>
+                <w:rFonts w:ascii="Times New Roman" w:hAnsi="Times New Roman"/>
+                <w:sz w:val="20"/>
+              </w:rPr>
+              <w:t>Item → Trigger → Rule/Script → Command</w:t>
+            </w:r>
+          </w:p>
+        </w:tc>
+        <w:tc>
+          <w:tcPr>
+            <w:tcW w:type="dxa" w:w="3324"/>
+          </w:tcPr>
+          <w:p>
+            <w:r>
+              <w:rPr>
+                <w:rFonts w:ascii="Times New Roman" w:hAnsi="Times New Roman"/>
+                <w:sz w:val="20"/>
+              </w:rPr>
+              <w:t>Датчик освещенности changed, правило включает/выключает item лампы</w:t>
+            </w:r>
+          </w:p>
+        </w:tc>
+      </w:tr>
+      <w:tr>
+        <w:tc>
+          <w:tcPr>
+            <w:tcW w:type="dxa" w:w="3324"/>
+          </w:tcPr>
+          <w:p>
+            <w:r>
+              <w:rPr>
+                <w:rFonts w:ascii="Times New Roman" w:hAnsi="Times New Roman"/>
+                <w:sz w:val="20"/>
+              </w:rPr>
+              <w:t>Node-RED</w:t>
+            </w:r>
+          </w:p>
+        </w:tc>
+        <w:tc>
+          <w:tcPr>
+            <w:tcW w:type="dxa" w:w="3324"/>
+          </w:tcPr>
+          <w:p>
+            <w:r>
+              <w:rPr>
+                <w:rFonts w:ascii="Times New Roman" w:hAnsi="Times New Roman"/>
+                <w:sz w:val="20"/>
+              </w:rPr>
+              <w:t>Input node → обработка → Output node</w:t>
+            </w:r>
+          </w:p>
+        </w:tc>
+        <w:tc>
+          <w:tcPr>
+            <w:tcW w:type="dxa" w:w="3324"/>
+          </w:tcPr>
+          <w:p>
+            <w:r>
+              <w:rPr>
+                <w:rFonts w:ascii="Times New Roman" w:hAnsi="Times New Roman"/>
+                <w:sz w:val="20"/>
+              </w:rPr>
+              <w:t>MQTT-in получает значение, switch/function проверяет порог, MQTT-out отправляет команду</w:t>
+            </w:r>
+          </w:p>
+        </w:tc>
+      </w:tr>
+    </w:tbl>
+    <w:p/>
+    <w:p>
+      <w:pPr>
+        <w:pStyle w:val="Heading1"/>
+      </w:pPr>
+      <w:r>
+        <w:rPr>
+          <w:rFonts w:ascii="Times New Roman" w:hAnsi="Times New Roman"/>
+          <w:b/>
+          <w:sz w:val="28"/>
+        </w:rPr>
         <w:t>Использованные материалы</w:t>
       </w:r>
     </w:p>
@@ -8151,30 +8562,6 @@
           <w:sz w:val="24"/>
         </w:rPr>
         <w:t>source/Лекции по дисциплине ПУТС.pdf</w:t>
-      </w:r>
-    </w:p>
-    <w:p>
-      <w:pPr>
-        <w:pStyle w:val="ListBullet"/>
-      </w:pPr>
-      <w:r>
-        <w:rPr>
-          <w:rFonts w:ascii="Times New Roman" w:hAnsi="Times New Roman"/>
-          <w:sz w:val="24"/>
-        </w:rPr>
-        <w:t>source/Лекция №5.pptx</w:t>
-      </w:r>
-    </w:p>
-    <w:p>
-      <w:pPr>
-        <w:pStyle w:val="ListBullet"/>
-      </w:pPr>
-      <w:r>
-        <w:rPr>
-          <w:rFonts w:ascii="Times New Roman" w:hAnsi="Times New Roman"/>
-          <w:sz w:val="24"/>
-        </w:rPr>
-        <w:t>source/Лекция №8.pptx</w:t>
       </w:r>
     </w:p>
     <w:p>

</xml_diff>

<commit_message>
Verify and polish exam answers order
</commit_message>
<xml_diff>
--- a/answers_first_20.docx
+++ b/answers_first_20.docx
@@ -421,7 +421,7 @@
           <w:b/>
           <w:sz w:val="28"/>
         </w:rPr>
-        <w:t>6. Веб вещей WoT</w:t>
+        <w:t>6. Веб вещей WoТ</w:t>
       </w:r>
     </w:p>
     <w:p>
@@ -2470,6 +2470,32 @@
           <w:sz w:val="24"/>
         </w:rPr>
         <w:t>Типовая архитектура беспроводной сенсорной сети включает три основных типа узлов: координатор, маршрутизатор и оконечное устройство. Их роли различаются по сложности, энергопотреблению и функциям в сети.</w:t>
+      </w:r>
+    </w:p>
+    <w:p>
+      <w:pPr>
+        <w:spacing w:after="120" w:line="276" w:lineRule="auto"/>
+        <w:ind w:firstLine="425"/>
+      </w:pPr>
+      <w:r>
+        <w:rPr>
+          <w:rFonts w:ascii="Times New Roman" w:hAnsi="Times New Roman"/>
+          <w:sz w:val="24"/>
+        </w:rPr>
+        <w:t>Координатор является центральным организующим элементом: он формирует сеть, задает параметры, управляет присоединением устройств и часто выполняет роль шлюза во внешнюю сеть. Маршрутизаторы расширяют покрытие и пересылают пакеты между узлами, поддерживая многоскачковую передачу. Оконечные устройства обычно выполняют прикладную функцию: измеряют параметры среды или управляют исполнительным механизмом.</w:t>
+      </w:r>
+    </w:p>
+    <w:p>
+      <w:pPr>
+        <w:spacing w:after="120" w:line="276" w:lineRule="auto"/>
+        <w:ind w:firstLine="425"/>
+      </w:pPr>
+      <w:r>
+        <w:rPr>
+          <w:rFonts w:ascii="Times New Roman" w:hAnsi="Times New Roman"/>
+          <w:sz w:val="24"/>
+        </w:rPr>
+        <w:t>Такое разделение ролей важно для энергосбережения. Координатор и маршрутизаторы должны быть более производительными и чаще находиться в активном режиме, а оконечные устройства могут большую часть времени спать и просыпаться только для измерения или передачи события. Поэтому при проектировании БСС нужно правильно распределять роли узлов, иначе сеть будет быстро расходовать энергию или терять связность.</w:t>
       </w:r>
     </w:p>
     <w:tbl>

</xml_diff>